<commit_message>
Update Báo cáo, Xây dựng project FE
</commit_message>
<xml_diff>
--- a/Documents/Quản lý khách sạn(Phân tích).docx
+++ b/Documents/Quản lý khách sạn(Phân tích).docx
@@ -2841,7 +2841,6 @@
         <w:t xml:space="preserve"> </w:t>
       </w:r>
       <w:proofErr w:type="spellStart"/>
-      <w:proofErr w:type="gramStart"/>
       <w:r>
         <w:rPr>
           <w:rFonts w:ascii="Times New Roman" w:hAnsi="Times New Roman" w:cs="Times New Roman"/>
@@ -2859,7 +2858,6 @@
         <w:t>,Ql</w:t>
       </w:r>
       <w:proofErr w:type="spellEnd"/>
-      <w:proofErr w:type="gramEnd"/>
       <w:r>
         <w:rPr>
           <w:rFonts w:ascii="Times New Roman" w:hAnsi="Times New Roman" w:cs="Times New Roman"/>
@@ -3172,19 +3170,9 @@
           <w:sz w:val="26"/>
           <w:szCs w:val="26"/>
         </w:rPr>
-        <w:t xml:space="preserve">, Ql </w:t>
-      </w:r>
-      <w:proofErr w:type="gramStart"/>
-      <w:r>
-        <w:rPr>
-          <w:rFonts w:ascii="Times New Roman" w:hAnsi="Times New Roman" w:cs="Times New Roman"/>
-          <w:sz w:val="26"/>
-          <w:szCs w:val="26"/>
-        </w:rPr>
-        <w:t>minibar(</w:t>
-      </w:r>
-      <w:proofErr w:type="spellStart"/>
-      <w:proofErr w:type="gramEnd"/>
+        <w:t>, Ql minibar(</w:t>
+      </w:r>
+      <w:proofErr w:type="spellStart"/>
       <w:r>
         <w:rPr>
           <w:rFonts w:ascii="Times New Roman" w:hAnsi="Times New Roman" w:cs="Times New Roman"/>
@@ -6383,29 +6371,22 @@
           <w:sz w:val="26"/>
           <w:szCs w:val="26"/>
         </w:rPr>
-        <w:t xml:space="preserve"> </w:t>
-      </w:r>
-      <w:proofErr w:type="spellStart"/>
-      <w:r>
-        <w:rPr>
-          <w:rFonts w:ascii="Times New Roman" w:hAnsi="Times New Roman" w:cs="Times New Roman"/>
-          <w:sz w:val="26"/>
-          <w:szCs w:val="26"/>
-        </w:rPr>
-        <w:t>tân</w:t>
-      </w:r>
-      <w:proofErr w:type="spellEnd"/>
-    </w:p>
-    <w:p>
-      <w:pPr>
-        <w:spacing w:after="160" w:line="259" w:lineRule="auto"/>
-      </w:pPr>
-    </w:p>
-    <w:p>
-      <w:pPr>
-        <w:spacing w:after="160" w:line="259" w:lineRule="auto"/>
-      </w:pPr>
-      <w:r>
+        <w:t xml:space="preserve"> tân</w:t>
+      </w:r>
+    </w:p>
+    <w:p>
+      <w:pPr>
+        <w:spacing w:after="160" w:line="259" w:lineRule="auto"/>
+      </w:pPr>
+    </w:p>
+    <w:p>
+      <w:pPr>
+        <w:spacing w:after="160" w:line="259" w:lineRule="auto"/>
+      </w:pPr>
+      <w:r>
+        <w:rPr>
+          <w:noProof/>
+        </w:rPr>
         <w:drawing>
           <wp:inline distT="0" distB="0" distL="0" distR="0" wp14:anchorId="0162CA92" wp14:editId="4ADA32DE">
             <wp:extent cx="6151880" cy="4077335"/>
@@ -6424,7 +6405,7 @@
                     </pic:cNvPicPr>
                   </pic:nvPicPr>
                   <pic:blipFill>
-                    <a:blip r:embed="rId5">
+                    <a:blip r:embed="rId6">
                       <a:extLst>
                         <a:ext uri="{28A0092B-C50C-407E-A947-70E740481C1C}">
                           <a14:useLocalDpi xmlns:a14="http://schemas.microsoft.com/office/drawing/2010/main" val="0"/>
@@ -6559,17 +6540,12 @@
         <w:spacing w:after="160" w:line="259" w:lineRule="auto"/>
       </w:pPr>
       <w:proofErr w:type="spellStart"/>
-      <w:proofErr w:type="gramStart"/>
       <w:r>
         <w:t>unitPrice</w:t>
       </w:r>
       <w:proofErr w:type="spellEnd"/>
       <w:r>
-        <w:t xml:space="preserve">  =</w:t>
-      </w:r>
-      <w:proofErr w:type="gramEnd"/>
-      <w:r>
-        <w:t xml:space="preserve"> 30.000</w:t>
+        <w:t xml:space="preserve">  = 30.000</w:t>
       </w:r>
     </w:p>
     <w:p>
@@ -6855,17 +6831,12 @@
         <w:spacing w:after="160" w:line="259" w:lineRule="auto"/>
       </w:pPr>
       <w:proofErr w:type="spellStart"/>
-      <w:proofErr w:type="gramStart"/>
       <w:r>
         <w:t>unitPrice</w:t>
       </w:r>
       <w:proofErr w:type="spellEnd"/>
       <w:r>
-        <w:t xml:space="preserve">  =</w:t>
-      </w:r>
-      <w:proofErr w:type="gramEnd"/>
-      <w:r>
-        <w:t xml:space="preserve"> 200.000</w:t>
+        <w:t xml:space="preserve">  = 200.000</w:t>
       </w:r>
     </w:p>
     <w:p>
@@ -6886,6 +6857,9 @@
         <w:spacing w:after="160" w:line="259" w:lineRule="auto"/>
       </w:pPr>
       <w:r>
+        <w:rPr>
+          <w:noProof/>
+        </w:rPr>
         <w:lastRenderedPageBreak/>
         <w:drawing>
           <wp:inline distT="0" distB="0" distL="0" distR="0" wp14:anchorId="061CB61E" wp14:editId="4F864E08">
@@ -6905,7 +6879,7 @@
                     </pic:cNvPicPr>
                   </pic:nvPicPr>
                   <pic:blipFill>
-                    <a:blip r:embed="rId6">
+                    <a:blip r:embed="rId7">
                       <a:extLst>
                         <a:ext uri="{28A0092B-C50C-407E-A947-70E740481C1C}">
                           <a14:useLocalDpi xmlns:a14="http://schemas.microsoft.com/office/drawing/2010/main" val="0"/>
@@ -9201,12 +9175,10 @@
         <w:spacing w:after="160" w:line="259" w:lineRule="auto"/>
       </w:pPr>
       <w:proofErr w:type="spellStart"/>
-      <w:proofErr w:type="gramStart"/>
       <w:r>
         <w:t>invoice.calculateTotal</w:t>
       </w:r>
       <w:proofErr w:type="spellEnd"/>
-      <w:proofErr w:type="gramEnd"/>
       <w:r>
         <w:t>()</w:t>
       </w:r>
@@ -13515,15 +13487,15 @@
           <w:b/>
           <w:bCs/>
         </w:rPr>
-        <w:t>IV. S</w:t>
-      </w:r>
-      <w:proofErr w:type="spellStart"/>
-      <w:r>
-        <w:rPr>
-          <w:b/>
-          <w:bCs/>
-        </w:rPr>
-        <w:t>ơ</w:t>
+        <w:t xml:space="preserve">IV. </w:t>
+      </w:r>
+      <w:proofErr w:type="spellStart"/>
+      <w:r>
+        <w:rPr>
+          <w:b/>
+          <w:bCs/>
+        </w:rPr>
+        <w:t>Sơ</w:t>
       </w:r>
       <w:proofErr w:type="spellEnd"/>
       <w:r>
@@ -14159,12 +14131,10 @@
         <w:spacing w:after="160" w:line="259" w:lineRule="auto"/>
       </w:pPr>
       <w:proofErr w:type="spellStart"/>
-      <w:proofErr w:type="gramStart"/>
       <w:r>
         <w:t>invoice.calculateTotal</w:t>
       </w:r>
       <w:proofErr w:type="spellEnd"/>
-      <w:proofErr w:type="gramEnd"/>
       <w:r>
         <w:t>()</w:t>
       </w:r>
@@ -14468,7 +14438,6 @@
         <w:t xml:space="preserve">I. MỤC TIÊU CHỨC NĂNG </w:t>
       </w:r>
       <w:proofErr w:type="spellStart"/>
-      <w:proofErr w:type="gramStart"/>
       <w:r>
         <w:rPr>
           <w:b/>
@@ -14482,15 +14451,7 @@
           <w:b/>
           <w:bCs/>
         </w:rPr>
-        <w:t>(</w:t>
-      </w:r>
-      <w:proofErr w:type="gramEnd"/>
-      <w:r>
-        <w:rPr>
-          <w:b/>
-          <w:bCs/>
-        </w:rPr>
-        <w:t>)</w:t>
+        <w:t>()</w:t>
       </w:r>
     </w:p>
     <w:p>
@@ -16032,17 +15993,12 @@
         <w:spacing w:after="160" w:line="259" w:lineRule="auto"/>
       </w:pPr>
       <w:proofErr w:type="spellStart"/>
-      <w:proofErr w:type="gramStart"/>
       <w:r>
         <w:t>checkOut</w:t>
       </w:r>
       <w:proofErr w:type="spellEnd"/>
       <w:r>
-        <w:t>(</w:t>
-      </w:r>
-      <w:proofErr w:type="gramEnd"/>
-      <w:r>
-        <w:t>)</w:t>
+        <w:t>()</w:t>
       </w:r>
     </w:p>
     <w:p>
@@ -16061,7 +16017,6 @@
         <w:t xml:space="preserve">IV. XỬ LÝ BÊN TRONG </w:t>
       </w:r>
       <w:proofErr w:type="spellStart"/>
-      <w:proofErr w:type="gramStart"/>
       <w:r>
         <w:rPr>
           <w:b/>
@@ -16075,15 +16030,7 @@
           <w:b/>
           <w:bCs/>
         </w:rPr>
-        <w:t>(</w:t>
-      </w:r>
-      <w:proofErr w:type="gramEnd"/>
-      <w:r>
-        <w:rPr>
-          <w:b/>
-          <w:bCs/>
-        </w:rPr>
-        <w:t>)</w:t>
+        <w:t>()</w:t>
       </w:r>
     </w:p>
     <w:p>
@@ -16698,12 +16645,10 @@
         <w:spacing w:after="160" w:line="259" w:lineRule="auto"/>
       </w:pPr>
       <w:proofErr w:type="spellStart"/>
-      <w:proofErr w:type="gramStart"/>
       <w:r>
         <w:t>invoice.calculateTotal</w:t>
       </w:r>
       <w:proofErr w:type="spellEnd"/>
-      <w:proofErr w:type="gramEnd"/>
       <w:r>
         <w:t>()</w:t>
       </w:r>
@@ -16722,12 +16667,10 @@
         <w:br/>
       </w:r>
       <w:proofErr w:type="spellStart"/>
-      <w:proofErr w:type="gramStart"/>
       <w:r>
         <w:t>invoice.totalAmount</w:t>
       </w:r>
       <w:proofErr w:type="spellEnd"/>
-      <w:proofErr w:type="gramEnd"/>
       <w:r>
         <w:t xml:space="preserve"> = total + vat</w:t>
       </w:r>
@@ -17669,17 +17612,12 @@
         <w:br/>
       </w:r>
       <w:proofErr w:type="spellStart"/>
-      <w:proofErr w:type="gramStart"/>
       <w:r>
         <w:t>checkOut</w:t>
       </w:r>
       <w:proofErr w:type="spellEnd"/>
       <w:r>
-        <w:t>(</w:t>
-      </w:r>
-      <w:proofErr w:type="gramEnd"/>
-      <w:r>
-        <w:t>)</w:t>
+        <w:t>()</w:t>
       </w:r>
       <w:r>
         <w:br/>
@@ -18138,17 +18076,12 @@
         <w:t xml:space="preserve"> </w:t>
       </w:r>
       <w:proofErr w:type="spellStart"/>
-      <w:proofErr w:type="gramStart"/>
       <w:r>
         <w:t>checkOut</w:t>
       </w:r>
       <w:proofErr w:type="spellEnd"/>
       <w:r>
-        <w:t>(</w:t>
-      </w:r>
-      <w:proofErr w:type="gramEnd"/>
-      <w:r>
-        <w:t xml:space="preserve">) </w:t>
+        <w:t xml:space="preserve">() </w:t>
       </w:r>
       <w:proofErr w:type="spellStart"/>
       <w:r>
@@ -18926,13 +18859,8 @@
         <w:spacing w:after="160" w:line="259" w:lineRule="auto"/>
       </w:pPr>
       <w:proofErr w:type="spellStart"/>
-      <w:proofErr w:type="gramStart"/>
-      <w:r>
-        <w:t>stay.reservation</w:t>
-      </w:r>
-      <w:proofErr w:type="gramEnd"/>
-      <w:r>
-        <w:t>_id</w:t>
+      <w:r>
+        <w:t>stay.reservation_id</w:t>
       </w:r>
       <w:proofErr w:type="spellEnd"/>
       <w:r>
@@ -19558,6 +19486,2439 @@
       <w:pPr>
         <w:spacing w:after="160" w:line="259" w:lineRule="auto"/>
       </w:pPr>
+    </w:p>
+    <w:p>
+      <w:pPr>
+        <w:spacing w:after="160" w:line="259" w:lineRule="auto"/>
+      </w:pPr>
+    </w:p>
+    <w:p>
+      <w:pPr>
+        <w:spacing w:after="160" w:line="259" w:lineRule="auto"/>
+      </w:pPr>
+    </w:p>
+    <w:p>
+      <w:pPr>
+        <w:spacing w:after="160" w:line="259" w:lineRule="auto"/>
+      </w:pPr>
+    </w:p>
+    <w:p>
+      <w:pPr>
+        <w:spacing w:after="160" w:line="259" w:lineRule="auto"/>
+      </w:pPr>
+    </w:p>
+    <w:p>
+      <w:pPr>
+        <w:spacing w:after="160" w:line="259" w:lineRule="auto"/>
+      </w:pPr>
+    </w:p>
+    <w:p>
+      <w:pPr>
+        <w:spacing w:after="160" w:line="259" w:lineRule="auto"/>
+      </w:pPr>
+      <w:r>
+        <w:lastRenderedPageBreak/>
+        <w:t>Script CSDL(SQL Server)</w:t>
+      </w:r>
+    </w:p>
+    <w:p>
+      <w:pPr>
+        <w:spacing w:after="160" w:line="259" w:lineRule="auto"/>
+      </w:pPr>
+      <w:r>
+        <w:t>CREATE DATABASE DOAN3_QLKHACHSAN</w:t>
+      </w:r>
+    </w:p>
+    <w:p>
+      <w:pPr>
+        <w:spacing w:after="160" w:line="259" w:lineRule="auto"/>
+      </w:pPr>
+      <w:r>
+        <w:t xml:space="preserve">GO </w:t>
+      </w:r>
+    </w:p>
+    <w:p>
+      <w:pPr>
+        <w:spacing w:after="160" w:line="259" w:lineRule="auto"/>
+      </w:pPr>
+      <w:r>
+        <w:t>USE DOAN3_QLKHACHSAN</w:t>
+      </w:r>
+    </w:p>
+    <w:p>
+      <w:pPr>
+        <w:spacing w:after="160" w:line="259" w:lineRule="auto"/>
+      </w:pPr>
+      <w:r>
+        <w:t>GO</w:t>
+      </w:r>
+    </w:p>
+    <w:p>
+      <w:pPr>
+        <w:spacing w:after="160" w:line="259" w:lineRule="auto"/>
+      </w:pPr>
+    </w:p>
+    <w:p>
+      <w:pPr>
+        <w:spacing w:after="160" w:line="259" w:lineRule="auto"/>
+      </w:pPr>
+      <w:r>
+        <w:t>CREATE TABLE Users (</w:t>
+      </w:r>
+    </w:p>
+    <w:p>
+      <w:pPr>
+        <w:spacing w:after="160" w:line="259" w:lineRule="auto"/>
+      </w:pPr>
+      <w:r>
+        <w:t xml:space="preserve">    </w:t>
+      </w:r>
+      <w:proofErr w:type="spellStart"/>
+      <w:r>
+        <w:t>UserID</w:t>
+      </w:r>
+      <w:proofErr w:type="spellEnd"/>
+      <w:r>
+        <w:t xml:space="preserve"> INT IDENTITY(1,1) PRIMARY KEY,</w:t>
+      </w:r>
+    </w:p>
+    <w:p>
+      <w:pPr>
+        <w:spacing w:after="160" w:line="259" w:lineRule="auto"/>
+      </w:pPr>
+      <w:r>
+        <w:t xml:space="preserve">    Email NVARCHAR(150) NOT NULL UNIQUE,</w:t>
+      </w:r>
+    </w:p>
+    <w:p>
+      <w:pPr>
+        <w:spacing w:after="160" w:line="259" w:lineRule="auto"/>
+      </w:pPr>
+      <w:r>
+        <w:t xml:space="preserve">    </w:t>
+      </w:r>
+      <w:proofErr w:type="spellStart"/>
+      <w:r>
+        <w:t>PasswordHash</w:t>
+      </w:r>
+      <w:proofErr w:type="spellEnd"/>
+      <w:r>
+        <w:t xml:space="preserve"> NVARCHAR(255) NOT NULL,</w:t>
+      </w:r>
+    </w:p>
+    <w:p>
+      <w:pPr>
+        <w:spacing w:after="160" w:line="259" w:lineRule="auto"/>
+      </w:pPr>
+      <w:r>
+        <w:t xml:space="preserve">    Role NVARCHAR(20) NOT NULL CHECK (Role IN ('ADMIN','RECEPTIONIST','CUSTOMER')),</w:t>
+      </w:r>
+    </w:p>
+    <w:p>
+      <w:pPr>
+        <w:spacing w:after="160" w:line="259" w:lineRule="auto"/>
+      </w:pPr>
+      <w:r>
+        <w:t xml:space="preserve">    </w:t>
+      </w:r>
+      <w:proofErr w:type="spellStart"/>
+      <w:r>
+        <w:t>CreatedAt</w:t>
+      </w:r>
+      <w:proofErr w:type="spellEnd"/>
+      <w:r>
+        <w:t xml:space="preserve"> DATETIME DEFAULT GETDATE()</w:t>
+      </w:r>
+    </w:p>
+    <w:p>
+      <w:pPr>
+        <w:spacing w:after="160" w:line="259" w:lineRule="auto"/>
+      </w:pPr>
+      <w:r>
+        <w:t>)</w:t>
+      </w:r>
+    </w:p>
+    <w:p>
+      <w:pPr>
+        <w:spacing w:after="160" w:line="259" w:lineRule="auto"/>
+      </w:pPr>
+    </w:p>
+    <w:p>
+      <w:pPr>
+        <w:spacing w:after="160" w:line="259" w:lineRule="auto"/>
+      </w:pPr>
+      <w:r>
+        <w:t>CREATE TABLE Receptionists (</w:t>
+      </w:r>
+    </w:p>
+    <w:p>
+      <w:pPr>
+        <w:spacing w:after="160" w:line="259" w:lineRule="auto"/>
+      </w:pPr>
+      <w:r>
+        <w:t xml:space="preserve">    </w:t>
+      </w:r>
+      <w:proofErr w:type="spellStart"/>
+      <w:r>
+        <w:t>ReceptionistID</w:t>
+      </w:r>
+      <w:proofErr w:type="spellEnd"/>
+      <w:r>
+        <w:t xml:space="preserve"> INT IDENTITY(1,1) PRIMARY KEY,</w:t>
+      </w:r>
+    </w:p>
+    <w:p>
+      <w:pPr>
+        <w:spacing w:after="160" w:line="259" w:lineRule="auto"/>
+      </w:pPr>
+      <w:r>
+        <w:t xml:space="preserve">    </w:t>
+      </w:r>
+      <w:proofErr w:type="spellStart"/>
+      <w:r>
+        <w:t>FullName</w:t>
+      </w:r>
+      <w:proofErr w:type="spellEnd"/>
+      <w:r>
+        <w:t xml:space="preserve"> NVARCHAR(150) NOT NULL,</w:t>
+      </w:r>
+    </w:p>
+    <w:p>
+      <w:pPr>
+        <w:spacing w:after="160" w:line="259" w:lineRule="auto"/>
+      </w:pPr>
+      <w:r>
+        <w:t xml:space="preserve">    Phone NVARCHAR(20),</w:t>
+      </w:r>
+    </w:p>
+    <w:p>
+      <w:pPr>
+        <w:spacing w:after="160" w:line="259" w:lineRule="auto"/>
+      </w:pPr>
+      <w:r>
+        <w:t xml:space="preserve">    </w:t>
+      </w:r>
+      <w:proofErr w:type="spellStart"/>
+      <w:r>
+        <w:t>UserID</w:t>
+      </w:r>
+      <w:proofErr w:type="spellEnd"/>
+      <w:r>
+        <w:t xml:space="preserve"> INT UNIQUE,</w:t>
+      </w:r>
+    </w:p>
+    <w:p>
+      <w:pPr>
+        <w:spacing w:after="160" w:line="259" w:lineRule="auto"/>
+      </w:pPr>
+      <w:r>
+        <w:t xml:space="preserve">    FOREIGN KEY (</w:t>
+      </w:r>
+      <w:proofErr w:type="spellStart"/>
+      <w:r>
+        <w:t>UserID</w:t>
+      </w:r>
+      <w:proofErr w:type="spellEnd"/>
+      <w:r>
+        <w:t>) REFERENCES Users(</w:t>
+      </w:r>
+      <w:proofErr w:type="spellStart"/>
+      <w:r>
+        <w:t>UserID</w:t>
+      </w:r>
+      <w:proofErr w:type="spellEnd"/>
+      <w:r>
+        <w:t>)</w:t>
+      </w:r>
+    </w:p>
+    <w:p>
+      <w:pPr>
+        <w:spacing w:after="160" w:line="259" w:lineRule="auto"/>
+      </w:pPr>
+      <w:r>
+        <w:t>)</w:t>
+      </w:r>
+    </w:p>
+    <w:p>
+      <w:pPr>
+        <w:spacing w:after="160" w:line="259" w:lineRule="auto"/>
+      </w:pPr>
+    </w:p>
+    <w:p>
+      <w:pPr>
+        <w:spacing w:after="160" w:line="259" w:lineRule="auto"/>
+      </w:pPr>
+      <w:r>
+        <w:t>CREATE TABLE Customers (</w:t>
+      </w:r>
+    </w:p>
+    <w:p>
+      <w:pPr>
+        <w:spacing w:after="160" w:line="259" w:lineRule="auto"/>
+      </w:pPr>
+      <w:r>
+        <w:t xml:space="preserve">    </w:t>
+      </w:r>
+      <w:proofErr w:type="spellStart"/>
+      <w:r>
+        <w:t>CustomerID</w:t>
+      </w:r>
+      <w:proofErr w:type="spellEnd"/>
+      <w:r>
+        <w:t xml:space="preserve"> INT IDENTITY(1,1) PRIMARY KEY,</w:t>
+      </w:r>
+    </w:p>
+    <w:p>
+      <w:pPr>
+        <w:spacing w:after="160" w:line="259" w:lineRule="auto"/>
+      </w:pPr>
+      <w:r>
+        <w:t xml:space="preserve">    </w:t>
+      </w:r>
+      <w:proofErr w:type="spellStart"/>
+      <w:r>
+        <w:t>FullName</w:t>
+      </w:r>
+      <w:proofErr w:type="spellEnd"/>
+      <w:r>
+        <w:t xml:space="preserve"> NVARCHAR(150) NOT NULL,</w:t>
+      </w:r>
+    </w:p>
+    <w:p>
+      <w:pPr>
+        <w:spacing w:after="160" w:line="259" w:lineRule="auto"/>
+      </w:pPr>
+      <w:r>
+        <w:t xml:space="preserve">    Phone NVARCHAR(20),</w:t>
+      </w:r>
+    </w:p>
+    <w:p>
+      <w:pPr>
+        <w:spacing w:after="160" w:line="259" w:lineRule="auto"/>
+      </w:pPr>
+      <w:r>
+        <w:t xml:space="preserve">    </w:t>
+      </w:r>
+      <w:proofErr w:type="spellStart"/>
+      <w:r>
+        <w:t>UserID</w:t>
+      </w:r>
+      <w:proofErr w:type="spellEnd"/>
+      <w:r>
+        <w:t xml:space="preserve"> INT UNIQUE,</w:t>
+      </w:r>
+    </w:p>
+    <w:p>
+      <w:pPr>
+        <w:spacing w:after="160" w:line="259" w:lineRule="auto"/>
+      </w:pPr>
+      <w:r>
+        <w:t xml:space="preserve">    FOREIGN KEY (</w:t>
+      </w:r>
+      <w:proofErr w:type="spellStart"/>
+      <w:r>
+        <w:t>UserID</w:t>
+      </w:r>
+      <w:proofErr w:type="spellEnd"/>
+      <w:r>
+        <w:t>) REFERENCES Users(</w:t>
+      </w:r>
+      <w:proofErr w:type="spellStart"/>
+      <w:r>
+        <w:t>UserID</w:t>
+      </w:r>
+      <w:proofErr w:type="spellEnd"/>
+      <w:r>
+        <w:t>)</w:t>
+      </w:r>
+    </w:p>
+    <w:p>
+      <w:pPr>
+        <w:spacing w:after="160" w:line="259" w:lineRule="auto"/>
+      </w:pPr>
+      <w:r>
+        <w:t>)</w:t>
+      </w:r>
+    </w:p>
+    <w:p>
+      <w:pPr>
+        <w:spacing w:after="160" w:line="259" w:lineRule="auto"/>
+      </w:pPr>
+    </w:p>
+    <w:p>
+      <w:pPr>
+        <w:spacing w:after="160" w:line="259" w:lineRule="auto"/>
+      </w:pPr>
+      <w:r>
+        <w:lastRenderedPageBreak/>
+        <w:t xml:space="preserve">CREATE TABLE </w:t>
+      </w:r>
+      <w:proofErr w:type="spellStart"/>
+      <w:r>
+        <w:t>RoomTypes</w:t>
+      </w:r>
+      <w:proofErr w:type="spellEnd"/>
+      <w:r>
+        <w:t xml:space="preserve"> (</w:t>
+      </w:r>
+    </w:p>
+    <w:p>
+      <w:pPr>
+        <w:spacing w:after="160" w:line="259" w:lineRule="auto"/>
+      </w:pPr>
+      <w:r>
+        <w:t xml:space="preserve">    </w:t>
+      </w:r>
+      <w:proofErr w:type="spellStart"/>
+      <w:r>
+        <w:t>RoomTypeID</w:t>
+      </w:r>
+      <w:proofErr w:type="spellEnd"/>
+      <w:r>
+        <w:t xml:space="preserve"> INT IDENTITY(1,1) PRIMARY KEY,</w:t>
+      </w:r>
+    </w:p>
+    <w:p>
+      <w:pPr>
+        <w:spacing w:after="160" w:line="259" w:lineRule="auto"/>
+      </w:pPr>
+      <w:r>
+        <w:t xml:space="preserve">    Name NVARCHAR(100) NOT NULL,</w:t>
+      </w:r>
+    </w:p>
+    <w:p>
+      <w:pPr>
+        <w:spacing w:after="160" w:line="259" w:lineRule="auto"/>
+      </w:pPr>
+      <w:r>
+        <w:t xml:space="preserve">    Description NVARCHAR(MAX),</w:t>
+      </w:r>
+    </w:p>
+    <w:p>
+      <w:pPr>
+        <w:spacing w:after="160" w:line="259" w:lineRule="auto"/>
+      </w:pPr>
+      <w:r>
+        <w:t xml:space="preserve">    Capacity INT,</w:t>
+      </w:r>
+    </w:p>
+    <w:p>
+      <w:pPr>
+        <w:spacing w:after="160" w:line="259" w:lineRule="auto"/>
+      </w:pPr>
+      <w:r>
+        <w:t xml:space="preserve">    </w:t>
+      </w:r>
+      <w:proofErr w:type="spellStart"/>
+      <w:r>
+        <w:t>DefaultPrice</w:t>
+      </w:r>
+      <w:proofErr w:type="spellEnd"/>
+      <w:r>
+        <w:t xml:space="preserve"> DECIMAL(12,2)</w:t>
+      </w:r>
+    </w:p>
+    <w:p>
+      <w:pPr>
+        <w:spacing w:after="160" w:line="259" w:lineRule="auto"/>
+      </w:pPr>
+      <w:r>
+        <w:t>)</w:t>
+      </w:r>
+    </w:p>
+    <w:p>
+      <w:pPr>
+        <w:spacing w:after="160" w:line="259" w:lineRule="auto"/>
+      </w:pPr>
+    </w:p>
+    <w:p>
+      <w:pPr>
+        <w:spacing w:after="160" w:line="259" w:lineRule="auto"/>
+      </w:pPr>
+      <w:r>
+        <w:t>CREATE TABLE Rooms (</w:t>
+      </w:r>
+    </w:p>
+    <w:p>
+      <w:pPr>
+        <w:spacing w:after="160" w:line="259" w:lineRule="auto"/>
+      </w:pPr>
+      <w:r>
+        <w:t xml:space="preserve">    </w:t>
+      </w:r>
+      <w:proofErr w:type="spellStart"/>
+      <w:r>
+        <w:t>RoomID</w:t>
+      </w:r>
+      <w:proofErr w:type="spellEnd"/>
+      <w:r>
+        <w:t xml:space="preserve"> INT IDENTITY(1,1) PRIMARY KEY,</w:t>
+      </w:r>
+    </w:p>
+    <w:p>
+      <w:pPr>
+        <w:spacing w:after="160" w:line="259" w:lineRule="auto"/>
+      </w:pPr>
+      <w:r>
+        <w:t xml:space="preserve">    </w:t>
+      </w:r>
+      <w:proofErr w:type="spellStart"/>
+      <w:r>
+        <w:t>RoomNumber</w:t>
+      </w:r>
+      <w:proofErr w:type="spellEnd"/>
+      <w:r>
+        <w:t xml:space="preserve"> NVARCHAR(20) UNIQUE NOT NULL,</w:t>
+      </w:r>
+    </w:p>
+    <w:p>
+      <w:pPr>
+        <w:spacing w:after="160" w:line="259" w:lineRule="auto"/>
+      </w:pPr>
+      <w:r>
+        <w:t xml:space="preserve">    Status NVARCHAR(20) DEFAULT 'AVAILABLE'</w:t>
+      </w:r>
+    </w:p>
+    <w:p>
+      <w:pPr>
+        <w:spacing w:after="160" w:line="259" w:lineRule="auto"/>
+      </w:pPr>
+      <w:r>
+        <w:t xml:space="preserve">        CHECK (Status IN ('AVAILABLE','OCCUPIED','MAINTENANCE')),</w:t>
+      </w:r>
+    </w:p>
+    <w:p>
+      <w:pPr>
+        <w:spacing w:after="160" w:line="259" w:lineRule="auto"/>
+      </w:pPr>
+      <w:r>
+        <w:t xml:space="preserve">    </w:t>
+      </w:r>
+      <w:proofErr w:type="spellStart"/>
+      <w:r>
+        <w:t>RoomTypeID</w:t>
+      </w:r>
+      <w:proofErr w:type="spellEnd"/>
+      <w:r>
+        <w:t xml:space="preserve"> INT NOT NULL,</w:t>
+      </w:r>
+    </w:p>
+    <w:p>
+      <w:pPr>
+        <w:spacing w:after="160" w:line="259" w:lineRule="auto"/>
+      </w:pPr>
+      <w:r>
+        <w:t xml:space="preserve">    FOREIGN KEY (</w:t>
+      </w:r>
+      <w:proofErr w:type="spellStart"/>
+      <w:r>
+        <w:t>RoomTypeID</w:t>
+      </w:r>
+      <w:proofErr w:type="spellEnd"/>
+      <w:r>
+        <w:t xml:space="preserve">) REFERENCES </w:t>
+      </w:r>
+      <w:proofErr w:type="spellStart"/>
+      <w:r>
+        <w:t>RoomTypes</w:t>
+      </w:r>
+      <w:proofErr w:type="spellEnd"/>
+      <w:r>
+        <w:t>(</w:t>
+      </w:r>
+      <w:proofErr w:type="spellStart"/>
+      <w:r>
+        <w:t>RoomTypeID</w:t>
+      </w:r>
+      <w:proofErr w:type="spellEnd"/>
+      <w:r>
+        <w:t>)</w:t>
+      </w:r>
+    </w:p>
+    <w:p>
+      <w:pPr>
+        <w:spacing w:after="160" w:line="259" w:lineRule="auto"/>
+      </w:pPr>
+      <w:r>
+        <w:t>)</w:t>
+      </w:r>
+    </w:p>
+    <w:p>
+      <w:pPr>
+        <w:spacing w:after="160" w:line="259" w:lineRule="auto"/>
+      </w:pPr>
+    </w:p>
+    <w:p>
+      <w:pPr>
+        <w:spacing w:after="160" w:line="259" w:lineRule="auto"/>
+      </w:pPr>
+      <w:r>
+        <w:t>CREATE TABLE Rates (</w:t>
+      </w:r>
+    </w:p>
+    <w:p>
+      <w:pPr>
+        <w:spacing w:after="160" w:line="259" w:lineRule="auto"/>
+      </w:pPr>
+      <w:r>
+        <w:t xml:space="preserve">    </w:t>
+      </w:r>
+      <w:proofErr w:type="spellStart"/>
+      <w:r>
+        <w:t>RateID</w:t>
+      </w:r>
+      <w:proofErr w:type="spellEnd"/>
+      <w:r>
+        <w:t xml:space="preserve"> INT IDENTITY(1,1) PRIMARY KEY,</w:t>
+      </w:r>
+    </w:p>
+    <w:p>
+      <w:pPr>
+        <w:spacing w:after="160" w:line="259" w:lineRule="auto"/>
+      </w:pPr>
+      <w:r>
+        <w:t xml:space="preserve">    </w:t>
+      </w:r>
+      <w:proofErr w:type="spellStart"/>
+      <w:r>
+        <w:t>RoomTypeID</w:t>
+      </w:r>
+      <w:proofErr w:type="spellEnd"/>
+      <w:r>
+        <w:t xml:space="preserve"> INT NOT NULL,</w:t>
+      </w:r>
+    </w:p>
+    <w:p>
+      <w:pPr>
+        <w:spacing w:after="160" w:line="259" w:lineRule="auto"/>
+      </w:pPr>
+      <w:r>
+        <w:t xml:space="preserve">    Price DECIMAL(12,2),</w:t>
+      </w:r>
+    </w:p>
+    <w:p>
+      <w:pPr>
+        <w:spacing w:after="160" w:line="259" w:lineRule="auto"/>
+      </w:pPr>
+      <w:r>
+        <w:t xml:space="preserve">    StartDate DATE,</w:t>
+      </w:r>
+    </w:p>
+    <w:p>
+      <w:pPr>
+        <w:spacing w:after="160" w:line="259" w:lineRule="auto"/>
+      </w:pPr>
+      <w:r>
+        <w:t xml:space="preserve">    </w:t>
+      </w:r>
+      <w:proofErr w:type="spellStart"/>
+      <w:r>
+        <w:t>EndDate</w:t>
+      </w:r>
+      <w:proofErr w:type="spellEnd"/>
+      <w:r>
+        <w:t xml:space="preserve"> DATE,</w:t>
+      </w:r>
+    </w:p>
+    <w:p>
+      <w:pPr>
+        <w:spacing w:after="160" w:line="259" w:lineRule="auto"/>
+      </w:pPr>
+      <w:r>
+        <w:t xml:space="preserve">    Season NVARCHAR(100),</w:t>
+      </w:r>
+    </w:p>
+    <w:p>
+      <w:pPr>
+        <w:spacing w:after="160" w:line="259" w:lineRule="auto"/>
+      </w:pPr>
+      <w:r>
+        <w:t xml:space="preserve">    FOREIGN KEY (</w:t>
+      </w:r>
+      <w:proofErr w:type="spellStart"/>
+      <w:r>
+        <w:t>RoomTypeID</w:t>
+      </w:r>
+      <w:proofErr w:type="spellEnd"/>
+      <w:r>
+        <w:t xml:space="preserve">) REFERENCES </w:t>
+      </w:r>
+      <w:proofErr w:type="spellStart"/>
+      <w:r>
+        <w:t>RoomTypes</w:t>
+      </w:r>
+      <w:proofErr w:type="spellEnd"/>
+      <w:r>
+        <w:t>(</w:t>
+      </w:r>
+      <w:proofErr w:type="spellStart"/>
+      <w:r>
+        <w:t>RoomTypeID</w:t>
+      </w:r>
+      <w:proofErr w:type="spellEnd"/>
+      <w:r>
+        <w:t>)</w:t>
+      </w:r>
+    </w:p>
+    <w:p>
+      <w:pPr>
+        <w:spacing w:after="160" w:line="259" w:lineRule="auto"/>
+      </w:pPr>
+      <w:r>
+        <w:t>)</w:t>
+      </w:r>
+    </w:p>
+    <w:p>
+      <w:pPr>
+        <w:spacing w:after="160" w:line="259" w:lineRule="auto"/>
+      </w:pPr>
+    </w:p>
+    <w:p>
+      <w:pPr>
+        <w:spacing w:after="160" w:line="259" w:lineRule="auto"/>
+      </w:pPr>
+      <w:r>
+        <w:t>CREATE TABLE Reservations (</w:t>
+      </w:r>
+    </w:p>
+    <w:p>
+      <w:pPr>
+        <w:spacing w:after="160" w:line="259" w:lineRule="auto"/>
+      </w:pPr>
+      <w:r>
+        <w:t xml:space="preserve">    </w:t>
+      </w:r>
+      <w:proofErr w:type="spellStart"/>
+      <w:r>
+        <w:t>ReservationID</w:t>
+      </w:r>
+      <w:proofErr w:type="spellEnd"/>
+      <w:r>
+        <w:t xml:space="preserve"> INT IDENTITY(1,1) PRIMARY KEY,</w:t>
+      </w:r>
+    </w:p>
+    <w:p>
+      <w:pPr>
+        <w:spacing w:after="160" w:line="259" w:lineRule="auto"/>
+      </w:pPr>
+      <w:r>
+        <w:t xml:space="preserve">    </w:t>
+      </w:r>
+      <w:proofErr w:type="spellStart"/>
+      <w:r>
+        <w:t>CustomerID</w:t>
+      </w:r>
+      <w:proofErr w:type="spellEnd"/>
+      <w:r>
+        <w:t xml:space="preserve"> INT NOT NULL,</w:t>
+      </w:r>
+    </w:p>
+    <w:p>
+      <w:pPr>
+        <w:spacing w:after="160" w:line="259" w:lineRule="auto"/>
+      </w:pPr>
+      <w:r>
+        <w:lastRenderedPageBreak/>
+        <w:t xml:space="preserve">    </w:t>
+      </w:r>
+      <w:proofErr w:type="spellStart"/>
+      <w:r>
+        <w:t>CheckInDate</w:t>
+      </w:r>
+      <w:proofErr w:type="spellEnd"/>
+      <w:r>
+        <w:t xml:space="preserve"> DATE,</w:t>
+      </w:r>
+    </w:p>
+    <w:p>
+      <w:pPr>
+        <w:spacing w:after="160" w:line="259" w:lineRule="auto"/>
+      </w:pPr>
+      <w:r>
+        <w:t xml:space="preserve">    </w:t>
+      </w:r>
+      <w:proofErr w:type="spellStart"/>
+      <w:r>
+        <w:t>CheckOutDate</w:t>
+      </w:r>
+      <w:proofErr w:type="spellEnd"/>
+      <w:r>
+        <w:t xml:space="preserve"> DATE,</w:t>
+      </w:r>
+    </w:p>
+    <w:p>
+      <w:pPr>
+        <w:spacing w:after="160" w:line="259" w:lineRule="auto"/>
+      </w:pPr>
+      <w:r>
+        <w:t xml:space="preserve">    Status NVARCHAR(20)</w:t>
+      </w:r>
+    </w:p>
+    <w:p>
+      <w:pPr>
+        <w:spacing w:after="160" w:line="259" w:lineRule="auto"/>
+      </w:pPr>
+      <w:r>
+        <w:t xml:space="preserve">        CHECK (Status IN ('BOOKED','CANCELLED','CHECKED_IN','COMPLETED')),</w:t>
+      </w:r>
+    </w:p>
+    <w:p>
+      <w:pPr>
+        <w:spacing w:after="160" w:line="259" w:lineRule="auto"/>
+      </w:pPr>
+      <w:r>
+        <w:t xml:space="preserve">    </w:t>
+      </w:r>
+      <w:proofErr w:type="spellStart"/>
+      <w:r>
+        <w:t>CreatedAt</w:t>
+      </w:r>
+      <w:proofErr w:type="spellEnd"/>
+      <w:r>
+        <w:t xml:space="preserve"> DATETIME DEFAULT GETDATE(),</w:t>
+      </w:r>
+    </w:p>
+    <w:p>
+      <w:pPr>
+        <w:spacing w:after="160" w:line="259" w:lineRule="auto"/>
+      </w:pPr>
+      <w:r>
+        <w:t xml:space="preserve">    FOREIGN KEY (</w:t>
+      </w:r>
+      <w:proofErr w:type="spellStart"/>
+      <w:r>
+        <w:t>CustomerID</w:t>
+      </w:r>
+      <w:proofErr w:type="spellEnd"/>
+      <w:r>
+        <w:t>) REFERENCES Customers(</w:t>
+      </w:r>
+      <w:proofErr w:type="spellStart"/>
+      <w:r>
+        <w:t>CustomerID</w:t>
+      </w:r>
+      <w:proofErr w:type="spellEnd"/>
+      <w:r>
+        <w:t>)</w:t>
+      </w:r>
+    </w:p>
+    <w:p>
+      <w:pPr>
+        <w:spacing w:after="160" w:line="259" w:lineRule="auto"/>
+      </w:pPr>
+      <w:r>
+        <w:t>)</w:t>
+      </w:r>
+    </w:p>
+    <w:p>
+      <w:pPr>
+        <w:spacing w:after="160" w:line="259" w:lineRule="auto"/>
+      </w:pPr>
+    </w:p>
+    <w:p>
+      <w:pPr>
+        <w:spacing w:after="160" w:line="259" w:lineRule="auto"/>
+      </w:pPr>
+      <w:r>
+        <w:t xml:space="preserve">CREATE TABLE </w:t>
+      </w:r>
+      <w:proofErr w:type="spellStart"/>
+      <w:r>
+        <w:t>ReservationRooms</w:t>
+      </w:r>
+      <w:proofErr w:type="spellEnd"/>
+      <w:r>
+        <w:t xml:space="preserve"> (</w:t>
+      </w:r>
+    </w:p>
+    <w:p>
+      <w:pPr>
+        <w:spacing w:after="160" w:line="259" w:lineRule="auto"/>
+      </w:pPr>
+      <w:r>
+        <w:t xml:space="preserve">    ID INT IDENTITY(1,1) PRIMARY KEY,</w:t>
+      </w:r>
+    </w:p>
+    <w:p>
+      <w:pPr>
+        <w:spacing w:after="160" w:line="259" w:lineRule="auto"/>
+      </w:pPr>
+      <w:r>
+        <w:t xml:space="preserve">    </w:t>
+      </w:r>
+      <w:proofErr w:type="spellStart"/>
+      <w:r>
+        <w:t>ReservationID</w:t>
+      </w:r>
+      <w:proofErr w:type="spellEnd"/>
+      <w:r>
+        <w:t xml:space="preserve"> INT NOT NULL,</w:t>
+      </w:r>
+    </w:p>
+    <w:p>
+      <w:pPr>
+        <w:spacing w:after="160" w:line="259" w:lineRule="auto"/>
+      </w:pPr>
+      <w:r>
+        <w:t xml:space="preserve">    </w:t>
+      </w:r>
+      <w:proofErr w:type="spellStart"/>
+      <w:r>
+        <w:t>RoomTypeID</w:t>
+      </w:r>
+      <w:proofErr w:type="spellEnd"/>
+      <w:r>
+        <w:t xml:space="preserve"> INT NOT NULL,</w:t>
+      </w:r>
+    </w:p>
+    <w:p>
+      <w:pPr>
+        <w:spacing w:after="160" w:line="259" w:lineRule="auto"/>
+      </w:pPr>
+      <w:r>
+        <w:t xml:space="preserve">    Quantity INT NOT NULL,</w:t>
+      </w:r>
+    </w:p>
+    <w:p>
+      <w:pPr>
+        <w:spacing w:after="160" w:line="259" w:lineRule="auto"/>
+      </w:pPr>
+      <w:r>
+        <w:t xml:space="preserve">    </w:t>
+      </w:r>
+      <w:proofErr w:type="spellStart"/>
+      <w:r>
+        <w:t>PriceAtBooking</w:t>
+      </w:r>
+      <w:proofErr w:type="spellEnd"/>
+      <w:r>
+        <w:t xml:space="preserve"> DECIMAL(12,2),</w:t>
+      </w:r>
+    </w:p>
+    <w:p>
+      <w:pPr>
+        <w:spacing w:after="160" w:line="259" w:lineRule="auto"/>
+      </w:pPr>
+      <w:r>
+        <w:t xml:space="preserve">    FOREIGN KEY (</w:t>
+      </w:r>
+      <w:proofErr w:type="spellStart"/>
+      <w:r>
+        <w:t>ReservationID</w:t>
+      </w:r>
+      <w:proofErr w:type="spellEnd"/>
+      <w:r>
+        <w:t>) REFERENCES Reservations(</w:t>
+      </w:r>
+      <w:proofErr w:type="spellStart"/>
+      <w:r>
+        <w:t>ReservationID</w:t>
+      </w:r>
+      <w:proofErr w:type="spellEnd"/>
+      <w:r>
+        <w:t>),</w:t>
+      </w:r>
+    </w:p>
+    <w:p>
+      <w:pPr>
+        <w:spacing w:after="160" w:line="259" w:lineRule="auto"/>
+      </w:pPr>
+      <w:r>
+        <w:t xml:space="preserve">    FOREIGN KEY (</w:t>
+      </w:r>
+      <w:proofErr w:type="spellStart"/>
+      <w:r>
+        <w:t>RoomTypeID</w:t>
+      </w:r>
+      <w:proofErr w:type="spellEnd"/>
+      <w:r>
+        <w:t xml:space="preserve">) REFERENCES </w:t>
+      </w:r>
+      <w:proofErr w:type="spellStart"/>
+      <w:r>
+        <w:t>RoomTypes</w:t>
+      </w:r>
+      <w:proofErr w:type="spellEnd"/>
+      <w:r>
+        <w:t>(</w:t>
+      </w:r>
+      <w:proofErr w:type="spellStart"/>
+      <w:r>
+        <w:t>RoomTypeID</w:t>
+      </w:r>
+      <w:proofErr w:type="spellEnd"/>
+      <w:r>
+        <w:t>)</w:t>
+      </w:r>
+    </w:p>
+    <w:p>
+      <w:pPr>
+        <w:spacing w:after="160" w:line="259" w:lineRule="auto"/>
+      </w:pPr>
+      <w:r>
+        <w:t>)</w:t>
+      </w:r>
+    </w:p>
+    <w:p>
+      <w:pPr>
+        <w:spacing w:after="160" w:line="259" w:lineRule="auto"/>
+      </w:pPr>
+    </w:p>
+    <w:p>
+      <w:pPr>
+        <w:spacing w:after="160" w:line="259" w:lineRule="auto"/>
+      </w:pPr>
+      <w:r>
+        <w:t>CREATE TABLE Guests (</w:t>
+      </w:r>
+    </w:p>
+    <w:p>
+      <w:pPr>
+        <w:spacing w:after="160" w:line="259" w:lineRule="auto"/>
+      </w:pPr>
+      <w:r>
+        <w:t xml:space="preserve">    </w:t>
+      </w:r>
+      <w:proofErr w:type="spellStart"/>
+      <w:r>
+        <w:t>GuestID</w:t>
+      </w:r>
+      <w:proofErr w:type="spellEnd"/>
+      <w:r>
+        <w:t xml:space="preserve"> INT IDENTITY(1,1) PRIMARY KEY,</w:t>
+      </w:r>
+    </w:p>
+    <w:p>
+      <w:pPr>
+        <w:spacing w:after="160" w:line="259" w:lineRule="auto"/>
+      </w:pPr>
+      <w:r>
+        <w:t xml:space="preserve">    </w:t>
+      </w:r>
+      <w:proofErr w:type="spellStart"/>
+      <w:r>
+        <w:t>FullName</w:t>
+      </w:r>
+      <w:proofErr w:type="spellEnd"/>
+      <w:r>
+        <w:t xml:space="preserve"> NVARCHAR(150),</w:t>
+      </w:r>
+    </w:p>
+    <w:p>
+      <w:pPr>
+        <w:spacing w:after="160" w:line="259" w:lineRule="auto"/>
+      </w:pPr>
+      <w:r>
+        <w:t xml:space="preserve">    </w:t>
+      </w:r>
+      <w:proofErr w:type="spellStart"/>
+      <w:r>
+        <w:t>IdentityType</w:t>
+      </w:r>
+      <w:proofErr w:type="spellEnd"/>
+      <w:r>
+        <w:t xml:space="preserve"> NVARCHAR(50),</w:t>
+      </w:r>
+    </w:p>
+    <w:p>
+      <w:pPr>
+        <w:spacing w:after="160" w:line="259" w:lineRule="auto"/>
+      </w:pPr>
+      <w:r>
+        <w:t xml:space="preserve">    </w:t>
+      </w:r>
+      <w:proofErr w:type="spellStart"/>
+      <w:r>
+        <w:t>IdentityNumber</w:t>
+      </w:r>
+      <w:proofErr w:type="spellEnd"/>
+      <w:r>
+        <w:t xml:space="preserve"> NVARCHAR(100)</w:t>
+      </w:r>
+    </w:p>
+    <w:p>
+      <w:pPr>
+        <w:spacing w:after="160" w:line="259" w:lineRule="auto"/>
+      </w:pPr>
+      <w:r>
+        <w:t>)</w:t>
+      </w:r>
+    </w:p>
+    <w:p>
+      <w:pPr>
+        <w:spacing w:after="160" w:line="259" w:lineRule="auto"/>
+      </w:pPr>
+    </w:p>
+    <w:p>
+      <w:pPr>
+        <w:spacing w:after="160" w:line="259" w:lineRule="auto"/>
+      </w:pPr>
+      <w:r>
+        <w:t>CREATE TABLE Stays (</w:t>
+      </w:r>
+    </w:p>
+    <w:p>
+      <w:pPr>
+        <w:spacing w:after="160" w:line="259" w:lineRule="auto"/>
+      </w:pPr>
+      <w:r>
+        <w:t xml:space="preserve">    </w:t>
+      </w:r>
+      <w:proofErr w:type="spellStart"/>
+      <w:r>
+        <w:t>StayID</w:t>
+      </w:r>
+      <w:proofErr w:type="spellEnd"/>
+      <w:r>
+        <w:t xml:space="preserve"> INT IDENTITY(1,1) PRIMARY KEY,</w:t>
+      </w:r>
+    </w:p>
+    <w:p>
+      <w:pPr>
+        <w:spacing w:after="160" w:line="259" w:lineRule="auto"/>
+      </w:pPr>
+      <w:r>
+        <w:t xml:space="preserve">    </w:t>
+      </w:r>
+      <w:proofErr w:type="spellStart"/>
+      <w:r>
+        <w:t>ReservationID</w:t>
+      </w:r>
+      <w:proofErr w:type="spellEnd"/>
+      <w:r>
+        <w:t xml:space="preserve"> INT NULL,</w:t>
+      </w:r>
+    </w:p>
+    <w:p>
+      <w:pPr>
+        <w:spacing w:after="160" w:line="259" w:lineRule="auto"/>
+      </w:pPr>
+      <w:r>
+        <w:t xml:space="preserve">    </w:t>
+      </w:r>
+      <w:proofErr w:type="spellStart"/>
+      <w:r>
+        <w:t>GuestID</w:t>
+      </w:r>
+      <w:proofErr w:type="spellEnd"/>
+      <w:r>
+        <w:t xml:space="preserve"> INT NOT NULL,</w:t>
+      </w:r>
+    </w:p>
+    <w:p>
+      <w:pPr>
+        <w:spacing w:after="160" w:line="259" w:lineRule="auto"/>
+      </w:pPr>
+      <w:r>
+        <w:t xml:space="preserve">    </w:t>
+      </w:r>
+      <w:proofErr w:type="spellStart"/>
+      <w:r>
+        <w:t>ActualCheckIn</w:t>
+      </w:r>
+      <w:proofErr w:type="spellEnd"/>
+      <w:r>
+        <w:t xml:space="preserve"> DATETIME,</w:t>
+      </w:r>
+    </w:p>
+    <w:p>
+      <w:pPr>
+        <w:spacing w:after="160" w:line="259" w:lineRule="auto"/>
+      </w:pPr>
+      <w:r>
+        <w:lastRenderedPageBreak/>
+        <w:t xml:space="preserve">    </w:t>
+      </w:r>
+      <w:proofErr w:type="spellStart"/>
+      <w:r>
+        <w:t>ActualCheckOut</w:t>
+      </w:r>
+      <w:proofErr w:type="spellEnd"/>
+      <w:r>
+        <w:t xml:space="preserve"> DATETIME,</w:t>
+      </w:r>
+    </w:p>
+    <w:p>
+      <w:pPr>
+        <w:spacing w:after="160" w:line="259" w:lineRule="auto"/>
+      </w:pPr>
+      <w:r>
+        <w:t xml:space="preserve">    Status NVARCHAR(20)</w:t>
+      </w:r>
+    </w:p>
+    <w:p>
+      <w:pPr>
+        <w:spacing w:after="160" w:line="259" w:lineRule="auto"/>
+      </w:pPr>
+      <w:r>
+        <w:t xml:space="preserve">        CHECK (Status IN ('CHECKED_IN','COMPLETED')),</w:t>
+      </w:r>
+    </w:p>
+    <w:p>
+      <w:pPr>
+        <w:spacing w:after="160" w:line="259" w:lineRule="auto"/>
+      </w:pPr>
+      <w:r>
+        <w:t xml:space="preserve">    FOREIGN KEY (</w:t>
+      </w:r>
+      <w:proofErr w:type="spellStart"/>
+      <w:r>
+        <w:t>ReservationID</w:t>
+      </w:r>
+      <w:proofErr w:type="spellEnd"/>
+      <w:r>
+        <w:t>) REFERENCES Reservations(</w:t>
+      </w:r>
+      <w:proofErr w:type="spellStart"/>
+      <w:r>
+        <w:t>ReservationID</w:t>
+      </w:r>
+      <w:proofErr w:type="spellEnd"/>
+      <w:r>
+        <w:t>),</w:t>
+      </w:r>
+    </w:p>
+    <w:p>
+      <w:pPr>
+        <w:spacing w:after="160" w:line="259" w:lineRule="auto"/>
+      </w:pPr>
+      <w:r>
+        <w:t xml:space="preserve">    FOREIGN KEY (</w:t>
+      </w:r>
+      <w:proofErr w:type="spellStart"/>
+      <w:r>
+        <w:t>GuestID</w:t>
+      </w:r>
+      <w:proofErr w:type="spellEnd"/>
+      <w:r>
+        <w:t>) REFERENCES Guests(</w:t>
+      </w:r>
+      <w:proofErr w:type="spellStart"/>
+      <w:r>
+        <w:t>GuestID</w:t>
+      </w:r>
+      <w:proofErr w:type="spellEnd"/>
+      <w:r>
+        <w:t>)</w:t>
+      </w:r>
+    </w:p>
+    <w:p>
+      <w:pPr>
+        <w:spacing w:after="160" w:line="259" w:lineRule="auto"/>
+      </w:pPr>
+      <w:r>
+        <w:t>)</w:t>
+      </w:r>
+    </w:p>
+    <w:p>
+      <w:pPr>
+        <w:spacing w:after="160" w:line="259" w:lineRule="auto"/>
+      </w:pPr>
+    </w:p>
+    <w:p>
+      <w:pPr>
+        <w:spacing w:after="160" w:line="259" w:lineRule="auto"/>
+      </w:pPr>
+      <w:r>
+        <w:t xml:space="preserve">CREATE TABLE </w:t>
+      </w:r>
+      <w:proofErr w:type="spellStart"/>
+      <w:r>
+        <w:t>RoomStayHistory</w:t>
+      </w:r>
+      <w:proofErr w:type="spellEnd"/>
+      <w:r>
+        <w:t xml:space="preserve"> (</w:t>
+      </w:r>
+    </w:p>
+    <w:p>
+      <w:pPr>
+        <w:spacing w:after="160" w:line="259" w:lineRule="auto"/>
+      </w:pPr>
+      <w:r>
+        <w:t xml:space="preserve">    ID INT IDENTITY(1,1) PRIMARY KEY,</w:t>
+      </w:r>
+    </w:p>
+    <w:p>
+      <w:pPr>
+        <w:spacing w:after="160" w:line="259" w:lineRule="auto"/>
+      </w:pPr>
+      <w:r>
+        <w:t xml:space="preserve">    </w:t>
+      </w:r>
+      <w:proofErr w:type="spellStart"/>
+      <w:r>
+        <w:t>StayID</w:t>
+      </w:r>
+      <w:proofErr w:type="spellEnd"/>
+      <w:r>
+        <w:t xml:space="preserve"> INT NOT NULL,</w:t>
+      </w:r>
+    </w:p>
+    <w:p>
+      <w:pPr>
+        <w:spacing w:after="160" w:line="259" w:lineRule="auto"/>
+      </w:pPr>
+      <w:r>
+        <w:t xml:space="preserve">    </w:t>
+      </w:r>
+      <w:proofErr w:type="spellStart"/>
+      <w:r>
+        <w:t>RoomID</w:t>
+      </w:r>
+      <w:proofErr w:type="spellEnd"/>
+      <w:r>
+        <w:t xml:space="preserve"> INT NOT NULL,</w:t>
+      </w:r>
+    </w:p>
+    <w:p>
+      <w:pPr>
+        <w:spacing w:after="160" w:line="259" w:lineRule="auto"/>
+      </w:pPr>
+      <w:r>
+        <w:t xml:space="preserve">    </w:t>
+      </w:r>
+      <w:proofErr w:type="spellStart"/>
+      <w:r>
+        <w:t>CheckInTime</w:t>
+      </w:r>
+      <w:proofErr w:type="spellEnd"/>
+      <w:r>
+        <w:t xml:space="preserve"> DATETIME,</w:t>
+      </w:r>
+    </w:p>
+    <w:p>
+      <w:pPr>
+        <w:spacing w:after="160" w:line="259" w:lineRule="auto"/>
+      </w:pPr>
+      <w:r>
+        <w:t xml:space="preserve">    </w:t>
+      </w:r>
+      <w:proofErr w:type="spellStart"/>
+      <w:r>
+        <w:t>CheckOutTime</w:t>
+      </w:r>
+      <w:proofErr w:type="spellEnd"/>
+      <w:r>
+        <w:t xml:space="preserve"> DATETIME,</w:t>
+      </w:r>
+    </w:p>
+    <w:p>
+      <w:pPr>
+        <w:spacing w:after="160" w:line="259" w:lineRule="auto"/>
+      </w:pPr>
+      <w:r>
+        <w:t xml:space="preserve">    </w:t>
+      </w:r>
+      <w:proofErr w:type="spellStart"/>
+      <w:r>
+        <w:t>RateAtThatTime</w:t>
+      </w:r>
+      <w:proofErr w:type="spellEnd"/>
+      <w:r>
+        <w:t xml:space="preserve"> DECIMAL(12,2),</w:t>
+      </w:r>
+    </w:p>
+    <w:p>
+      <w:pPr>
+        <w:spacing w:after="160" w:line="259" w:lineRule="auto"/>
+      </w:pPr>
+      <w:r>
+        <w:t xml:space="preserve">    FOREIGN KEY (</w:t>
+      </w:r>
+      <w:proofErr w:type="spellStart"/>
+      <w:r>
+        <w:t>StayID</w:t>
+      </w:r>
+      <w:proofErr w:type="spellEnd"/>
+      <w:r>
+        <w:t>) REFERENCES Stays(</w:t>
+      </w:r>
+      <w:proofErr w:type="spellStart"/>
+      <w:r>
+        <w:t>StayID</w:t>
+      </w:r>
+      <w:proofErr w:type="spellEnd"/>
+      <w:r>
+        <w:t>),</w:t>
+      </w:r>
+    </w:p>
+    <w:p>
+      <w:pPr>
+        <w:spacing w:after="160" w:line="259" w:lineRule="auto"/>
+      </w:pPr>
+      <w:r>
+        <w:t xml:space="preserve">    FOREIGN KEY (</w:t>
+      </w:r>
+      <w:proofErr w:type="spellStart"/>
+      <w:r>
+        <w:t>RoomID</w:t>
+      </w:r>
+      <w:proofErr w:type="spellEnd"/>
+      <w:r>
+        <w:t>) REFERENCES Rooms(</w:t>
+      </w:r>
+      <w:proofErr w:type="spellStart"/>
+      <w:r>
+        <w:t>RoomID</w:t>
+      </w:r>
+      <w:proofErr w:type="spellEnd"/>
+      <w:r>
+        <w:t>)</w:t>
+      </w:r>
+    </w:p>
+    <w:p>
+      <w:pPr>
+        <w:spacing w:after="160" w:line="259" w:lineRule="auto"/>
+      </w:pPr>
+      <w:r>
+        <w:t>)</w:t>
+      </w:r>
+    </w:p>
+    <w:p>
+      <w:pPr>
+        <w:spacing w:after="160" w:line="259" w:lineRule="auto"/>
+      </w:pPr>
+    </w:p>
+    <w:p>
+      <w:pPr>
+        <w:spacing w:after="160" w:line="259" w:lineRule="auto"/>
+      </w:pPr>
+      <w:r>
+        <w:t>CREATE TABLE Services (</w:t>
+      </w:r>
+    </w:p>
+    <w:p>
+      <w:pPr>
+        <w:spacing w:after="160" w:line="259" w:lineRule="auto"/>
+      </w:pPr>
+      <w:r>
+        <w:t xml:space="preserve">    </w:t>
+      </w:r>
+      <w:proofErr w:type="spellStart"/>
+      <w:r>
+        <w:t>ServiceID</w:t>
+      </w:r>
+      <w:proofErr w:type="spellEnd"/>
+      <w:r>
+        <w:t xml:space="preserve"> INT IDENTITY(1,1) PRIMARY KEY,</w:t>
+      </w:r>
+    </w:p>
+    <w:p>
+      <w:pPr>
+        <w:spacing w:after="160" w:line="259" w:lineRule="auto"/>
+      </w:pPr>
+      <w:r>
+        <w:t xml:space="preserve">    </w:t>
+      </w:r>
+      <w:proofErr w:type="spellStart"/>
+      <w:r>
+        <w:t>ServiceName</w:t>
+      </w:r>
+      <w:proofErr w:type="spellEnd"/>
+      <w:r>
+        <w:t xml:space="preserve"> NVARCHAR(150),</w:t>
+      </w:r>
+    </w:p>
+    <w:p>
+      <w:pPr>
+        <w:spacing w:after="160" w:line="259" w:lineRule="auto"/>
+      </w:pPr>
+      <w:r>
+        <w:t xml:space="preserve">    Price DECIMAL(12,2)</w:t>
+      </w:r>
+    </w:p>
+    <w:p>
+      <w:pPr>
+        <w:spacing w:after="160" w:line="259" w:lineRule="auto"/>
+      </w:pPr>
+      <w:r>
+        <w:t>)</w:t>
+      </w:r>
+    </w:p>
+    <w:p>
+      <w:pPr>
+        <w:spacing w:after="160" w:line="259" w:lineRule="auto"/>
+      </w:pPr>
+    </w:p>
+    <w:p>
+      <w:pPr>
+        <w:spacing w:after="160" w:line="259" w:lineRule="auto"/>
+      </w:pPr>
+      <w:r>
+        <w:t xml:space="preserve">CREATE TABLE </w:t>
+      </w:r>
+      <w:proofErr w:type="spellStart"/>
+      <w:r>
+        <w:t>ServiceUsages</w:t>
+      </w:r>
+      <w:proofErr w:type="spellEnd"/>
+      <w:r>
+        <w:t xml:space="preserve"> (</w:t>
+      </w:r>
+    </w:p>
+    <w:p>
+      <w:pPr>
+        <w:spacing w:after="160" w:line="259" w:lineRule="auto"/>
+      </w:pPr>
+      <w:r>
+        <w:t xml:space="preserve">    </w:t>
+      </w:r>
+      <w:proofErr w:type="spellStart"/>
+      <w:r>
+        <w:t>UsageID</w:t>
+      </w:r>
+      <w:proofErr w:type="spellEnd"/>
+      <w:r>
+        <w:t xml:space="preserve"> INT IDENTITY(1,1) PRIMARY KEY,</w:t>
+      </w:r>
+    </w:p>
+    <w:p>
+      <w:pPr>
+        <w:spacing w:after="160" w:line="259" w:lineRule="auto"/>
+      </w:pPr>
+      <w:r>
+        <w:t xml:space="preserve">    </w:t>
+      </w:r>
+      <w:proofErr w:type="spellStart"/>
+      <w:r>
+        <w:t>StayID</w:t>
+      </w:r>
+      <w:proofErr w:type="spellEnd"/>
+      <w:r>
+        <w:t xml:space="preserve"> INT NOT NULL,</w:t>
+      </w:r>
+    </w:p>
+    <w:p>
+      <w:pPr>
+        <w:spacing w:after="160" w:line="259" w:lineRule="auto"/>
+      </w:pPr>
+      <w:r>
+        <w:t xml:space="preserve">    </w:t>
+      </w:r>
+      <w:proofErr w:type="spellStart"/>
+      <w:r>
+        <w:t>ServiceID</w:t>
+      </w:r>
+      <w:proofErr w:type="spellEnd"/>
+      <w:r>
+        <w:t xml:space="preserve"> INT NOT NULL,</w:t>
+      </w:r>
+    </w:p>
+    <w:p>
+      <w:pPr>
+        <w:spacing w:after="160" w:line="259" w:lineRule="auto"/>
+      </w:pPr>
+      <w:r>
+        <w:t xml:space="preserve">    Quantity INT,</w:t>
+      </w:r>
+    </w:p>
+    <w:p>
+      <w:pPr>
+        <w:spacing w:after="160" w:line="259" w:lineRule="auto"/>
+      </w:pPr>
+      <w:r>
+        <w:t xml:space="preserve">    </w:t>
+      </w:r>
+      <w:proofErr w:type="spellStart"/>
+      <w:r>
+        <w:t>UsedDate</w:t>
+      </w:r>
+      <w:proofErr w:type="spellEnd"/>
+      <w:r>
+        <w:t xml:space="preserve"> DATETIME DEFAULT GETDATE(),</w:t>
+      </w:r>
+    </w:p>
+    <w:p>
+      <w:pPr>
+        <w:spacing w:after="160" w:line="259" w:lineRule="auto"/>
+      </w:pPr>
+      <w:r>
+        <w:lastRenderedPageBreak/>
+        <w:t xml:space="preserve">    FOREIGN KEY (</w:t>
+      </w:r>
+      <w:proofErr w:type="spellStart"/>
+      <w:r>
+        <w:t>StayID</w:t>
+      </w:r>
+      <w:proofErr w:type="spellEnd"/>
+      <w:r>
+        <w:t>) REFERENCES Stays(</w:t>
+      </w:r>
+      <w:proofErr w:type="spellStart"/>
+      <w:r>
+        <w:t>StayID</w:t>
+      </w:r>
+      <w:proofErr w:type="spellEnd"/>
+      <w:r>
+        <w:t>),</w:t>
+      </w:r>
+    </w:p>
+    <w:p>
+      <w:pPr>
+        <w:spacing w:after="160" w:line="259" w:lineRule="auto"/>
+      </w:pPr>
+      <w:r>
+        <w:t xml:space="preserve">    FOREIGN KEY (</w:t>
+      </w:r>
+      <w:proofErr w:type="spellStart"/>
+      <w:r>
+        <w:t>ServiceID</w:t>
+      </w:r>
+      <w:proofErr w:type="spellEnd"/>
+      <w:r>
+        <w:t>) REFERENCES Services(</w:t>
+      </w:r>
+      <w:proofErr w:type="spellStart"/>
+      <w:r>
+        <w:t>ServiceID</w:t>
+      </w:r>
+      <w:proofErr w:type="spellEnd"/>
+      <w:r>
+        <w:t>)</w:t>
+      </w:r>
+    </w:p>
+    <w:p>
+      <w:pPr>
+        <w:spacing w:after="160" w:line="259" w:lineRule="auto"/>
+      </w:pPr>
+      <w:r>
+        <w:t>)</w:t>
+      </w:r>
+    </w:p>
+    <w:p>
+      <w:pPr>
+        <w:spacing w:after="160" w:line="259" w:lineRule="auto"/>
+      </w:pPr>
+    </w:p>
+    <w:p>
+      <w:pPr>
+        <w:spacing w:after="160" w:line="259" w:lineRule="auto"/>
+      </w:pPr>
+      <w:r>
+        <w:t xml:space="preserve">CREATE TABLE </w:t>
+      </w:r>
+      <w:proofErr w:type="spellStart"/>
+      <w:r>
+        <w:t>MinibarItems</w:t>
+      </w:r>
+      <w:proofErr w:type="spellEnd"/>
+      <w:r>
+        <w:t xml:space="preserve"> (</w:t>
+      </w:r>
+    </w:p>
+    <w:p>
+      <w:pPr>
+        <w:spacing w:after="160" w:line="259" w:lineRule="auto"/>
+      </w:pPr>
+      <w:r>
+        <w:t xml:space="preserve">    </w:t>
+      </w:r>
+      <w:proofErr w:type="spellStart"/>
+      <w:r>
+        <w:t>MinibarID</w:t>
+      </w:r>
+      <w:proofErr w:type="spellEnd"/>
+      <w:r>
+        <w:t xml:space="preserve"> INT IDENTITY(1,1) PRIMARY KEY,</w:t>
+      </w:r>
+    </w:p>
+    <w:p>
+      <w:pPr>
+        <w:spacing w:after="160" w:line="259" w:lineRule="auto"/>
+      </w:pPr>
+      <w:r>
+        <w:t xml:space="preserve">    </w:t>
+      </w:r>
+      <w:proofErr w:type="spellStart"/>
+      <w:r>
+        <w:t>ItemName</w:t>
+      </w:r>
+      <w:proofErr w:type="spellEnd"/>
+      <w:r>
+        <w:t xml:space="preserve"> NVARCHAR(150),</w:t>
+      </w:r>
+    </w:p>
+    <w:p>
+      <w:pPr>
+        <w:spacing w:after="160" w:line="259" w:lineRule="auto"/>
+      </w:pPr>
+      <w:r>
+        <w:t xml:space="preserve">    Price DECIMAL(12,2)</w:t>
+      </w:r>
+    </w:p>
+    <w:p>
+      <w:pPr>
+        <w:spacing w:after="160" w:line="259" w:lineRule="auto"/>
+      </w:pPr>
+      <w:r>
+        <w:t>)</w:t>
+      </w:r>
+    </w:p>
+    <w:p>
+      <w:pPr>
+        <w:spacing w:after="160" w:line="259" w:lineRule="auto"/>
+      </w:pPr>
+    </w:p>
+    <w:p>
+      <w:pPr>
+        <w:spacing w:after="160" w:line="259" w:lineRule="auto"/>
+      </w:pPr>
+      <w:r>
+        <w:t xml:space="preserve">CREATE TABLE </w:t>
+      </w:r>
+      <w:proofErr w:type="spellStart"/>
+      <w:r>
+        <w:t>MinibarUsages</w:t>
+      </w:r>
+      <w:proofErr w:type="spellEnd"/>
+      <w:r>
+        <w:t xml:space="preserve"> (</w:t>
+      </w:r>
+    </w:p>
+    <w:p>
+      <w:pPr>
+        <w:spacing w:after="160" w:line="259" w:lineRule="auto"/>
+      </w:pPr>
+      <w:r>
+        <w:t xml:space="preserve">    ID INT IDENTITY(1,1) PRIMARY KEY,</w:t>
+      </w:r>
+    </w:p>
+    <w:p>
+      <w:pPr>
+        <w:spacing w:after="160" w:line="259" w:lineRule="auto"/>
+      </w:pPr>
+      <w:r>
+        <w:t xml:space="preserve">    </w:t>
+      </w:r>
+      <w:proofErr w:type="spellStart"/>
+      <w:r>
+        <w:t>StayID</w:t>
+      </w:r>
+      <w:proofErr w:type="spellEnd"/>
+      <w:r>
+        <w:t xml:space="preserve"> INT NOT NULL,</w:t>
+      </w:r>
+    </w:p>
+    <w:p>
+      <w:pPr>
+        <w:spacing w:after="160" w:line="259" w:lineRule="auto"/>
+      </w:pPr>
+      <w:r>
+        <w:t xml:space="preserve">    </w:t>
+      </w:r>
+      <w:proofErr w:type="spellStart"/>
+      <w:r>
+        <w:t>MinibarID</w:t>
+      </w:r>
+      <w:proofErr w:type="spellEnd"/>
+      <w:r>
+        <w:t xml:space="preserve"> INT NOT NULL,</w:t>
+      </w:r>
+    </w:p>
+    <w:p>
+      <w:pPr>
+        <w:spacing w:after="160" w:line="259" w:lineRule="auto"/>
+      </w:pPr>
+      <w:r>
+        <w:t xml:space="preserve">    Quantity INT,</w:t>
+      </w:r>
+    </w:p>
+    <w:p>
+      <w:pPr>
+        <w:spacing w:after="160" w:line="259" w:lineRule="auto"/>
+      </w:pPr>
+      <w:r>
+        <w:t xml:space="preserve">    FOREIGN KEY (</w:t>
+      </w:r>
+      <w:proofErr w:type="spellStart"/>
+      <w:r>
+        <w:t>StayID</w:t>
+      </w:r>
+      <w:proofErr w:type="spellEnd"/>
+      <w:r>
+        <w:t>) REFERENCES Stays(</w:t>
+      </w:r>
+      <w:proofErr w:type="spellStart"/>
+      <w:r>
+        <w:t>StayID</w:t>
+      </w:r>
+      <w:proofErr w:type="spellEnd"/>
+      <w:r>
+        <w:t>),</w:t>
+      </w:r>
+    </w:p>
+    <w:p>
+      <w:pPr>
+        <w:spacing w:after="160" w:line="259" w:lineRule="auto"/>
+      </w:pPr>
+      <w:r>
+        <w:t xml:space="preserve">    FOREIGN KEY (</w:t>
+      </w:r>
+      <w:proofErr w:type="spellStart"/>
+      <w:r>
+        <w:t>MinibarID</w:t>
+      </w:r>
+      <w:proofErr w:type="spellEnd"/>
+      <w:r>
+        <w:t xml:space="preserve">) REFERENCES </w:t>
+      </w:r>
+      <w:proofErr w:type="spellStart"/>
+      <w:r>
+        <w:t>MinibarItems</w:t>
+      </w:r>
+      <w:proofErr w:type="spellEnd"/>
+      <w:r>
+        <w:t>(</w:t>
+      </w:r>
+      <w:proofErr w:type="spellStart"/>
+      <w:r>
+        <w:t>MinibarID</w:t>
+      </w:r>
+      <w:proofErr w:type="spellEnd"/>
+      <w:r>
+        <w:t>)</w:t>
+      </w:r>
+    </w:p>
+    <w:p>
+      <w:pPr>
+        <w:spacing w:after="160" w:line="259" w:lineRule="auto"/>
+      </w:pPr>
+      <w:r>
+        <w:t>)</w:t>
+      </w:r>
+    </w:p>
+    <w:p>
+      <w:pPr>
+        <w:spacing w:after="160" w:line="259" w:lineRule="auto"/>
+      </w:pPr>
+    </w:p>
+    <w:p>
+      <w:pPr>
+        <w:spacing w:after="160" w:line="259" w:lineRule="auto"/>
+      </w:pPr>
+      <w:r>
+        <w:t>CREATE TABLE Penalties (</w:t>
+      </w:r>
+    </w:p>
+    <w:p>
+      <w:pPr>
+        <w:spacing w:after="160" w:line="259" w:lineRule="auto"/>
+      </w:pPr>
+      <w:r>
+        <w:t xml:space="preserve">    </w:t>
+      </w:r>
+      <w:proofErr w:type="spellStart"/>
+      <w:r>
+        <w:t>PenaltyID</w:t>
+      </w:r>
+      <w:proofErr w:type="spellEnd"/>
+      <w:r>
+        <w:t xml:space="preserve"> INT IDENTITY(1,1) PRIMARY KEY,</w:t>
+      </w:r>
+    </w:p>
+    <w:p>
+      <w:pPr>
+        <w:spacing w:after="160" w:line="259" w:lineRule="auto"/>
+      </w:pPr>
+      <w:r>
+        <w:t xml:space="preserve">    </w:t>
+      </w:r>
+      <w:proofErr w:type="spellStart"/>
+      <w:r>
+        <w:t>StayID</w:t>
+      </w:r>
+      <w:proofErr w:type="spellEnd"/>
+      <w:r>
+        <w:t xml:space="preserve"> INT NOT NULL,</w:t>
+      </w:r>
+    </w:p>
+    <w:p>
+      <w:pPr>
+        <w:spacing w:after="160" w:line="259" w:lineRule="auto"/>
+      </w:pPr>
+      <w:r>
+        <w:t xml:space="preserve">    Reason NVARCHAR(255) NOT NULL,</w:t>
+      </w:r>
+    </w:p>
+    <w:p>
+      <w:pPr>
+        <w:spacing w:after="160" w:line="259" w:lineRule="auto"/>
+      </w:pPr>
+      <w:r>
+        <w:t xml:space="preserve">    Amount DECIMAL(14,2) NOT NULL,</w:t>
+      </w:r>
+    </w:p>
+    <w:p>
+      <w:pPr>
+        <w:spacing w:after="160" w:line="259" w:lineRule="auto"/>
+      </w:pPr>
+      <w:r>
+        <w:t xml:space="preserve">    </w:t>
+      </w:r>
+      <w:proofErr w:type="spellStart"/>
+      <w:r>
+        <w:t>CreatedAt</w:t>
+      </w:r>
+      <w:proofErr w:type="spellEnd"/>
+      <w:r>
+        <w:t xml:space="preserve"> DATETIME DEFAULT GETDATE(),</w:t>
+      </w:r>
+    </w:p>
+    <w:p>
+      <w:pPr>
+        <w:spacing w:after="160" w:line="259" w:lineRule="auto"/>
+      </w:pPr>
+      <w:r>
+        <w:t xml:space="preserve">    FOREIGN KEY (</w:t>
+      </w:r>
+      <w:proofErr w:type="spellStart"/>
+      <w:r>
+        <w:t>StayID</w:t>
+      </w:r>
+      <w:proofErr w:type="spellEnd"/>
+      <w:r>
+        <w:t>) REFERENCES Stays(</w:t>
+      </w:r>
+      <w:proofErr w:type="spellStart"/>
+      <w:r>
+        <w:t>StayID</w:t>
+      </w:r>
+      <w:proofErr w:type="spellEnd"/>
+      <w:r>
+        <w:t>)</w:t>
+      </w:r>
+    </w:p>
+    <w:p>
+      <w:pPr>
+        <w:spacing w:after="160" w:line="259" w:lineRule="auto"/>
+      </w:pPr>
+      <w:r>
+        <w:t>);</w:t>
+      </w:r>
+    </w:p>
+    <w:p>
+      <w:pPr>
+        <w:spacing w:after="160" w:line="259" w:lineRule="auto"/>
+      </w:pPr>
+    </w:p>
+    <w:p>
+      <w:pPr>
+        <w:spacing w:after="160" w:line="259" w:lineRule="auto"/>
+      </w:pPr>
+      <w:r>
+        <w:t>CREATE TABLE Invoices (</w:t>
+      </w:r>
+    </w:p>
+    <w:p>
+      <w:pPr>
+        <w:spacing w:after="160" w:line="259" w:lineRule="auto"/>
+      </w:pPr>
+      <w:r>
+        <w:t xml:space="preserve">    </w:t>
+      </w:r>
+      <w:proofErr w:type="spellStart"/>
+      <w:r>
+        <w:t>InvoiceID</w:t>
+      </w:r>
+      <w:proofErr w:type="spellEnd"/>
+      <w:r>
+        <w:t xml:space="preserve"> INT IDENTITY(1,1) PRIMARY KEY,</w:t>
+      </w:r>
+    </w:p>
+    <w:p>
+      <w:pPr>
+        <w:spacing w:after="160" w:line="259" w:lineRule="auto"/>
+      </w:pPr>
+      <w:r>
+        <w:lastRenderedPageBreak/>
+        <w:t xml:space="preserve">    </w:t>
+      </w:r>
+      <w:proofErr w:type="spellStart"/>
+      <w:r>
+        <w:t>StayID</w:t>
+      </w:r>
+      <w:proofErr w:type="spellEnd"/>
+      <w:r>
+        <w:t xml:space="preserve"> INT UNIQUE,</w:t>
+      </w:r>
+    </w:p>
+    <w:p>
+      <w:pPr>
+        <w:spacing w:after="160" w:line="259" w:lineRule="auto"/>
+      </w:pPr>
+      <w:r>
+        <w:t xml:space="preserve">    </w:t>
+      </w:r>
+      <w:proofErr w:type="spellStart"/>
+      <w:r>
+        <w:t>IssueDate</w:t>
+      </w:r>
+      <w:proofErr w:type="spellEnd"/>
+      <w:r>
+        <w:t xml:space="preserve"> DATETIME DEFAULT GETDATE(),</w:t>
+      </w:r>
+    </w:p>
+    <w:p>
+      <w:pPr>
+        <w:spacing w:after="160" w:line="259" w:lineRule="auto"/>
+      </w:pPr>
+      <w:r>
+        <w:t xml:space="preserve">    </w:t>
+      </w:r>
+      <w:proofErr w:type="spellStart"/>
+      <w:r>
+        <w:t>TotalAmount</w:t>
+      </w:r>
+      <w:proofErr w:type="spellEnd"/>
+      <w:r>
+        <w:t xml:space="preserve"> DECIMAL(14,2),</w:t>
+      </w:r>
+    </w:p>
+    <w:p>
+      <w:pPr>
+        <w:spacing w:after="160" w:line="259" w:lineRule="auto"/>
+      </w:pPr>
+      <w:r>
+        <w:t xml:space="preserve">    VAT DECIMAL(14,2),</w:t>
+      </w:r>
+    </w:p>
+    <w:p>
+      <w:pPr>
+        <w:spacing w:after="160" w:line="259" w:lineRule="auto"/>
+      </w:pPr>
+      <w:r>
+        <w:t xml:space="preserve">    Status NVARCHAR(20)</w:t>
+      </w:r>
+    </w:p>
+    <w:p>
+      <w:pPr>
+        <w:spacing w:after="160" w:line="259" w:lineRule="auto"/>
+      </w:pPr>
+      <w:r>
+        <w:t xml:space="preserve">        CHECK (Status IN ('OPEN','PAID','CANCELLED')),</w:t>
+      </w:r>
+    </w:p>
+    <w:p>
+      <w:pPr>
+        <w:spacing w:after="160" w:line="259" w:lineRule="auto"/>
+      </w:pPr>
+      <w:r>
+        <w:t xml:space="preserve">    FOREIGN KEY (</w:t>
+      </w:r>
+      <w:proofErr w:type="spellStart"/>
+      <w:r>
+        <w:t>StayID</w:t>
+      </w:r>
+      <w:proofErr w:type="spellEnd"/>
+      <w:r>
+        <w:t>) REFERENCES Stays(</w:t>
+      </w:r>
+      <w:proofErr w:type="spellStart"/>
+      <w:r>
+        <w:t>StayID</w:t>
+      </w:r>
+      <w:proofErr w:type="spellEnd"/>
+      <w:r>
+        <w:t>)</w:t>
+      </w:r>
+    </w:p>
+    <w:p>
+      <w:pPr>
+        <w:spacing w:after="160" w:line="259" w:lineRule="auto"/>
+      </w:pPr>
+      <w:r>
+        <w:t>)</w:t>
+      </w:r>
+    </w:p>
+    <w:p>
+      <w:pPr>
+        <w:spacing w:after="160" w:line="259" w:lineRule="auto"/>
+      </w:pPr>
+    </w:p>
+    <w:p>
+      <w:pPr>
+        <w:spacing w:after="160" w:line="259" w:lineRule="auto"/>
+      </w:pPr>
+      <w:r>
+        <w:t xml:space="preserve">CREATE TABLE </w:t>
+      </w:r>
+      <w:proofErr w:type="spellStart"/>
+      <w:r>
+        <w:t>InvoiceDetails</w:t>
+      </w:r>
+      <w:proofErr w:type="spellEnd"/>
+      <w:r>
+        <w:t xml:space="preserve"> (</w:t>
+      </w:r>
+    </w:p>
+    <w:p>
+      <w:pPr>
+        <w:spacing w:after="160" w:line="259" w:lineRule="auto"/>
+      </w:pPr>
+      <w:r>
+        <w:t xml:space="preserve">    </w:t>
+      </w:r>
+      <w:proofErr w:type="spellStart"/>
+      <w:r>
+        <w:t>DetailID</w:t>
+      </w:r>
+      <w:proofErr w:type="spellEnd"/>
+      <w:r>
+        <w:t xml:space="preserve"> INT IDENTITY(1,1) PRIMARY KEY,</w:t>
+      </w:r>
+    </w:p>
+    <w:p>
+      <w:pPr>
+        <w:spacing w:after="160" w:line="259" w:lineRule="auto"/>
+      </w:pPr>
+      <w:r>
+        <w:t xml:space="preserve">    </w:t>
+      </w:r>
+      <w:proofErr w:type="spellStart"/>
+      <w:r>
+        <w:t>InvoiceID</w:t>
+      </w:r>
+      <w:proofErr w:type="spellEnd"/>
+      <w:r>
+        <w:t xml:space="preserve"> INT NOT NULL,</w:t>
+      </w:r>
+    </w:p>
+    <w:p>
+      <w:pPr>
+        <w:spacing w:after="160" w:line="259" w:lineRule="auto"/>
+      </w:pPr>
+      <w:r>
+        <w:t xml:space="preserve">    ItemType NVARCHAR(20)</w:t>
+      </w:r>
+    </w:p>
+    <w:p>
+      <w:pPr>
+        <w:spacing w:after="160" w:line="259" w:lineRule="auto"/>
+      </w:pPr>
+      <w:r>
+        <w:t xml:space="preserve">        CHECK (ItemType IN ('ROOM','SERVICE','MINIBAR','PENALTY')),</w:t>
+      </w:r>
+    </w:p>
+    <w:p>
+      <w:pPr>
+        <w:spacing w:after="160" w:line="259" w:lineRule="auto"/>
+      </w:pPr>
+      <w:r>
+        <w:t xml:space="preserve">    </w:t>
+      </w:r>
+      <w:proofErr w:type="spellStart"/>
+      <w:r>
+        <w:t>ItemName</w:t>
+      </w:r>
+      <w:proofErr w:type="spellEnd"/>
+      <w:r>
+        <w:t xml:space="preserve"> NVARCHAR(255),</w:t>
+      </w:r>
+    </w:p>
+    <w:p>
+      <w:pPr>
+        <w:spacing w:after="160" w:line="259" w:lineRule="auto"/>
+      </w:pPr>
+      <w:r>
+        <w:t xml:space="preserve">    Quantity INT,</w:t>
+      </w:r>
+    </w:p>
+    <w:p>
+      <w:pPr>
+        <w:spacing w:after="160" w:line="259" w:lineRule="auto"/>
+      </w:pPr>
+      <w:r>
+        <w:t xml:space="preserve">    </w:t>
+      </w:r>
+      <w:proofErr w:type="spellStart"/>
+      <w:r>
+        <w:t>UnitPrice</w:t>
+      </w:r>
+      <w:proofErr w:type="spellEnd"/>
+      <w:r>
+        <w:t xml:space="preserve"> DECIMAL(12,2),</w:t>
+      </w:r>
+    </w:p>
+    <w:p>
+      <w:pPr>
+        <w:spacing w:after="160" w:line="259" w:lineRule="auto"/>
+      </w:pPr>
+      <w:r>
+        <w:t xml:space="preserve">    Amount DECIMAL(14,2),</w:t>
+      </w:r>
+    </w:p>
+    <w:p>
+      <w:pPr>
+        <w:spacing w:after="160" w:line="259" w:lineRule="auto"/>
+      </w:pPr>
+      <w:r>
+        <w:t xml:space="preserve">    FOREIGN KEY (</w:t>
+      </w:r>
+      <w:proofErr w:type="spellStart"/>
+      <w:r>
+        <w:t>InvoiceID</w:t>
+      </w:r>
+      <w:proofErr w:type="spellEnd"/>
+      <w:r>
+        <w:t>) REFERENCES Invoices(</w:t>
+      </w:r>
+      <w:proofErr w:type="spellStart"/>
+      <w:r>
+        <w:t>InvoiceID</w:t>
+      </w:r>
+      <w:proofErr w:type="spellEnd"/>
+      <w:r>
+        <w:t>)</w:t>
+      </w:r>
+    </w:p>
+    <w:p>
+      <w:pPr>
+        <w:spacing w:after="160" w:line="259" w:lineRule="auto"/>
+      </w:pPr>
+      <w:r>
+        <w:t>)</w:t>
+      </w:r>
+    </w:p>
+    <w:p>
+      <w:pPr>
+        <w:spacing w:after="160" w:line="259" w:lineRule="auto"/>
+      </w:pPr>
+    </w:p>
+    <w:p>
+      <w:pPr>
+        <w:spacing w:after="160" w:line="259" w:lineRule="auto"/>
+      </w:pPr>
+      <w:r>
+        <w:t>CREATE TABLE Payments (</w:t>
+      </w:r>
+    </w:p>
+    <w:p>
+      <w:pPr>
+        <w:spacing w:after="160" w:line="259" w:lineRule="auto"/>
+      </w:pPr>
+      <w:r>
+        <w:t xml:space="preserve">    </w:t>
+      </w:r>
+      <w:proofErr w:type="spellStart"/>
+      <w:r>
+        <w:t>PaymentID</w:t>
+      </w:r>
+      <w:proofErr w:type="spellEnd"/>
+      <w:r>
+        <w:t xml:space="preserve"> INT IDENTITY(1,1) PRIMARY KEY,</w:t>
+      </w:r>
+    </w:p>
+    <w:p>
+      <w:pPr>
+        <w:spacing w:after="160" w:line="259" w:lineRule="auto"/>
+      </w:pPr>
+      <w:r>
+        <w:t xml:space="preserve">    </w:t>
+      </w:r>
+      <w:proofErr w:type="spellStart"/>
+      <w:r>
+        <w:t>InvoiceID</w:t>
+      </w:r>
+      <w:proofErr w:type="spellEnd"/>
+      <w:r>
+        <w:t xml:space="preserve"> INT NOT NULL,</w:t>
+      </w:r>
+    </w:p>
+    <w:p>
+      <w:pPr>
+        <w:spacing w:after="160" w:line="259" w:lineRule="auto"/>
+      </w:pPr>
+      <w:r>
+        <w:t xml:space="preserve">    </w:t>
+      </w:r>
+      <w:proofErr w:type="spellStart"/>
+      <w:r>
+        <w:t>PaymentMethod</w:t>
+      </w:r>
+      <w:proofErr w:type="spellEnd"/>
+      <w:r>
+        <w:t xml:space="preserve"> NVARCHAR(20)</w:t>
+      </w:r>
+    </w:p>
+    <w:p>
+      <w:pPr>
+        <w:spacing w:after="160" w:line="259" w:lineRule="auto"/>
+      </w:pPr>
+      <w:r>
+        <w:t xml:space="preserve">        CHECK (</w:t>
+      </w:r>
+      <w:proofErr w:type="spellStart"/>
+      <w:r>
+        <w:t>PaymentMethod</w:t>
+      </w:r>
+      <w:proofErr w:type="spellEnd"/>
+      <w:r>
+        <w:t xml:space="preserve"> IN ('CASH','TRANSFER')),</w:t>
+      </w:r>
+    </w:p>
+    <w:p>
+      <w:pPr>
+        <w:spacing w:after="160" w:line="259" w:lineRule="auto"/>
+      </w:pPr>
+      <w:r>
+        <w:t xml:space="preserve">    Amount DECIMAL(14,2),</w:t>
+      </w:r>
+    </w:p>
+    <w:p>
+      <w:pPr>
+        <w:spacing w:after="160" w:line="259" w:lineRule="auto"/>
+      </w:pPr>
+      <w:r>
+        <w:t xml:space="preserve">    </w:t>
+      </w:r>
+      <w:proofErr w:type="spellStart"/>
+      <w:r>
+        <w:t>PaymentDate</w:t>
+      </w:r>
+      <w:proofErr w:type="spellEnd"/>
+      <w:r>
+        <w:t xml:space="preserve"> DATETIME DEFAULT GETDATE(),</w:t>
+      </w:r>
+    </w:p>
+    <w:p>
+      <w:pPr>
+        <w:spacing w:after="160" w:line="259" w:lineRule="auto"/>
+      </w:pPr>
+      <w:r>
+        <w:t xml:space="preserve">    FOREIGN KEY (</w:t>
+      </w:r>
+      <w:proofErr w:type="spellStart"/>
+      <w:r>
+        <w:t>InvoiceID</w:t>
+      </w:r>
+      <w:proofErr w:type="spellEnd"/>
+      <w:r>
+        <w:t>) REFERENCES Invoices(</w:t>
+      </w:r>
+      <w:proofErr w:type="spellStart"/>
+      <w:r>
+        <w:t>InvoiceID</w:t>
+      </w:r>
+      <w:proofErr w:type="spellEnd"/>
+      <w:r>
+        <w:t>)</w:t>
+      </w:r>
+    </w:p>
+    <w:p>
+      <w:pPr>
+        <w:spacing w:after="160" w:line="259" w:lineRule="auto"/>
+      </w:pPr>
+      <w:r>
+        <w:t>)</w:t>
+      </w:r>
+    </w:p>
+    <w:p>
+      <w:pPr>
+        <w:spacing w:after="160" w:line="259" w:lineRule="auto"/>
+      </w:pPr>
+      <w:proofErr w:type="spellStart"/>
+      <w:r>
+        <w:lastRenderedPageBreak/>
+        <w:t>Bố</w:t>
+      </w:r>
+      <w:proofErr w:type="spellEnd"/>
+      <w:r>
+        <w:t xml:space="preserve"> </w:t>
+      </w:r>
+      <w:proofErr w:type="spellStart"/>
+      <w:r>
+        <w:t>cục</w:t>
+      </w:r>
+      <w:proofErr w:type="spellEnd"/>
+      <w:r>
+        <w:t xml:space="preserve"> </w:t>
+      </w:r>
+      <w:proofErr w:type="spellStart"/>
+      <w:r>
+        <w:t>trang</w:t>
+      </w:r>
+      <w:proofErr w:type="spellEnd"/>
+      <w:r>
+        <w:t xml:space="preserve"> web</w:t>
+      </w:r>
+    </w:p>
+    <w:p>
+      <w:pPr>
+        <w:spacing w:after="160" w:line="259" w:lineRule="auto"/>
+      </w:pPr>
+      <w:proofErr w:type="spellStart"/>
+      <w:r>
+        <w:t>Gồm</w:t>
+      </w:r>
+      <w:proofErr w:type="spellEnd"/>
+      <w:r>
+        <w:t xml:space="preserve"> 3 </w:t>
+      </w:r>
+      <w:proofErr w:type="spellStart"/>
+      <w:r>
+        <w:t>vai</w:t>
+      </w:r>
+      <w:proofErr w:type="spellEnd"/>
+      <w:r>
+        <w:t xml:space="preserve"> </w:t>
+      </w:r>
+      <w:proofErr w:type="spellStart"/>
+      <w:r>
+        <w:t>trò</w:t>
+      </w:r>
+      <w:proofErr w:type="spellEnd"/>
+      <w:r>
+        <w:t xml:space="preserve">: Admin, </w:t>
+      </w:r>
+      <w:proofErr w:type="spellStart"/>
+      <w:r>
+        <w:t>lễ</w:t>
+      </w:r>
+      <w:proofErr w:type="spellEnd"/>
+      <w:r>
+        <w:t xml:space="preserve"> </w:t>
+      </w:r>
+      <w:proofErr w:type="spellStart"/>
+      <w:r>
+        <w:t>tân</w:t>
+      </w:r>
+      <w:proofErr w:type="spellEnd"/>
+      <w:r>
+        <w:t xml:space="preserve"> , </w:t>
+      </w:r>
+      <w:proofErr w:type="spellStart"/>
+      <w:r>
+        <w:t>khách</w:t>
+      </w:r>
+      <w:proofErr w:type="spellEnd"/>
+      <w:r>
+        <w:t xml:space="preserve"> </w:t>
+      </w:r>
+      <w:proofErr w:type="spellStart"/>
+      <w:r>
+        <w:t>hàng</w:t>
+      </w:r>
+      <w:proofErr w:type="spellEnd"/>
+      <w:r>
+        <w:t>(</w:t>
+      </w:r>
+      <w:proofErr w:type="spellStart"/>
+      <w:r>
+        <w:t>đặt</w:t>
+      </w:r>
+      <w:proofErr w:type="spellEnd"/>
+      <w:r>
+        <w:t xml:space="preserve"> </w:t>
+      </w:r>
+      <w:proofErr w:type="spellStart"/>
+      <w:r>
+        <w:t>phòng</w:t>
+      </w:r>
+      <w:proofErr w:type="spellEnd"/>
+      <w:r>
+        <w:t xml:space="preserve"> online)</w:t>
+      </w:r>
     </w:p>
     <w:sectPr>
       <w:pgSz w:w="12240" w:h="15840"/>
@@ -30865,4 +33226,16 @@
     </a:ext>
   </a:extLst>
 </a:theme>
+</file>
+
+<file path=customXml/item1.xml><?xml version="1.0" encoding="utf-8"?>
+<b:Sources xmlns:b="http://schemas.openxmlformats.org/officeDocument/2006/bibliography" xmlns="http://schemas.openxmlformats.org/officeDocument/2006/bibliography" SelectedStyle="\APASixthEditionOfficeOnline.xsl" StyleName="APA" Version="6"/>
+</file>
+
+<file path=customXml/itemProps1.xml><?xml version="1.0" encoding="utf-8"?>
+<ds:datastoreItem xmlns:ds="http://schemas.openxmlformats.org/officeDocument/2006/customXml" ds:itemID="{D11C4D90-46FB-4EED-A114-8A91DD046C73}">
+  <ds:schemaRefs>
+    <ds:schemaRef ds:uri="http://schemas.openxmlformats.org/officeDocument/2006/bibliography"/>
+  </ds:schemaRefs>
+</ds:datastoreItem>
 </file>
</xml_diff>

<commit_message>
Xây dựng 1 số procedure phần Tổng quan, Lịch Phòng, QL phòng, QL Khách hàng,...
</commit_message>
<xml_diff>
--- a/Documents/Quản lý khách sạn(Phân tích).docx
+++ b/Documents/Quản lý khách sạn(Phân tích).docx
@@ -6383,18 +6383,8 @@
           <w:sz w:val="26"/>
           <w:szCs w:val="26"/>
         </w:rPr>
-        <w:t xml:space="preserve"> </w:t>
-      </w:r>
-      <w:proofErr w:type="spellStart"/>
-      <w:r>
-        <w:rPr>
-          <w:rFonts w:ascii="Times New Roman" w:hAnsi="Times New Roman" w:cs="Times New Roman"/>
-          <w:sz w:val="26"/>
-          <w:szCs w:val="26"/>
-        </w:rPr>
-        <w:t>tân</w:t>
-      </w:r>
-      <w:proofErr w:type="spellEnd"/>
+        <w:t xml:space="preserve"> tân</w:t>
+      </w:r>
     </w:p>
     <w:p>
       <w:pPr>
@@ -22994,30 +22984,93 @@
           <w:numId w:val="24"/>
         </w:numPr>
         <w:spacing w:after="160" w:line="259" w:lineRule="auto"/>
-      </w:pPr>
-      <w:proofErr w:type="spellStart"/>
-      <w:r>
+        <w:rPr>
+          <w:highlight w:val="cyan"/>
+        </w:rPr>
+      </w:pPr>
+      <w:proofErr w:type="spellStart"/>
+      <w:r>
+        <w:rPr>
+          <w:highlight w:val="cyan"/>
+        </w:rPr>
         <w:t>Checkin</w:t>
       </w:r>
       <w:proofErr w:type="spellEnd"/>
       <w:r>
+        <w:rPr>
+          <w:highlight w:val="cyan"/>
+        </w:rPr>
         <w:t>/</w:t>
       </w:r>
       <w:proofErr w:type="spellStart"/>
       <w:r>
+        <w:rPr>
+          <w:highlight w:val="cyan"/>
+        </w:rPr>
         <w:t>CheckOut</w:t>
       </w:r>
       <w:proofErr w:type="spellEnd"/>
       <w:r>
-        <w:t xml:space="preserve"> </w:t>
-      </w:r>
-      <w:proofErr w:type="spellStart"/>
-      <w:r>
+        <w:rPr>
+          <w:highlight w:val="cyan"/>
+        </w:rPr>
+        <w:t xml:space="preserve"> </w:t>
+      </w:r>
+      <w:proofErr w:type="spellStart"/>
+      <w:r>
+        <w:rPr>
+          <w:highlight w:val="cyan"/>
+        </w:rPr>
         <w:t>hôm</w:t>
       </w:r>
       <w:proofErr w:type="spellEnd"/>
       <w:r>
-        <w:t xml:space="preserve"> nay</w:t>
+        <w:rPr>
+          <w:highlight w:val="cyan"/>
+        </w:rPr>
+        <w:t xml:space="preserve"> </w:t>
+      </w:r>
+      <w:proofErr w:type="gramStart"/>
+      <w:r>
+        <w:rPr>
+          <w:highlight w:val="cyan"/>
+        </w:rPr>
+        <w:t>nay</w:t>
+      </w:r>
+      <w:r>
+        <w:rPr>
+          <w:highlight w:val="cyan"/>
+        </w:rPr>
+        <w:t>(</w:t>
+      </w:r>
+      <w:proofErr w:type="spellStart"/>
+      <w:proofErr w:type="gramEnd"/>
+      <w:r>
+        <w:rPr>
+          <w:highlight w:val="cyan"/>
+        </w:rPr>
+        <w:t>số</w:t>
+      </w:r>
+      <w:proofErr w:type="spellEnd"/>
+      <w:r>
+        <w:rPr>
+          <w:highlight w:val="cyan"/>
+        </w:rPr>
+        <w:t xml:space="preserve"> </w:t>
+      </w:r>
+      <w:proofErr w:type="spellStart"/>
+      <w:r>
+        <w:rPr>
+          <w:highlight w:val="cyan"/>
+        </w:rPr>
+        <w:t>lượng</w:t>
+      </w:r>
+      <w:proofErr w:type="spellEnd"/>
+      <w:r>
+        <w:rPr>
+          <w:highlight w:val="cyan"/>
+        </w:rPr>
+        <w:t>)</w:t>
       </w:r>
     </w:p>
     <w:p>
@@ -23028,31 +23081,95 @@
           <w:numId w:val="24"/>
         </w:numPr>
         <w:spacing w:after="160" w:line="259" w:lineRule="auto"/>
-      </w:pPr>
-      <w:r>
+        <w:rPr>
+          <w:highlight w:val="cyan"/>
+        </w:rPr>
+      </w:pPr>
+      <w:r>
+        <w:rPr>
+          <w:highlight w:val="cyan"/>
+        </w:rPr>
         <w:t xml:space="preserve">Doanh </w:t>
       </w:r>
       <w:proofErr w:type="spellStart"/>
       <w:r>
+        <w:rPr>
+          <w:highlight w:val="cyan"/>
+        </w:rPr>
         <w:t>thu</w:t>
       </w:r>
       <w:proofErr w:type="spellEnd"/>
       <w:r>
-        <w:t xml:space="preserve"> </w:t>
-      </w:r>
-      <w:proofErr w:type="spellStart"/>
-      <w:r>
+        <w:rPr>
+          <w:highlight w:val="cyan"/>
+        </w:rPr>
+        <w:t xml:space="preserve"> </w:t>
+      </w:r>
+      <w:proofErr w:type="spellStart"/>
+      <w:r>
+        <w:rPr>
+          <w:highlight w:val="cyan"/>
+        </w:rPr>
         <w:t>tháng</w:t>
       </w:r>
       <w:proofErr w:type="spellEnd"/>
       <w:r>
-        <w:t xml:space="preserve"> </w:t>
-      </w:r>
-      <w:proofErr w:type="spellStart"/>
-      <w:r>
+        <w:rPr>
+          <w:highlight w:val="cyan"/>
+        </w:rPr>
+        <w:t xml:space="preserve"> </w:t>
+      </w:r>
+      <w:proofErr w:type="spellStart"/>
+      <w:r>
+        <w:rPr>
+          <w:highlight w:val="cyan"/>
+        </w:rPr>
         <w:t>này</w:t>
       </w:r>
       <w:proofErr w:type="spellEnd"/>
+      <w:r>
+        <w:t xml:space="preserve"> (</w:t>
+      </w:r>
+      <w:proofErr w:type="spellStart"/>
+      <w:r>
+        <w:t>Từ</w:t>
+      </w:r>
+      <w:proofErr w:type="spellEnd"/>
+      <w:r>
+        <w:t xml:space="preserve"> n(</w:t>
+      </w:r>
+      <w:proofErr w:type="spellStart"/>
+      <w:r>
+        <w:t>số</w:t>
+      </w:r>
+      <w:proofErr w:type="spellEnd"/>
+      <w:r>
+        <w:t xml:space="preserve">) </w:t>
+      </w:r>
+      <w:proofErr w:type="spellStart"/>
+      <w:r>
+        <w:t>lượt</w:t>
+      </w:r>
+      <w:proofErr w:type="spellEnd"/>
+      <w:r>
+        <w:t xml:space="preserve"> </w:t>
+      </w:r>
+      <w:proofErr w:type="spellStart"/>
+      <w:r>
+        <w:t>lưu</w:t>
+      </w:r>
+      <w:proofErr w:type="spellEnd"/>
+      <w:r>
+        <w:t xml:space="preserve"> </w:t>
+      </w:r>
+      <w:proofErr w:type="spellStart"/>
+      <w:r>
+        <w:t>trú</w:t>
+      </w:r>
+      <w:proofErr w:type="spellEnd"/>
+      <w:r>
+        <w:t>)</w:t>
+      </w:r>
     </w:p>
     <w:p>
       <w:pPr>
@@ -23062,44 +23179,166 @@
           <w:numId w:val="24"/>
         </w:numPr>
         <w:spacing w:after="160" w:line="259" w:lineRule="auto"/>
-      </w:pPr>
-      <w:proofErr w:type="spellStart"/>
-      <w:r>
-        <w:t>Từ</w:t>
-      </w:r>
-      <w:proofErr w:type="spellEnd"/>
-      <w:r>
-        <w:t xml:space="preserve"> n(</w:t>
-      </w:r>
-      <w:proofErr w:type="spellStart"/>
-      <w:r>
-        <w:t>số</w:t>
-      </w:r>
-      <w:proofErr w:type="spellEnd"/>
-      <w:r>
-        <w:t xml:space="preserve">) </w:t>
-      </w:r>
-      <w:proofErr w:type="spellStart"/>
-      <w:r>
-        <w:t>lượt</w:t>
-      </w:r>
-      <w:proofErr w:type="spellEnd"/>
-      <w:r>
-        <w:t xml:space="preserve"> </w:t>
-      </w:r>
-      <w:proofErr w:type="spellStart"/>
-      <w:r>
-        <w:t>lưu</w:t>
-      </w:r>
-      <w:proofErr w:type="spellEnd"/>
-      <w:r>
-        <w:t xml:space="preserve"> </w:t>
-      </w:r>
-      <w:proofErr w:type="spellStart"/>
-      <w:r>
-        <w:t>trú</w:t>
-      </w:r>
-      <w:proofErr w:type="spellEnd"/>
+        <w:rPr>
+          <w:highlight w:val="yellow"/>
+        </w:rPr>
+      </w:pPr>
+      <w:proofErr w:type="spellStart"/>
+      <w:r>
+        <w:rPr>
+          <w:highlight w:val="yellow"/>
+        </w:rPr>
+        <w:t>Trạng</w:t>
+      </w:r>
+      <w:proofErr w:type="spellEnd"/>
+      <w:r>
+        <w:rPr>
+          <w:highlight w:val="yellow"/>
+        </w:rPr>
+        <w:t xml:space="preserve"> </w:t>
+      </w:r>
+      <w:proofErr w:type="spellStart"/>
+      <w:r>
+        <w:rPr>
+          <w:highlight w:val="yellow"/>
+        </w:rPr>
+        <w:t>thái</w:t>
+      </w:r>
+      <w:proofErr w:type="spellEnd"/>
+      <w:r>
+        <w:rPr>
+          <w:highlight w:val="yellow"/>
+        </w:rPr>
+        <w:t xml:space="preserve"> </w:t>
+      </w:r>
+      <w:proofErr w:type="spellStart"/>
+      <w:proofErr w:type="gramStart"/>
+      <w:r>
+        <w:rPr>
+          <w:highlight w:val="yellow"/>
+        </w:rPr>
+        <w:t>phòng</w:t>
+      </w:r>
+      <w:proofErr w:type="spellEnd"/>
+      <w:r>
+        <w:rPr>
+          <w:highlight w:val="yellow"/>
+        </w:rPr>
+        <w:t>(</w:t>
+      </w:r>
+      <w:proofErr w:type="spellStart"/>
+      <w:proofErr w:type="gramEnd"/>
+      <w:r>
+        <w:rPr>
+          <w:highlight w:val="yellow"/>
+        </w:rPr>
+        <w:t>Phòng</w:t>
+      </w:r>
+      <w:proofErr w:type="spellEnd"/>
+      <w:r>
+        <w:rPr>
+          <w:highlight w:val="yellow"/>
+        </w:rPr>
+        <w:t xml:space="preserve"> </w:t>
+      </w:r>
+      <w:proofErr w:type="spellStart"/>
+      <w:r>
+        <w:rPr>
+          <w:highlight w:val="yellow"/>
+        </w:rPr>
+        <w:t>trống</w:t>
+      </w:r>
+      <w:proofErr w:type="spellEnd"/>
+      <w:r>
+        <w:rPr>
+          <w:highlight w:val="yellow"/>
+        </w:rPr>
+        <w:t xml:space="preserve">: n, </w:t>
+      </w:r>
+      <w:proofErr w:type="spellStart"/>
+      <w:r>
+        <w:rPr>
+          <w:highlight w:val="yellow"/>
+        </w:rPr>
+        <w:t>Đang</w:t>
+      </w:r>
+      <w:proofErr w:type="spellEnd"/>
+      <w:r>
+        <w:rPr>
+          <w:highlight w:val="yellow"/>
+        </w:rPr>
+        <w:t xml:space="preserve"> </w:t>
+      </w:r>
+      <w:proofErr w:type="spellStart"/>
+      <w:r>
+        <w:rPr>
+          <w:highlight w:val="yellow"/>
+        </w:rPr>
+        <w:t>sử</w:t>
+      </w:r>
+      <w:proofErr w:type="spellEnd"/>
+      <w:r>
+        <w:rPr>
+          <w:highlight w:val="yellow"/>
+        </w:rPr>
+        <w:t xml:space="preserve"> </w:t>
+      </w:r>
+      <w:proofErr w:type="spellStart"/>
+      <w:r>
+        <w:rPr>
+          <w:highlight w:val="yellow"/>
+        </w:rPr>
+        <w:t>dụng</w:t>
+      </w:r>
+      <w:proofErr w:type="spellEnd"/>
+      <w:r>
+        <w:rPr>
+          <w:highlight w:val="yellow"/>
+        </w:rPr>
+        <w:t xml:space="preserve">: n, </w:t>
+      </w:r>
+      <w:proofErr w:type="spellStart"/>
+      <w:r>
+        <w:rPr>
+          <w:highlight w:val="yellow"/>
+        </w:rPr>
+        <w:t>Cần</w:t>
+      </w:r>
+      <w:proofErr w:type="spellEnd"/>
+      <w:r>
+        <w:rPr>
+          <w:highlight w:val="yellow"/>
+        </w:rPr>
+        <w:t xml:space="preserve"> </w:t>
+      </w:r>
+      <w:proofErr w:type="spellStart"/>
+      <w:r>
+        <w:rPr>
+          <w:highlight w:val="yellow"/>
+        </w:rPr>
+        <w:t>dọn</w:t>
+      </w:r>
+      <w:proofErr w:type="spellEnd"/>
+      <w:r>
+        <w:rPr>
+          <w:highlight w:val="yellow"/>
+        </w:rPr>
+        <w:t xml:space="preserve"> </w:t>
+      </w:r>
+      <w:proofErr w:type="spellStart"/>
+      <w:r>
+        <w:rPr>
+          <w:highlight w:val="yellow"/>
+        </w:rPr>
+        <w:t>dẹp</w:t>
+      </w:r>
+      <w:proofErr w:type="spellEnd"/>
+      <w:r>
+        <w:rPr>
+          <w:highlight w:val="yellow"/>
+        </w:rPr>
+        <w:t>: n)</w:t>
+      </w:r>
     </w:p>
     <w:p>
       <w:pPr>
@@ -23113,162 +23352,136 @@
           <w:highlight w:val="yellow"/>
         </w:rPr>
       </w:pPr>
-      <w:proofErr w:type="spellStart"/>
       <w:r>
         <w:rPr>
           <w:highlight w:val="yellow"/>
         </w:rPr>
-        <w:t>Trạng</w:t>
-      </w:r>
-      <w:proofErr w:type="spellEnd"/>
+        <w:t xml:space="preserve">Thông tin </w:t>
+      </w:r>
+      <w:proofErr w:type="spellStart"/>
       <w:r>
         <w:rPr>
           <w:highlight w:val="yellow"/>
         </w:rPr>
-        <w:t xml:space="preserve"> </w:t>
-      </w:r>
-      <w:proofErr w:type="spellStart"/>
+        <w:t>khách</w:t>
+      </w:r>
+      <w:proofErr w:type="spellEnd"/>
       <w:r>
         <w:rPr>
           <w:highlight w:val="yellow"/>
         </w:rPr>
-        <w:t>thái</w:t>
-      </w:r>
-      <w:proofErr w:type="spellEnd"/>
+        <w:t xml:space="preserve">: </w:t>
+      </w:r>
+      <w:proofErr w:type="spellStart"/>
       <w:r>
         <w:rPr>
           <w:highlight w:val="yellow"/>
         </w:rPr>
-        <w:t xml:space="preserve"> </w:t>
-      </w:r>
-      <w:proofErr w:type="spellStart"/>
-      <w:proofErr w:type="gramStart"/>
+        <w:t>Tổng</w:t>
+      </w:r>
+      <w:proofErr w:type="spellEnd"/>
       <w:r>
         <w:rPr>
           <w:highlight w:val="yellow"/>
         </w:rPr>
+        <w:t xml:space="preserve"> </w:t>
+      </w:r>
+      <w:proofErr w:type="spellStart"/>
+      <w:r>
+        <w:rPr>
+          <w:highlight w:val="yellow"/>
+        </w:rPr>
+        <w:t>khách</w:t>
+      </w:r>
+      <w:proofErr w:type="spellEnd"/>
+      <w:r>
+        <w:rPr>
+          <w:highlight w:val="yellow"/>
+        </w:rPr>
+        <w:t xml:space="preserve"> </w:t>
+      </w:r>
+      <w:proofErr w:type="spellStart"/>
+      <w:r>
+        <w:rPr>
+          <w:highlight w:val="yellow"/>
+        </w:rPr>
+        <w:t>hàng</w:t>
+      </w:r>
+      <w:proofErr w:type="spellEnd"/>
+      <w:r>
+        <w:rPr>
+          <w:highlight w:val="yellow"/>
+        </w:rPr>
+        <w:t xml:space="preserve">: n, </w:t>
+      </w:r>
+      <w:proofErr w:type="spellStart"/>
+      <w:r>
+        <w:rPr>
+          <w:highlight w:val="yellow"/>
+        </w:rPr>
+        <w:t>Đang</w:t>
+      </w:r>
+      <w:proofErr w:type="spellEnd"/>
+      <w:r>
+        <w:rPr>
+          <w:highlight w:val="yellow"/>
+        </w:rPr>
+        <w:t xml:space="preserve"> </w:t>
+      </w:r>
+      <w:proofErr w:type="spellStart"/>
+      <w:r>
+        <w:rPr>
+          <w:highlight w:val="yellow"/>
+        </w:rPr>
+        <w:t>lưu</w:t>
+      </w:r>
+      <w:proofErr w:type="spellEnd"/>
+      <w:r>
+        <w:rPr>
+          <w:highlight w:val="yellow"/>
+        </w:rPr>
+        <w:t xml:space="preserve"> </w:t>
+      </w:r>
+      <w:proofErr w:type="spellStart"/>
+      <w:r>
+        <w:rPr>
+          <w:highlight w:val="yellow"/>
+        </w:rPr>
+        <w:t>trú</w:t>
+      </w:r>
+      <w:proofErr w:type="spellEnd"/>
+      <w:r>
+        <w:rPr>
+          <w:highlight w:val="yellow"/>
+        </w:rPr>
+        <w:t>: n</w:t>
+      </w:r>
+    </w:p>
+    <w:p>
+      <w:pPr>
+        <w:pStyle w:val="ListParagraph"/>
+        <w:numPr>
+          <w:ilvl w:val="0"/>
+          <w:numId w:val="24"/>
+        </w:numPr>
+        <w:spacing w:after="160" w:line="259" w:lineRule="auto"/>
+      </w:pPr>
+      <w:r>
+        <w:t xml:space="preserve">Trang </w:t>
+      </w:r>
+      <w:proofErr w:type="spellStart"/>
+      <w:r>
+        <w:t>Lịch</w:t>
+      </w:r>
+      <w:proofErr w:type="spellEnd"/>
+      <w:r>
+        <w:t xml:space="preserve"> </w:t>
+      </w:r>
+      <w:proofErr w:type="spellStart"/>
+      <w:r>
         <w:t>phòng</w:t>
       </w:r>
       <w:proofErr w:type="spellEnd"/>
-      <w:r>
-        <w:rPr>
-          <w:highlight w:val="yellow"/>
-        </w:rPr>
-        <w:t>(</w:t>
-      </w:r>
-      <w:proofErr w:type="spellStart"/>
-      <w:proofErr w:type="gramEnd"/>
-      <w:r>
-        <w:rPr>
-          <w:highlight w:val="yellow"/>
-        </w:rPr>
-        <w:t>Phòng</w:t>
-      </w:r>
-      <w:proofErr w:type="spellEnd"/>
-      <w:r>
-        <w:rPr>
-          <w:highlight w:val="yellow"/>
-        </w:rPr>
-        <w:t xml:space="preserve"> </w:t>
-      </w:r>
-      <w:proofErr w:type="spellStart"/>
-      <w:r>
-        <w:rPr>
-          <w:highlight w:val="yellow"/>
-        </w:rPr>
-        <w:t>trống</w:t>
-      </w:r>
-      <w:proofErr w:type="spellEnd"/>
-      <w:r>
-        <w:rPr>
-          <w:highlight w:val="yellow"/>
-        </w:rPr>
-        <w:t xml:space="preserve">: n, </w:t>
-      </w:r>
-      <w:proofErr w:type="spellStart"/>
-      <w:r>
-        <w:rPr>
-          <w:highlight w:val="yellow"/>
-        </w:rPr>
-        <w:t>Đang</w:t>
-      </w:r>
-      <w:proofErr w:type="spellEnd"/>
-      <w:r>
-        <w:rPr>
-          <w:highlight w:val="yellow"/>
-        </w:rPr>
-        <w:t xml:space="preserve"> </w:t>
-      </w:r>
-      <w:proofErr w:type="spellStart"/>
-      <w:r>
-        <w:rPr>
-          <w:highlight w:val="yellow"/>
-        </w:rPr>
-        <w:t>sử</w:t>
-      </w:r>
-      <w:proofErr w:type="spellEnd"/>
-      <w:r>
-        <w:rPr>
-          <w:highlight w:val="yellow"/>
-        </w:rPr>
-        <w:t xml:space="preserve"> </w:t>
-      </w:r>
-      <w:proofErr w:type="spellStart"/>
-      <w:r>
-        <w:rPr>
-          <w:highlight w:val="yellow"/>
-        </w:rPr>
-        <w:t>dụng</w:t>
-      </w:r>
-      <w:proofErr w:type="spellEnd"/>
-      <w:r>
-        <w:rPr>
-          <w:highlight w:val="yellow"/>
-        </w:rPr>
-        <w:t xml:space="preserve">: n, </w:t>
-      </w:r>
-      <w:proofErr w:type="spellStart"/>
-      <w:r>
-        <w:rPr>
-          <w:highlight w:val="yellow"/>
-        </w:rPr>
-        <w:t>Cần</w:t>
-      </w:r>
-      <w:proofErr w:type="spellEnd"/>
-      <w:r>
-        <w:rPr>
-          <w:highlight w:val="yellow"/>
-        </w:rPr>
-        <w:t xml:space="preserve"> </w:t>
-      </w:r>
-      <w:proofErr w:type="spellStart"/>
-      <w:r>
-        <w:rPr>
-          <w:highlight w:val="yellow"/>
-        </w:rPr>
-        <w:t>dọn</w:t>
-      </w:r>
-      <w:proofErr w:type="spellEnd"/>
-      <w:r>
-        <w:rPr>
-          <w:highlight w:val="yellow"/>
-        </w:rPr>
-        <w:t xml:space="preserve"> </w:t>
-      </w:r>
-      <w:proofErr w:type="spellStart"/>
-      <w:r>
-        <w:rPr>
-          <w:highlight w:val="yellow"/>
-        </w:rPr>
-        <w:t>dẹp</w:t>
-      </w:r>
-      <w:proofErr w:type="spellEnd"/>
-      <w:r>
-        <w:rPr>
-          <w:highlight w:val="yellow"/>
-        </w:rPr>
-        <w:t>: n)</w:t>
-      </w:r>
     </w:p>
     <w:p>
       <w:pPr>
@@ -23279,113 +23492,101 @@
         </w:numPr>
         <w:spacing w:after="160" w:line="259" w:lineRule="auto"/>
         <w:rPr>
-          <w:highlight w:val="yellow"/>
-        </w:rPr>
-      </w:pPr>
-      <w:r>
-        <w:rPr>
-          <w:highlight w:val="yellow"/>
-        </w:rPr>
-        <w:t xml:space="preserve">Thông tin </w:t>
-      </w:r>
-      <w:proofErr w:type="spellStart"/>
-      <w:r>
-        <w:rPr>
-          <w:highlight w:val="yellow"/>
-        </w:rPr>
-        <w:t>khách</w:t>
-      </w:r>
-      <w:proofErr w:type="spellEnd"/>
-      <w:r>
-        <w:rPr>
-          <w:highlight w:val="yellow"/>
-        </w:rPr>
-        <w:t xml:space="preserve">: </w:t>
-      </w:r>
-      <w:proofErr w:type="spellStart"/>
-      <w:r>
-        <w:rPr>
-          <w:highlight w:val="yellow"/>
-        </w:rPr>
-        <w:t>Tổng</w:t>
-      </w:r>
-      <w:proofErr w:type="spellEnd"/>
-      <w:r>
-        <w:rPr>
-          <w:highlight w:val="yellow"/>
-        </w:rPr>
-        <w:t xml:space="preserve"> </w:t>
-      </w:r>
-      <w:proofErr w:type="spellStart"/>
-      <w:r>
-        <w:rPr>
-          <w:highlight w:val="yellow"/>
-        </w:rPr>
-        <w:t>khách</w:t>
-      </w:r>
-      <w:proofErr w:type="spellEnd"/>
-      <w:r>
-        <w:rPr>
-          <w:highlight w:val="yellow"/>
-        </w:rPr>
-        <w:t xml:space="preserve"> </w:t>
-      </w:r>
-      <w:proofErr w:type="spellStart"/>
-      <w:r>
-        <w:rPr>
-          <w:highlight w:val="yellow"/>
-        </w:rPr>
-        <w:t>hàng</w:t>
-      </w:r>
-      <w:proofErr w:type="spellEnd"/>
-      <w:r>
-        <w:rPr>
-          <w:highlight w:val="yellow"/>
-        </w:rPr>
-        <w:t xml:space="preserve">: n, </w:t>
-      </w:r>
-      <w:proofErr w:type="spellStart"/>
-      <w:r>
-        <w:rPr>
-          <w:highlight w:val="yellow"/>
-        </w:rPr>
-        <w:t>Đang</w:t>
-      </w:r>
-      <w:proofErr w:type="spellEnd"/>
-      <w:r>
-        <w:rPr>
-          <w:highlight w:val="yellow"/>
-        </w:rPr>
-        <w:t xml:space="preserve"> </w:t>
-      </w:r>
-      <w:proofErr w:type="spellStart"/>
-      <w:r>
-        <w:rPr>
-          <w:highlight w:val="yellow"/>
-        </w:rPr>
-        <w:t>lưu</w:t>
-      </w:r>
-      <w:proofErr w:type="spellEnd"/>
-      <w:r>
-        <w:rPr>
-          <w:highlight w:val="yellow"/>
-        </w:rPr>
-        <w:t xml:space="preserve"> </w:t>
-      </w:r>
-      <w:proofErr w:type="spellStart"/>
-      <w:r>
-        <w:rPr>
-          <w:highlight w:val="yellow"/>
-        </w:rPr>
-        <w:t>trú</w:t>
-      </w:r>
-      <w:proofErr w:type="spellEnd"/>
-      <w:r>
-        <w:rPr>
-          <w:highlight w:val="yellow"/>
-        </w:rPr>
-        <w:t>: n</w:t>
-      </w:r>
+          <w:highlight w:val="cyan"/>
+        </w:rPr>
+      </w:pPr>
+      <w:proofErr w:type="spellStart"/>
+      <w:r>
+        <w:rPr>
+          <w:highlight w:val="cyan"/>
+        </w:rPr>
+        <w:t>Lịch</w:t>
+      </w:r>
+      <w:proofErr w:type="spellEnd"/>
+      <w:r>
+        <w:rPr>
+          <w:highlight w:val="cyan"/>
+        </w:rPr>
+        <w:t xml:space="preserve"> </w:t>
+      </w:r>
+      <w:proofErr w:type="spellStart"/>
+      <w:r>
+        <w:rPr>
+          <w:highlight w:val="cyan"/>
+        </w:rPr>
+        <w:t>theo</w:t>
+      </w:r>
+      <w:proofErr w:type="spellEnd"/>
+      <w:r>
+        <w:rPr>
+          <w:highlight w:val="cyan"/>
+        </w:rPr>
+        <w:t xml:space="preserve"> </w:t>
+      </w:r>
+      <w:proofErr w:type="spellStart"/>
+      <w:r>
+        <w:rPr>
+          <w:highlight w:val="cyan"/>
+        </w:rPr>
+        <w:t>từng</w:t>
+      </w:r>
+      <w:proofErr w:type="spellEnd"/>
+      <w:r>
+        <w:rPr>
+          <w:highlight w:val="cyan"/>
+        </w:rPr>
+        <w:t xml:space="preserve"> </w:t>
+      </w:r>
+      <w:proofErr w:type="spellStart"/>
+      <w:r>
+        <w:rPr>
+          <w:highlight w:val="cyan"/>
+        </w:rPr>
+        <w:t>ngày</w:t>
+      </w:r>
+      <w:proofErr w:type="spellEnd"/>
+      <w:r>
+        <w:rPr>
+          <w:highlight w:val="cyan"/>
+        </w:rPr>
+        <w:t xml:space="preserve"> </w:t>
+      </w:r>
+      <w:proofErr w:type="spellStart"/>
+      <w:r>
+        <w:rPr>
+          <w:highlight w:val="cyan"/>
+        </w:rPr>
+        <w:t>của</w:t>
+      </w:r>
+      <w:proofErr w:type="spellEnd"/>
+      <w:r>
+        <w:rPr>
+          <w:highlight w:val="cyan"/>
+        </w:rPr>
+        <w:t xml:space="preserve"> </w:t>
+      </w:r>
+      <w:proofErr w:type="spellStart"/>
+      <w:r>
+        <w:rPr>
+          <w:highlight w:val="cyan"/>
+        </w:rPr>
+        <w:t>từng</w:t>
+      </w:r>
+      <w:proofErr w:type="spellEnd"/>
+      <w:r>
+        <w:rPr>
+          <w:highlight w:val="cyan"/>
+        </w:rPr>
+        <w:t xml:space="preserve"> </w:t>
+      </w:r>
+      <w:proofErr w:type="spellStart"/>
+      <w:r>
+        <w:rPr>
+          <w:highlight w:val="cyan"/>
+        </w:rPr>
+        <w:t>phòng</w:t>
+      </w:r>
+      <w:proofErr w:type="spellEnd"/>
     </w:p>
     <w:p>
       <w:pPr>
@@ -23397,19 +23598,19 @@
         <w:spacing w:after="160" w:line="259" w:lineRule="auto"/>
       </w:pPr>
       <w:r>
-        <w:t xml:space="preserve">Trang </w:t>
-      </w:r>
-      <w:proofErr w:type="spellStart"/>
-      <w:r>
-        <w:t>Lịch</w:t>
-      </w:r>
-      <w:proofErr w:type="spellEnd"/>
-      <w:r>
-        <w:t xml:space="preserve"> </w:t>
-      </w:r>
-      <w:proofErr w:type="spellStart"/>
-      <w:r>
-        <w:t>phòng</w:t>
+        <w:t xml:space="preserve">Trang Quản </w:t>
+      </w:r>
+      <w:proofErr w:type="spellStart"/>
+      <w:r>
+        <w:t>lý</w:t>
+      </w:r>
+      <w:proofErr w:type="spellEnd"/>
+      <w:r>
+        <w:t xml:space="preserve"> </w:t>
+      </w:r>
+      <w:proofErr w:type="spellStart"/>
+      <w:r>
+        <w:t>Phòng</w:t>
       </w:r>
       <w:proofErr w:type="spellEnd"/>
     </w:p>
@@ -23421,49 +23622,132 @@
           <w:numId w:val="24"/>
         </w:numPr>
         <w:spacing w:after="160" w:line="259" w:lineRule="auto"/>
-      </w:pPr>
-      <w:proofErr w:type="spellStart"/>
-      <w:r>
-        <w:t>Lịch</w:t>
-      </w:r>
-      <w:proofErr w:type="spellEnd"/>
-      <w:r>
-        <w:t xml:space="preserve"> </w:t>
-      </w:r>
-      <w:proofErr w:type="spellStart"/>
-      <w:r>
-        <w:t>theo</w:t>
-      </w:r>
-      <w:proofErr w:type="spellEnd"/>
-      <w:r>
-        <w:t xml:space="preserve"> </w:t>
-      </w:r>
-      <w:proofErr w:type="spellStart"/>
-      <w:r>
-        <w:t>tháng</w:t>
-      </w:r>
-      <w:proofErr w:type="spellEnd"/>
-      <w:r>
-        <w:t xml:space="preserve"> </w:t>
-      </w:r>
-      <w:proofErr w:type="spellStart"/>
-      <w:r>
-        <w:t>của</w:t>
-      </w:r>
-      <w:proofErr w:type="spellEnd"/>
-      <w:r>
-        <w:t xml:space="preserve"> </w:t>
-      </w:r>
-      <w:proofErr w:type="spellStart"/>
-      <w:r>
-        <w:t>từng</w:t>
-      </w:r>
-      <w:proofErr w:type="spellEnd"/>
-      <w:r>
-        <w:t xml:space="preserve"> </w:t>
-      </w:r>
-      <w:proofErr w:type="spellStart"/>
-      <w:r>
+        <w:rPr>
+          <w:highlight w:val="yellow"/>
+        </w:rPr>
+      </w:pPr>
+      <w:r>
+        <w:rPr>
+          <w:highlight w:val="yellow"/>
+        </w:rPr>
+        <w:t xml:space="preserve">Load </w:t>
+      </w:r>
+      <w:proofErr w:type="spellStart"/>
+      <w:r>
+        <w:rPr>
+          <w:highlight w:val="yellow"/>
+        </w:rPr>
+        <w:t>loại</w:t>
+      </w:r>
+      <w:proofErr w:type="spellEnd"/>
+      <w:r>
+        <w:rPr>
+          <w:highlight w:val="yellow"/>
+        </w:rPr>
+        <w:t xml:space="preserve"> </w:t>
+      </w:r>
+      <w:proofErr w:type="spellStart"/>
+      <w:r>
+        <w:rPr>
+          <w:highlight w:val="yellow"/>
+        </w:rPr>
+        <w:t>phòng</w:t>
+      </w:r>
+      <w:proofErr w:type="spellEnd"/>
+    </w:p>
+    <w:p>
+      <w:pPr>
+        <w:pStyle w:val="ListParagraph"/>
+        <w:numPr>
+          <w:ilvl w:val="1"/>
+          <w:numId w:val="24"/>
+        </w:numPr>
+        <w:spacing w:after="160" w:line="259" w:lineRule="auto"/>
+        <w:rPr>
+          <w:highlight w:val="cyan"/>
+        </w:rPr>
+      </w:pPr>
+      <w:proofErr w:type="spellStart"/>
+      <w:r>
+        <w:rPr>
+          <w:highlight w:val="cyan"/>
+        </w:rPr>
+        <w:t>Thêm</w:t>
+      </w:r>
+      <w:proofErr w:type="spellEnd"/>
+      <w:r>
+        <w:rPr>
+          <w:highlight w:val="cyan"/>
+        </w:rPr>
+        <w:t xml:space="preserve"> </w:t>
+      </w:r>
+      <w:proofErr w:type="spellStart"/>
+      <w:r>
+        <w:rPr>
+          <w:highlight w:val="cyan"/>
+        </w:rPr>
+        <w:t>phòng</w:t>
+      </w:r>
+      <w:proofErr w:type="spellEnd"/>
+    </w:p>
+    <w:p>
+      <w:pPr>
+        <w:pStyle w:val="ListParagraph"/>
+        <w:numPr>
+          <w:ilvl w:val="1"/>
+          <w:numId w:val="24"/>
+        </w:numPr>
+        <w:spacing w:after="160" w:line="259" w:lineRule="auto"/>
+        <w:rPr>
+          <w:highlight w:val="cyan"/>
+        </w:rPr>
+      </w:pPr>
+      <w:proofErr w:type="spellStart"/>
+      <w:r>
+        <w:rPr>
+          <w:highlight w:val="cyan"/>
+        </w:rPr>
+        <w:t>Sửa</w:t>
+      </w:r>
+      <w:proofErr w:type="spellEnd"/>
+      <w:r>
+        <w:rPr>
+          <w:highlight w:val="cyan"/>
+        </w:rPr>
+        <w:t xml:space="preserve"> </w:t>
+      </w:r>
+      <w:proofErr w:type="spellStart"/>
+      <w:r>
+        <w:rPr>
+          <w:highlight w:val="cyan"/>
+        </w:rPr>
+        <w:t>phòng</w:t>
+      </w:r>
+      <w:proofErr w:type="spellEnd"/>
+    </w:p>
+    <w:p>
+      <w:pPr>
+        <w:pStyle w:val="ListParagraph"/>
+        <w:numPr>
+          <w:ilvl w:val="1"/>
+          <w:numId w:val="24"/>
+        </w:numPr>
+        <w:spacing w:after="160" w:line="259" w:lineRule="auto"/>
+        <w:rPr>
+          <w:highlight w:val="cyan"/>
+        </w:rPr>
+      </w:pPr>
+      <w:r>
+        <w:rPr>
+          <w:highlight w:val="cyan"/>
+        </w:rPr>
+        <w:t xml:space="preserve">Load </w:t>
+      </w:r>
+      <w:proofErr w:type="spellStart"/>
+      <w:r>
+        <w:rPr>
+          <w:highlight w:val="cyan"/>
+        </w:rPr>
         <w:t>phòng</w:t>
       </w:r>
       <w:proofErr w:type="spellEnd"/>
@@ -23476,20 +23760,35 @@
           <w:numId w:val="24"/>
         </w:numPr>
         <w:spacing w:after="160" w:line="259" w:lineRule="auto"/>
-      </w:pPr>
-      <w:r>
-        <w:t xml:space="preserve">Trang Quản </w:t>
-      </w:r>
-      <w:proofErr w:type="spellStart"/>
-      <w:r>
-        <w:t>lý</w:t>
-      </w:r>
-      <w:proofErr w:type="spellEnd"/>
-      <w:r>
-        <w:t xml:space="preserve"> </w:t>
-      </w:r>
-      <w:proofErr w:type="spellStart"/>
-      <w:r>
+        <w:rPr>
+          <w:highlight w:val="yellow"/>
+        </w:rPr>
+      </w:pPr>
+      <w:r>
+        <w:rPr>
+          <w:highlight w:val="yellow"/>
+        </w:rPr>
+        <w:t xml:space="preserve">Trang </w:t>
+      </w:r>
+      <w:proofErr w:type="spellStart"/>
+      <w:r>
+        <w:rPr>
+          <w:highlight w:val="yellow"/>
+        </w:rPr>
+        <w:t>Loại</w:t>
+      </w:r>
+      <w:proofErr w:type="spellEnd"/>
+      <w:r>
+        <w:rPr>
+          <w:highlight w:val="yellow"/>
+        </w:rPr>
+        <w:t xml:space="preserve"> </w:t>
+      </w:r>
+      <w:proofErr w:type="spellStart"/>
+      <w:r>
+        <w:rPr>
+          <w:highlight w:val="yellow"/>
+        </w:rPr>
         <w:t>Phòng</w:t>
       </w:r>
       <w:proofErr w:type="spellEnd"/>
@@ -23506,18 +23805,26 @@
           <w:highlight w:val="yellow"/>
         </w:rPr>
       </w:pPr>
+      <w:proofErr w:type="spellStart"/>
       <w:r>
         <w:rPr>
           <w:highlight w:val="yellow"/>
         </w:rPr>
-        <w:t xml:space="preserve">Load </w:t>
-      </w:r>
-      <w:proofErr w:type="spellStart"/>
+        <w:t>Thêm</w:t>
+      </w:r>
+      <w:proofErr w:type="spellEnd"/>
       <w:r>
         <w:rPr>
           <w:highlight w:val="yellow"/>
         </w:rPr>
-        <w:t>loại</w:t>
+        <w:t xml:space="preserve"> </w:t>
+      </w:r>
+      <w:proofErr w:type="spellStart"/>
+      <w:r>
+        <w:rPr>
+          <w:highlight w:val="yellow"/>
+        </w:rPr>
+        <w:t>Loại</w:t>
       </w:r>
       <w:proofErr w:type="spellEnd"/>
       <w:r>
@@ -23544,27 +23851,41 @@
         </w:numPr>
         <w:spacing w:after="160" w:line="259" w:lineRule="auto"/>
         <w:rPr>
-          <w:highlight w:val="cyan"/>
-        </w:rPr>
-      </w:pPr>
-      <w:proofErr w:type="spellStart"/>
-      <w:r>
-        <w:rPr>
-          <w:highlight w:val="cyan"/>
-        </w:rPr>
-        <w:t>Thêm</w:t>
-      </w:r>
-      <w:proofErr w:type="spellEnd"/>
-      <w:r>
-        <w:rPr>
-          <w:highlight w:val="cyan"/>
-        </w:rPr>
-        <w:t xml:space="preserve"> </w:t>
-      </w:r>
-      <w:proofErr w:type="spellStart"/>
-      <w:r>
-        <w:rPr>
-          <w:highlight w:val="cyan"/>
+          <w:highlight w:val="yellow"/>
+        </w:rPr>
+      </w:pPr>
+      <w:proofErr w:type="spellStart"/>
+      <w:r>
+        <w:rPr>
+          <w:highlight w:val="yellow"/>
+        </w:rPr>
+        <w:t>Sửa</w:t>
+      </w:r>
+      <w:proofErr w:type="spellEnd"/>
+      <w:r>
+        <w:rPr>
+          <w:highlight w:val="yellow"/>
+        </w:rPr>
+        <w:t xml:space="preserve"> </w:t>
+      </w:r>
+      <w:proofErr w:type="spellStart"/>
+      <w:r>
+        <w:rPr>
+          <w:highlight w:val="yellow"/>
+        </w:rPr>
+        <w:t>Loại</w:t>
+      </w:r>
+      <w:proofErr w:type="spellEnd"/>
+      <w:r>
+        <w:rPr>
+          <w:highlight w:val="yellow"/>
+        </w:rPr>
+        <w:t xml:space="preserve"> </w:t>
+      </w:r>
+      <w:proofErr w:type="spellStart"/>
+      <w:r>
+        <w:rPr>
+          <w:highlight w:val="yellow"/>
         </w:rPr>
         <w:t>phòng</w:t>
       </w:r>
@@ -23579,31 +23900,51 @@
         </w:numPr>
         <w:spacing w:after="160" w:line="259" w:lineRule="auto"/>
         <w:rPr>
-          <w:highlight w:val="cyan"/>
-        </w:rPr>
-      </w:pPr>
-      <w:proofErr w:type="spellStart"/>
-      <w:r>
-        <w:rPr>
-          <w:highlight w:val="cyan"/>
-        </w:rPr>
-        <w:t>Sửa</w:t>
-      </w:r>
-      <w:proofErr w:type="spellEnd"/>
-      <w:r>
-        <w:rPr>
-          <w:highlight w:val="cyan"/>
-        </w:rPr>
-        <w:t xml:space="preserve"> </w:t>
-      </w:r>
-      <w:proofErr w:type="spellStart"/>
-      <w:r>
-        <w:rPr>
-          <w:highlight w:val="cyan"/>
+          <w:highlight w:val="yellow"/>
+        </w:rPr>
+      </w:pPr>
+      <w:proofErr w:type="spellStart"/>
+      <w:r>
+        <w:rPr>
+          <w:highlight w:val="yellow"/>
+        </w:rPr>
+        <w:t>Xoá</w:t>
+      </w:r>
+      <w:proofErr w:type="spellEnd"/>
+      <w:r>
+        <w:rPr>
+          <w:highlight w:val="yellow"/>
+        </w:rPr>
+        <w:t xml:space="preserve"> </w:t>
+      </w:r>
+      <w:proofErr w:type="spellStart"/>
+      <w:r>
+        <w:rPr>
+          <w:highlight w:val="yellow"/>
+        </w:rPr>
+        <w:t>Loại</w:t>
+      </w:r>
+      <w:proofErr w:type="spellEnd"/>
+      <w:r>
+        <w:rPr>
+          <w:highlight w:val="yellow"/>
+        </w:rPr>
+        <w:t xml:space="preserve"> </w:t>
+      </w:r>
+      <w:proofErr w:type="spellStart"/>
+      <w:r>
+        <w:rPr>
+          <w:highlight w:val="yellow"/>
         </w:rPr>
         <w:t>phòng</w:t>
       </w:r>
       <w:proofErr w:type="spellEnd"/>
+      <w:r>
+        <w:rPr>
+          <w:highlight w:val="yellow"/>
+        </w:rPr>
+        <w:t>(X)</w:t>
+      </w:r>
     </w:p>
     <w:p>
       <w:pPr>
@@ -23614,19 +23955,33 @@
         </w:numPr>
         <w:spacing w:after="160" w:line="259" w:lineRule="auto"/>
         <w:rPr>
-          <w:highlight w:val="cyan"/>
-        </w:rPr>
-      </w:pPr>
-      <w:r>
-        <w:rPr>
-          <w:highlight w:val="cyan"/>
+          <w:highlight w:val="yellow"/>
+        </w:rPr>
+      </w:pPr>
+      <w:r>
+        <w:rPr>
+          <w:highlight w:val="yellow"/>
         </w:rPr>
         <w:t xml:space="preserve">Load </w:t>
       </w:r>
       <w:proofErr w:type="spellStart"/>
       <w:r>
         <w:rPr>
-          <w:highlight w:val="cyan"/>
+          <w:highlight w:val="yellow"/>
+        </w:rPr>
+        <w:t>loại</w:t>
+      </w:r>
+      <w:proofErr w:type="spellEnd"/>
+      <w:r>
+        <w:rPr>
+          <w:highlight w:val="yellow"/>
+        </w:rPr>
+        <w:t xml:space="preserve"> </w:t>
+      </w:r>
+      <w:proofErr w:type="spellStart"/>
+      <w:r>
+        <w:rPr>
+          <w:highlight w:val="yellow"/>
         </w:rPr>
         <w:t>phòng</w:t>
       </w:r>
@@ -23640,36 +23995,21 @@
           <w:numId w:val="24"/>
         </w:numPr>
         <w:spacing w:after="160" w:line="259" w:lineRule="auto"/>
-        <w:rPr>
-          <w:highlight w:val="yellow"/>
-        </w:rPr>
-      </w:pPr>
-      <w:r>
-        <w:rPr>
-          <w:highlight w:val="yellow"/>
-        </w:rPr>
-        <w:t xml:space="preserve">Trang </w:t>
-      </w:r>
-      <w:proofErr w:type="spellStart"/>
-      <w:r>
-        <w:rPr>
-          <w:highlight w:val="yellow"/>
-        </w:rPr>
-        <w:t>Loại</w:t>
-      </w:r>
-      <w:proofErr w:type="spellEnd"/>
-      <w:r>
-        <w:rPr>
-          <w:highlight w:val="yellow"/>
-        </w:rPr>
-        <w:t xml:space="preserve"> </w:t>
-      </w:r>
-      <w:proofErr w:type="spellStart"/>
-      <w:r>
-        <w:rPr>
-          <w:highlight w:val="yellow"/>
-        </w:rPr>
-        <w:t>Phòng</w:t>
+      </w:pPr>
+      <w:r>
+        <w:t xml:space="preserve">Trang Quản </w:t>
+      </w:r>
+      <w:proofErr w:type="spellStart"/>
+      <w:r>
+        <w:t>lý</w:t>
+      </w:r>
+      <w:proofErr w:type="spellEnd"/>
+      <w:r>
+        <w:t xml:space="preserve"> </w:t>
+      </w:r>
+      <w:proofErr w:type="spellStart"/>
+      <w:r>
+        <w:t>Giá</w:t>
       </w:r>
       <w:proofErr w:type="spellEnd"/>
     </w:p>
@@ -23681,16 +24021,19 @@
           <w:numId w:val="24"/>
         </w:numPr>
         <w:spacing w:after="160" w:line="259" w:lineRule="auto"/>
+      </w:pPr>
+      <w:r>
         <w:rPr>
           <w:highlight w:val="yellow"/>
         </w:rPr>
-      </w:pPr>
+        <w:t xml:space="preserve">Load </w:t>
+      </w:r>
       <w:proofErr w:type="spellStart"/>
       <w:r>
         <w:rPr>
           <w:highlight w:val="yellow"/>
         </w:rPr>
-        <w:t>Thêm</w:t>
+        <w:t>loại</w:t>
       </w:r>
       <w:proofErr w:type="spellEnd"/>
       <w:r>
@@ -23704,23 +24047,12 @@
         <w:rPr>
           <w:highlight w:val="yellow"/>
         </w:rPr>
-        <w:t>Loại</w:t>
-      </w:r>
-      <w:proofErr w:type="spellEnd"/>
-      <w:r>
-        <w:rPr>
-          <w:highlight w:val="yellow"/>
-        </w:rPr>
-        <w:t xml:space="preserve"> </w:t>
-      </w:r>
-      <w:proofErr w:type="spellStart"/>
-      <w:r>
-        <w:rPr>
-          <w:highlight w:val="yellow"/>
-        </w:rPr>
         <w:t>phòng</w:t>
       </w:r>
       <w:proofErr w:type="spellEnd"/>
+      <w:r>
+        <w:t xml:space="preserve"> </w:t>
+      </w:r>
     </w:p>
     <w:p>
       <w:pPr>
@@ -23731,45 +24063,101 @@
         </w:numPr>
         <w:spacing w:after="160" w:line="259" w:lineRule="auto"/>
         <w:rPr>
-          <w:highlight w:val="yellow"/>
-        </w:rPr>
-      </w:pPr>
-      <w:proofErr w:type="spellStart"/>
-      <w:r>
-        <w:rPr>
-          <w:highlight w:val="yellow"/>
-        </w:rPr>
-        <w:t>Sửa</w:t>
-      </w:r>
-      <w:proofErr w:type="spellEnd"/>
-      <w:r>
-        <w:rPr>
-          <w:highlight w:val="yellow"/>
-        </w:rPr>
-        <w:t xml:space="preserve"> </w:t>
-      </w:r>
-      <w:proofErr w:type="spellStart"/>
-      <w:r>
-        <w:rPr>
-          <w:highlight w:val="yellow"/>
-        </w:rPr>
-        <w:t>Loại</w:t>
-      </w:r>
-      <w:proofErr w:type="spellEnd"/>
-      <w:r>
-        <w:rPr>
-          <w:highlight w:val="yellow"/>
-        </w:rPr>
-        <w:t xml:space="preserve"> </w:t>
-      </w:r>
-      <w:proofErr w:type="spellStart"/>
-      <w:r>
-        <w:rPr>
-          <w:highlight w:val="yellow"/>
-        </w:rPr>
-        <w:t>phòng</w:t>
-      </w:r>
-      <w:proofErr w:type="spellEnd"/>
+          <w:highlight w:val="cyan"/>
+        </w:rPr>
+      </w:pPr>
+      <w:r>
+        <w:rPr>
+          <w:highlight w:val="cyan"/>
+        </w:rPr>
+        <w:t xml:space="preserve">Load </w:t>
+      </w:r>
+      <w:proofErr w:type="spellStart"/>
+      <w:r>
+        <w:rPr>
+          <w:highlight w:val="cyan"/>
+        </w:rPr>
+        <w:t>giá</w:t>
+      </w:r>
+      <w:proofErr w:type="spellEnd"/>
+      <w:r>
+        <w:rPr>
+          <w:highlight w:val="cyan"/>
+        </w:rPr>
+        <w:t xml:space="preserve"> </w:t>
+      </w:r>
+      <w:proofErr w:type="spellStart"/>
+      <w:r>
+        <w:rPr>
+          <w:highlight w:val="cyan"/>
+        </w:rPr>
+        <w:t>theo</w:t>
+      </w:r>
+      <w:proofErr w:type="spellEnd"/>
+      <w:r>
+        <w:rPr>
+          <w:highlight w:val="cyan"/>
+        </w:rPr>
+        <w:t xml:space="preserve"> </w:t>
+      </w:r>
+      <w:proofErr w:type="spellStart"/>
+      <w:proofErr w:type="gramStart"/>
+      <w:r>
+        <w:rPr>
+          <w:highlight w:val="cyan"/>
+        </w:rPr>
+        <w:t>ngày</w:t>
+      </w:r>
+      <w:proofErr w:type="spellEnd"/>
+      <w:r>
+        <w:rPr>
+          <w:highlight w:val="cyan"/>
+        </w:rPr>
+        <w:t>(</w:t>
+      </w:r>
+      <w:proofErr w:type="spellStart"/>
+      <w:proofErr w:type="gramEnd"/>
+      <w:r>
+        <w:rPr>
+          <w:highlight w:val="cyan"/>
+        </w:rPr>
+        <w:t>giá</w:t>
+      </w:r>
+      <w:proofErr w:type="spellEnd"/>
+      <w:r>
+        <w:rPr>
+          <w:highlight w:val="cyan"/>
+        </w:rPr>
+        <w:t xml:space="preserve"> </w:t>
+      </w:r>
+      <w:proofErr w:type="spellStart"/>
+      <w:r>
+        <w:rPr>
+          <w:highlight w:val="cyan"/>
+        </w:rPr>
+        <w:t>mặc</w:t>
+      </w:r>
+      <w:proofErr w:type="spellEnd"/>
+      <w:r>
+        <w:rPr>
+          <w:highlight w:val="cyan"/>
+        </w:rPr>
+        <w:t xml:space="preserve"> </w:t>
+      </w:r>
+      <w:proofErr w:type="spellStart"/>
+      <w:r>
+        <w:rPr>
+          <w:highlight w:val="cyan"/>
+        </w:rPr>
+        <w:t>định</w:t>
+      </w:r>
+      <w:proofErr w:type="spellEnd"/>
+      <w:r>
+        <w:rPr>
+          <w:highlight w:val="cyan"/>
+        </w:rPr>
+        <w:t>)</w:t>
+      </w:r>
     </w:p>
     <w:p>
       <w:pPr>
@@ -23780,51 +24168,51 @@
         </w:numPr>
         <w:spacing w:after="160" w:line="259" w:lineRule="auto"/>
         <w:rPr>
-          <w:highlight w:val="yellow"/>
-        </w:rPr>
-      </w:pPr>
-      <w:proofErr w:type="spellStart"/>
-      <w:r>
-        <w:rPr>
-          <w:highlight w:val="yellow"/>
-        </w:rPr>
-        <w:t>Xoá</w:t>
-      </w:r>
-      <w:proofErr w:type="spellEnd"/>
-      <w:r>
-        <w:rPr>
-          <w:highlight w:val="yellow"/>
-        </w:rPr>
-        <w:t xml:space="preserve"> </w:t>
-      </w:r>
-      <w:proofErr w:type="spellStart"/>
-      <w:r>
-        <w:rPr>
-          <w:highlight w:val="yellow"/>
-        </w:rPr>
-        <w:t>Loại</w:t>
-      </w:r>
-      <w:proofErr w:type="spellEnd"/>
-      <w:r>
-        <w:rPr>
-          <w:highlight w:val="yellow"/>
-        </w:rPr>
-        <w:t xml:space="preserve"> </w:t>
-      </w:r>
-      <w:proofErr w:type="spellStart"/>
-      <w:r>
-        <w:rPr>
-          <w:highlight w:val="yellow"/>
-        </w:rPr>
-        <w:t>phòng</w:t>
-      </w:r>
-      <w:proofErr w:type="spellEnd"/>
-      <w:r>
-        <w:rPr>
-          <w:highlight w:val="yellow"/>
-        </w:rPr>
-        <w:t>(X)</w:t>
-      </w:r>
+          <w:highlight w:val="cyan"/>
+        </w:rPr>
+      </w:pPr>
+      <w:r>
+        <w:rPr>
+          <w:highlight w:val="cyan"/>
+        </w:rPr>
+        <w:t xml:space="preserve">Load </w:t>
+      </w:r>
+      <w:proofErr w:type="spellStart"/>
+      <w:r>
+        <w:rPr>
+          <w:highlight w:val="cyan"/>
+        </w:rPr>
+        <w:t>giá</w:t>
+      </w:r>
+      <w:proofErr w:type="spellEnd"/>
+      <w:r>
+        <w:rPr>
+          <w:highlight w:val="cyan"/>
+        </w:rPr>
+        <w:t xml:space="preserve"> </w:t>
+      </w:r>
+      <w:proofErr w:type="spellStart"/>
+      <w:r>
+        <w:rPr>
+          <w:highlight w:val="cyan"/>
+        </w:rPr>
+        <w:t>theo</w:t>
+      </w:r>
+      <w:proofErr w:type="spellEnd"/>
+      <w:r>
+        <w:rPr>
+          <w:highlight w:val="cyan"/>
+        </w:rPr>
+        <w:t xml:space="preserve"> </w:t>
+      </w:r>
+      <w:proofErr w:type="spellStart"/>
+      <w:r>
+        <w:rPr>
+          <w:highlight w:val="cyan"/>
+        </w:rPr>
+        <w:t>mùa</w:t>
+      </w:r>
+      <w:proofErr w:type="spellEnd"/>
     </w:p>
     <w:p>
       <w:pPr>
@@ -23835,35 +24223,418 @@
         </w:numPr>
         <w:spacing w:after="160" w:line="259" w:lineRule="auto"/>
         <w:rPr>
-          <w:highlight w:val="yellow"/>
-        </w:rPr>
-      </w:pPr>
-      <w:r>
-        <w:rPr>
-          <w:highlight w:val="yellow"/>
-        </w:rPr>
-        <w:t xml:space="preserve">Load </w:t>
-      </w:r>
-      <w:proofErr w:type="spellStart"/>
-      <w:r>
-        <w:rPr>
-          <w:highlight w:val="yellow"/>
-        </w:rPr>
-        <w:t>loại</w:t>
-      </w:r>
-      <w:proofErr w:type="spellEnd"/>
-      <w:r>
-        <w:rPr>
-          <w:highlight w:val="yellow"/>
-        </w:rPr>
-        <w:t xml:space="preserve"> </w:t>
-      </w:r>
-      <w:proofErr w:type="spellStart"/>
-      <w:r>
-        <w:rPr>
-          <w:highlight w:val="yellow"/>
-        </w:rPr>
-        <w:t>phòng</w:t>
+          <w:highlight w:val="cyan"/>
+        </w:rPr>
+      </w:pPr>
+      <w:proofErr w:type="spellStart"/>
+      <w:r>
+        <w:rPr>
+          <w:highlight w:val="cyan"/>
+        </w:rPr>
+        <w:t>Sửa</w:t>
+      </w:r>
+      <w:proofErr w:type="spellEnd"/>
+      <w:r>
+        <w:rPr>
+          <w:highlight w:val="cyan"/>
+        </w:rPr>
+        <w:t xml:space="preserve"> </w:t>
+      </w:r>
+      <w:proofErr w:type="spellStart"/>
+      <w:r>
+        <w:rPr>
+          <w:highlight w:val="cyan"/>
+        </w:rPr>
+        <w:t>giá</w:t>
+      </w:r>
+      <w:proofErr w:type="spellEnd"/>
+      <w:r>
+        <w:rPr>
+          <w:highlight w:val="cyan"/>
+        </w:rPr>
+        <w:t xml:space="preserve"> </w:t>
+      </w:r>
+      <w:proofErr w:type="spellStart"/>
+      <w:r>
+        <w:rPr>
+          <w:highlight w:val="cyan"/>
+        </w:rPr>
+        <w:t>theo</w:t>
+      </w:r>
+      <w:proofErr w:type="spellEnd"/>
+      <w:r>
+        <w:rPr>
+          <w:highlight w:val="cyan"/>
+        </w:rPr>
+        <w:t xml:space="preserve"> </w:t>
+      </w:r>
+      <w:proofErr w:type="spellStart"/>
+      <w:proofErr w:type="gramStart"/>
+      <w:r>
+        <w:rPr>
+          <w:highlight w:val="cyan"/>
+        </w:rPr>
+        <w:t>ngày</w:t>
+      </w:r>
+      <w:proofErr w:type="spellEnd"/>
+      <w:r>
+        <w:rPr>
+          <w:highlight w:val="cyan"/>
+        </w:rPr>
+        <w:t>(</w:t>
+      </w:r>
+      <w:proofErr w:type="spellStart"/>
+      <w:proofErr w:type="gramEnd"/>
+      <w:r>
+        <w:rPr>
+          <w:highlight w:val="cyan"/>
+        </w:rPr>
+        <w:t>Bỏ</w:t>
+      </w:r>
+      <w:proofErr w:type="spellEnd"/>
+      <w:r>
+        <w:rPr>
+          <w:highlight w:val="cyan"/>
+        </w:rPr>
+        <w:t xml:space="preserve"> </w:t>
+      </w:r>
+      <w:proofErr w:type="spellStart"/>
+      <w:r>
+        <w:rPr>
+          <w:highlight w:val="cyan"/>
+        </w:rPr>
+        <w:t>chức</w:t>
+      </w:r>
+      <w:proofErr w:type="spellEnd"/>
+      <w:r>
+        <w:rPr>
+          <w:highlight w:val="cyan"/>
+        </w:rPr>
+        <w:t xml:space="preserve"> </w:t>
+      </w:r>
+      <w:proofErr w:type="spellStart"/>
+      <w:r>
+        <w:rPr>
+          <w:highlight w:val="cyan"/>
+        </w:rPr>
+        <w:t>năng</w:t>
+      </w:r>
+      <w:proofErr w:type="spellEnd"/>
+      <w:r>
+        <w:rPr>
+          <w:highlight w:val="cyan"/>
+        </w:rPr>
+        <w:t xml:space="preserve"> </w:t>
+      </w:r>
+      <w:proofErr w:type="spellStart"/>
+      <w:proofErr w:type="gramStart"/>
+      <w:r>
+        <w:rPr>
+          <w:highlight w:val="cyan"/>
+        </w:rPr>
+        <w:t>thêm,xoá</w:t>
+      </w:r>
+      <w:proofErr w:type="spellEnd"/>
+      <w:proofErr w:type="gramEnd"/>
+      <w:r>
+        <w:rPr>
+          <w:highlight w:val="cyan"/>
+        </w:rPr>
+        <w:t xml:space="preserve"> </w:t>
+      </w:r>
+      <w:proofErr w:type="spellStart"/>
+      <w:r>
+        <w:rPr>
+          <w:highlight w:val="cyan"/>
+        </w:rPr>
+        <w:t>giá</w:t>
+      </w:r>
+      <w:proofErr w:type="spellEnd"/>
+      <w:r>
+        <w:rPr>
+          <w:highlight w:val="cyan"/>
+        </w:rPr>
+        <w:t xml:space="preserve"> </w:t>
+      </w:r>
+      <w:proofErr w:type="spellStart"/>
+      <w:r>
+        <w:rPr>
+          <w:highlight w:val="cyan"/>
+        </w:rPr>
+        <w:t>theo</w:t>
+      </w:r>
+      <w:proofErr w:type="spellEnd"/>
+      <w:r>
+        <w:rPr>
+          <w:highlight w:val="cyan"/>
+        </w:rPr>
+        <w:t xml:space="preserve"> </w:t>
+      </w:r>
+      <w:proofErr w:type="spellStart"/>
+      <w:r>
+        <w:rPr>
+          <w:highlight w:val="cyan"/>
+        </w:rPr>
+        <w:t>ngày</w:t>
+      </w:r>
+      <w:proofErr w:type="spellEnd"/>
+      <w:r>
+        <w:rPr>
+          <w:highlight w:val="cyan"/>
+        </w:rPr>
+        <w:t xml:space="preserve"> </w:t>
+      </w:r>
+      <w:proofErr w:type="spellStart"/>
+      <w:r>
+        <w:rPr>
+          <w:highlight w:val="cyan"/>
+        </w:rPr>
+        <w:t>trên</w:t>
+      </w:r>
+      <w:proofErr w:type="spellEnd"/>
+      <w:r>
+        <w:rPr>
+          <w:highlight w:val="cyan"/>
+        </w:rPr>
+        <w:t xml:space="preserve"> web)</w:t>
+      </w:r>
+    </w:p>
+    <w:p>
+      <w:pPr>
+        <w:pStyle w:val="ListParagraph"/>
+        <w:numPr>
+          <w:ilvl w:val="1"/>
+          <w:numId w:val="24"/>
+        </w:numPr>
+        <w:spacing w:after="160" w:line="259" w:lineRule="auto"/>
+        <w:rPr>
+          <w:highlight w:val="cyan"/>
+        </w:rPr>
+      </w:pPr>
+      <w:proofErr w:type="spellStart"/>
+      <w:r>
+        <w:rPr>
+          <w:highlight w:val="cyan"/>
+        </w:rPr>
+        <w:t>Thêm</w:t>
+      </w:r>
+      <w:proofErr w:type="spellEnd"/>
+      <w:r>
+        <w:rPr>
+          <w:highlight w:val="cyan"/>
+        </w:rPr>
+        <w:t xml:space="preserve"> </w:t>
+      </w:r>
+      <w:proofErr w:type="spellStart"/>
+      <w:r>
+        <w:rPr>
+          <w:highlight w:val="cyan"/>
+        </w:rPr>
+        <w:t>giá</w:t>
+      </w:r>
+      <w:proofErr w:type="spellEnd"/>
+      <w:r>
+        <w:rPr>
+          <w:highlight w:val="cyan"/>
+        </w:rPr>
+        <w:t xml:space="preserve"> </w:t>
+      </w:r>
+      <w:proofErr w:type="spellStart"/>
+      <w:r>
+        <w:rPr>
+          <w:highlight w:val="cyan"/>
+        </w:rPr>
+        <w:t>theo</w:t>
+      </w:r>
+      <w:proofErr w:type="spellEnd"/>
+      <w:r>
+        <w:rPr>
+          <w:highlight w:val="cyan"/>
+        </w:rPr>
+        <w:t xml:space="preserve"> </w:t>
+      </w:r>
+      <w:proofErr w:type="spellStart"/>
+      <w:proofErr w:type="gramStart"/>
+      <w:r>
+        <w:rPr>
+          <w:highlight w:val="cyan"/>
+        </w:rPr>
+        <w:t>mùa</w:t>
+      </w:r>
+      <w:proofErr w:type="spellEnd"/>
+      <w:r>
+        <w:rPr>
+          <w:highlight w:val="cyan"/>
+        </w:rPr>
+        <w:t>(</w:t>
+      </w:r>
+      <w:proofErr w:type="spellStart"/>
+      <w:proofErr w:type="gramEnd"/>
+      <w:r>
+        <w:rPr>
+          <w:highlight w:val="cyan"/>
+        </w:rPr>
+        <w:t>từ</w:t>
+      </w:r>
+      <w:proofErr w:type="spellEnd"/>
+      <w:r>
+        <w:rPr>
+          <w:highlight w:val="cyan"/>
+        </w:rPr>
+        <w:t xml:space="preserve"> </w:t>
+      </w:r>
+      <w:proofErr w:type="spellStart"/>
+      <w:r>
+        <w:rPr>
+          <w:highlight w:val="cyan"/>
+        </w:rPr>
+        <w:t>ngày-đến</w:t>
+      </w:r>
+      <w:proofErr w:type="spellEnd"/>
+      <w:r>
+        <w:rPr>
+          <w:highlight w:val="cyan"/>
+        </w:rPr>
+        <w:t xml:space="preserve"> </w:t>
+      </w:r>
+      <w:proofErr w:type="spellStart"/>
+      <w:r>
+        <w:rPr>
+          <w:highlight w:val="cyan"/>
+        </w:rPr>
+        <w:t>ngày</w:t>
+      </w:r>
+      <w:proofErr w:type="spellEnd"/>
+      <w:r>
+        <w:rPr>
+          <w:highlight w:val="cyan"/>
+        </w:rPr>
+        <w:t>)</w:t>
+      </w:r>
+    </w:p>
+    <w:p>
+      <w:pPr>
+        <w:pStyle w:val="ListParagraph"/>
+        <w:numPr>
+          <w:ilvl w:val="1"/>
+          <w:numId w:val="24"/>
+        </w:numPr>
+        <w:spacing w:after="160" w:line="259" w:lineRule="auto"/>
+        <w:rPr>
+          <w:highlight w:val="cyan"/>
+        </w:rPr>
+      </w:pPr>
+      <w:proofErr w:type="spellStart"/>
+      <w:r>
+        <w:rPr>
+          <w:highlight w:val="cyan"/>
+        </w:rPr>
+        <w:t>Sửa</w:t>
+      </w:r>
+      <w:proofErr w:type="spellEnd"/>
+      <w:r>
+        <w:rPr>
+          <w:highlight w:val="cyan"/>
+        </w:rPr>
+        <w:t xml:space="preserve"> </w:t>
+      </w:r>
+      <w:proofErr w:type="spellStart"/>
+      <w:r>
+        <w:rPr>
+          <w:highlight w:val="cyan"/>
+        </w:rPr>
+        <w:t>giá</w:t>
+      </w:r>
+      <w:proofErr w:type="spellEnd"/>
+      <w:r>
+        <w:rPr>
+          <w:highlight w:val="cyan"/>
+        </w:rPr>
+        <w:t xml:space="preserve"> </w:t>
+      </w:r>
+      <w:proofErr w:type="spellStart"/>
+      <w:r>
+        <w:rPr>
+          <w:highlight w:val="cyan"/>
+        </w:rPr>
+        <w:t>theo</w:t>
+      </w:r>
+      <w:proofErr w:type="spellEnd"/>
+      <w:r>
+        <w:rPr>
+          <w:highlight w:val="cyan"/>
+        </w:rPr>
+        <w:t xml:space="preserve"> </w:t>
+      </w:r>
+      <w:proofErr w:type="spellStart"/>
+      <w:r>
+        <w:rPr>
+          <w:highlight w:val="cyan"/>
+        </w:rPr>
+        <w:t>mùa</w:t>
+      </w:r>
+      <w:proofErr w:type="spellEnd"/>
+    </w:p>
+    <w:p>
+      <w:pPr>
+        <w:pStyle w:val="ListParagraph"/>
+        <w:numPr>
+          <w:ilvl w:val="1"/>
+          <w:numId w:val="24"/>
+        </w:numPr>
+        <w:spacing w:after="160" w:line="259" w:lineRule="auto"/>
+        <w:rPr>
+          <w:highlight w:val="cyan"/>
+        </w:rPr>
+      </w:pPr>
+      <w:proofErr w:type="spellStart"/>
+      <w:r>
+        <w:rPr>
+          <w:highlight w:val="cyan"/>
+        </w:rPr>
+        <w:t>Xoá</w:t>
+      </w:r>
+      <w:proofErr w:type="spellEnd"/>
+      <w:r>
+        <w:rPr>
+          <w:highlight w:val="cyan"/>
+        </w:rPr>
+        <w:t xml:space="preserve"> </w:t>
+      </w:r>
+      <w:proofErr w:type="spellStart"/>
+      <w:r>
+        <w:rPr>
+          <w:highlight w:val="cyan"/>
+        </w:rPr>
+        <w:t>giá</w:t>
+      </w:r>
+      <w:proofErr w:type="spellEnd"/>
+      <w:r>
+        <w:rPr>
+          <w:highlight w:val="cyan"/>
+        </w:rPr>
+        <w:t xml:space="preserve"> </w:t>
+      </w:r>
+      <w:proofErr w:type="spellStart"/>
+      <w:r>
+        <w:rPr>
+          <w:highlight w:val="cyan"/>
+        </w:rPr>
+        <w:t>theo</w:t>
+      </w:r>
+      <w:proofErr w:type="spellEnd"/>
+      <w:r>
+        <w:rPr>
+          <w:highlight w:val="cyan"/>
+        </w:rPr>
+        <w:t xml:space="preserve"> </w:t>
+      </w:r>
+      <w:proofErr w:type="spellStart"/>
+      <w:r>
+        <w:rPr>
+          <w:highlight w:val="cyan"/>
+        </w:rPr>
+        <w:t>mùa</w:t>
       </w:r>
       <w:proofErr w:type="spellEnd"/>
     </w:p>
@@ -23877,19 +24648,19 @@
         <w:spacing w:after="160" w:line="259" w:lineRule="auto"/>
       </w:pPr>
       <w:r>
-        <w:t xml:space="preserve">Trang Quản </w:t>
-      </w:r>
-      <w:proofErr w:type="spellStart"/>
-      <w:r>
-        <w:t>lý</w:t>
-      </w:r>
-      <w:proofErr w:type="spellEnd"/>
-      <w:r>
-        <w:t xml:space="preserve"> </w:t>
-      </w:r>
-      <w:proofErr w:type="spellStart"/>
-      <w:r>
-        <w:t>Giá</w:t>
+        <w:t xml:space="preserve">Trang </w:t>
+      </w:r>
+      <w:proofErr w:type="spellStart"/>
+      <w:r>
+        <w:t>Đặt</w:t>
+      </w:r>
+      <w:proofErr w:type="spellEnd"/>
+      <w:r>
+        <w:t xml:space="preserve"> </w:t>
+      </w:r>
+      <w:proofErr w:type="spellStart"/>
+      <w:r>
+        <w:t>phòng</w:t>
       </w:r>
       <w:proofErr w:type="spellEnd"/>
     </w:p>
@@ -23901,60 +24672,38 @@
           <w:numId w:val="24"/>
         </w:numPr>
         <w:spacing w:after="160" w:line="259" w:lineRule="auto"/>
-      </w:pPr>
-      <w:r>
+        <w:rPr>
+          <w:highlight w:val="yellow"/>
+        </w:rPr>
+      </w:pPr>
+      <w:r>
+        <w:rPr>
+          <w:highlight w:val="yellow"/>
+        </w:rPr>
         <w:t xml:space="preserve">Load </w:t>
       </w:r>
       <w:proofErr w:type="spellStart"/>
       <w:r>
-        <w:t>giá</w:t>
-      </w:r>
-      <w:proofErr w:type="spellEnd"/>
-      <w:r>
-        <w:t xml:space="preserve"> </w:t>
-      </w:r>
-      <w:proofErr w:type="spellStart"/>
-      <w:r>
-        <w:t>theo</w:t>
-      </w:r>
-      <w:proofErr w:type="spellEnd"/>
-      <w:r>
-        <w:t xml:space="preserve"> </w:t>
-      </w:r>
-      <w:proofErr w:type="spellStart"/>
-      <w:proofErr w:type="gramStart"/>
-      <w:r>
-        <w:t>ngày</w:t>
-      </w:r>
-      <w:proofErr w:type="spellEnd"/>
-      <w:r>
-        <w:t>(</w:t>
-      </w:r>
-      <w:proofErr w:type="spellStart"/>
-      <w:proofErr w:type="gramEnd"/>
-      <w:r>
-        <w:t>giá</w:t>
-      </w:r>
-      <w:proofErr w:type="spellEnd"/>
-      <w:r>
-        <w:t xml:space="preserve"> </w:t>
-      </w:r>
-      <w:proofErr w:type="spellStart"/>
-      <w:r>
-        <w:t>mặc</w:t>
-      </w:r>
-      <w:proofErr w:type="spellEnd"/>
-      <w:r>
-        <w:t xml:space="preserve"> </w:t>
-      </w:r>
-      <w:proofErr w:type="spellStart"/>
-      <w:r>
-        <w:t>định</w:t>
-      </w:r>
-      <w:proofErr w:type="spellEnd"/>
-      <w:r>
-        <w:t>)</w:t>
-      </w:r>
+        <w:rPr>
+          <w:highlight w:val="yellow"/>
+        </w:rPr>
+        <w:t>loại</w:t>
+      </w:r>
+      <w:proofErr w:type="spellEnd"/>
+      <w:r>
+        <w:rPr>
+          <w:highlight w:val="yellow"/>
+        </w:rPr>
+        <w:t xml:space="preserve"> </w:t>
+      </w:r>
+      <w:proofErr w:type="spellStart"/>
+      <w:r>
+        <w:rPr>
+          <w:highlight w:val="yellow"/>
+        </w:rPr>
+        <w:t>phòng</w:t>
+      </w:r>
+      <w:proofErr w:type="spellEnd"/>
     </w:p>
     <w:p>
       <w:pPr>
@@ -23970,23 +24719,47 @@
       </w:r>
       <w:proofErr w:type="spellStart"/>
       <w:r>
-        <w:t>giá</w:t>
-      </w:r>
-      <w:proofErr w:type="spellEnd"/>
-      <w:r>
-        <w:t xml:space="preserve"> </w:t>
-      </w:r>
-      <w:proofErr w:type="spellStart"/>
-      <w:r>
-        <w:t>theo</w:t>
-      </w:r>
-      <w:proofErr w:type="spellEnd"/>
-      <w:r>
-        <w:t xml:space="preserve"> </w:t>
-      </w:r>
-      <w:proofErr w:type="spellStart"/>
-      <w:r>
-        <w:t>mùa</w:t>
+        <w:t>lịch</w:t>
+      </w:r>
+      <w:proofErr w:type="spellEnd"/>
+      <w:r>
+        <w:t xml:space="preserve"> </w:t>
+      </w:r>
+      <w:proofErr w:type="spellStart"/>
+      <w:r>
+        <w:t>đặt</w:t>
+      </w:r>
+      <w:proofErr w:type="spellEnd"/>
+      <w:r>
+        <w:t xml:space="preserve"> </w:t>
+      </w:r>
+      <w:proofErr w:type="spellStart"/>
+      <w:r>
+        <w:t>phòng</w:t>
+      </w:r>
+      <w:proofErr w:type="spellEnd"/>
+      <w:r>
+        <w:t xml:space="preserve"> </w:t>
+      </w:r>
+      <w:proofErr w:type="spellStart"/>
+      <w:r>
+        <w:t>của</w:t>
+      </w:r>
+      <w:proofErr w:type="spellEnd"/>
+      <w:r>
+        <w:t xml:space="preserve"> </w:t>
+      </w:r>
+      <w:proofErr w:type="spellStart"/>
+      <w:r>
+        <w:t>khách</w:t>
+      </w:r>
+      <w:proofErr w:type="spellEnd"/>
+      <w:r>
+        <w:t xml:space="preserve"> </w:t>
+      </w:r>
+      <w:proofErr w:type="spellStart"/>
+      <w:r>
+        <w:t>hàng</w:t>
       </w:r>
       <w:proofErr w:type="spellEnd"/>
     </w:p>
@@ -23998,38 +24771,66 @@
           <w:numId w:val="24"/>
         </w:numPr>
         <w:spacing w:after="160" w:line="259" w:lineRule="auto"/>
-        <w:rPr>
-          <w:highlight w:val="yellow"/>
-        </w:rPr>
-      </w:pPr>
-      <w:r>
-        <w:rPr>
-          <w:highlight w:val="yellow"/>
-        </w:rPr>
+      </w:pPr>
+      <w:r>
         <w:t xml:space="preserve">Load </w:t>
       </w:r>
       <w:proofErr w:type="spellStart"/>
       <w:r>
-        <w:rPr>
-          <w:highlight w:val="yellow"/>
-        </w:rPr>
-        <w:t>loại</w:t>
-      </w:r>
-      <w:proofErr w:type="spellEnd"/>
-      <w:r>
-        <w:rPr>
-          <w:highlight w:val="yellow"/>
-        </w:rPr>
-        <w:t xml:space="preserve"> </w:t>
-      </w:r>
-      <w:proofErr w:type="spellStart"/>
-      <w:r>
-        <w:rPr>
-          <w:highlight w:val="yellow"/>
-        </w:rPr>
-        <w:t>phòng</w:t>
-      </w:r>
-      <w:proofErr w:type="spellEnd"/>
+        <w:t>khách</w:t>
+      </w:r>
+      <w:proofErr w:type="spellEnd"/>
+      <w:r>
+        <w:t xml:space="preserve"> </w:t>
+      </w:r>
+      <w:proofErr w:type="spellStart"/>
+      <w:r>
+        <w:t>hàng</w:t>
+      </w:r>
+      <w:proofErr w:type="spellEnd"/>
+      <w:r>
+        <w:t xml:space="preserve"> </w:t>
+      </w:r>
+      <w:proofErr w:type="spellStart"/>
+      <w:r>
+        <w:t>cũ</w:t>
+      </w:r>
+      <w:proofErr w:type="spellEnd"/>
+      <w:r>
+        <w:t xml:space="preserve"> (</w:t>
+      </w:r>
+      <w:proofErr w:type="spellStart"/>
+      <w:r>
+        <w:t>tên</w:t>
+      </w:r>
+      <w:proofErr w:type="spellEnd"/>
+      <w:r>
+        <w:t xml:space="preserve"> - </w:t>
+      </w:r>
+      <w:proofErr w:type="spellStart"/>
+      <w:r>
+        <w:t>số</w:t>
+      </w:r>
+      <w:proofErr w:type="spellEnd"/>
+      <w:r>
+        <w:t xml:space="preserve"> </w:t>
+      </w:r>
+      <w:proofErr w:type="spellStart"/>
+      <w:r>
+        <w:t>điện</w:t>
+      </w:r>
+      <w:proofErr w:type="spellEnd"/>
+      <w:r>
+        <w:t xml:space="preserve"> </w:t>
+      </w:r>
+      <w:proofErr w:type="spellStart"/>
+      <w:r>
+        <w:t>thoại</w:t>
+      </w:r>
+      <w:proofErr w:type="spellEnd"/>
+      <w:r>
+        <w:t>)</w:t>
+      </w:r>
     </w:p>
     <w:p>
       <w:pPr>
@@ -24042,457 +24843,7 @@
       </w:pPr>
       <w:proofErr w:type="spellStart"/>
       <w:r>
-        <w:t>Sửa</w:t>
-      </w:r>
-      <w:proofErr w:type="spellEnd"/>
-      <w:r>
-        <w:t xml:space="preserve"> </w:t>
-      </w:r>
-      <w:proofErr w:type="spellStart"/>
-      <w:r>
-        <w:t>giá</w:t>
-      </w:r>
-      <w:proofErr w:type="spellEnd"/>
-      <w:r>
-        <w:t xml:space="preserve"> </w:t>
-      </w:r>
-      <w:proofErr w:type="spellStart"/>
-      <w:r>
-        <w:t>theo</w:t>
-      </w:r>
-      <w:proofErr w:type="spellEnd"/>
-      <w:r>
-        <w:t xml:space="preserve"> </w:t>
-      </w:r>
-      <w:proofErr w:type="spellStart"/>
-      <w:proofErr w:type="gramStart"/>
-      <w:r>
-        <w:t>ngày</w:t>
-      </w:r>
-      <w:proofErr w:type="spellEnd"/>
-      <w:r>
-        <w:t>(</w:t>
-      </w:r>
-      <w:proofErr w:type="spellStart"/>
-      <w:proofErr w:type="gramEnd"/>
-      <w:r>
-        <w:t>Bỏ</w:t>
-      </w:r>
-      <w:proofErr w:type="spellEnd"/>
-      <w:r>
-        <w:t xml:space="preserve"> </w:t>
-      </w:r>
-      <w:proofErr w:type="spellStart"/>
-      <w:r>
-        <w:t>chức</w:t>
-      </w:r>
-      <w:proofErr w:type="spellEnd"/>
-      <w:r>
-        <w:t xml:space="preserve"> </w:t>
-      </w:r>
-      <w:proofErr w:type="spellStart"/>
-      <w:r>
-        <w:t>năng</w:t>
-      </w:r>
-      <w:proofErr w:type="spellEnd"/>
-      <w:r>
-        <w:t xml:space="preserve"> </w:t>
-      </w:r>
-      <w:proofErr w:type="spellStart"/>
-      <w:proofErr w:type="gramStart"/>
-      <w:r>
-        <w:t>thêm,xoá</w:t>
-      </w:r>
-      <w:proofErr w:type="spellEnd"/>
-      <w:proofErr w:type="gramEnd"/>
-      <w:r>
-        <w:t xml:space="preserve"> </w:t>
-      </w:r>
-      <w:proofErr w:type="spellStart"/>
-      <w:r>
-        <w:t>giá</w:t>
-      </w:r>
-      <w:proofErr w:type="spellEnd"/>
-      <w:r>
-        <w:t xml:space="preserve"> </w:t>
-      </w:r>
-      <w:proofErr w:type="spellStart"/>
-      <w:r>
-        <w:t>theo</w:t>
-      </w:r>
-      <w:proofErr w:type="spellEnd"/>
-      <w:r>
-        <w:t xml:space="preserve"> </w:t>
-      </w:r>
-      <w:proofErr w:type="spellStart"/>
-      <w:r>
-        <w:t>ngày</w:t>
-      </w:r>
-      <w:proofErr w:type="spellEnd"/>
-      <w:r>
-        <w:t xml:space="preserve"> </w:t>
-      </w:r>
-      <w:proofErr w:type="spellStart"/>
-      <w:r>
-        <w:t>trên</w:t>
-      </w:r>
-      <w:proofErr w:type="spellEnd"/>
-      <w:r>
-        <w:t xml:space="preserve"> web)</w:t>
-      </w:r>
-    </w:p>
-    <w:p>
-      <w:pPr>
-        <w:pStyle w:val="ListParagraph"/>
-        <w:numPr>
-          <w:ilvl w:val="1"/>
-          <w:numId w:val="24"/>
-        </w:numPr>
-        <w:spacing w:after="160" w:line="259" w:lineRule="auto"/>
-      </w:pPr>
-      <w:proofErr w:type="spellStart"/>
-      <w:r>
-        <w:t>Thêm</w:t>
-      </w:r>
-      <w:proofErr w:type="spellEnd"/>
-      <w:r>
-        <w:t xml:space="preserve"> </w:t>
-      </w:r>
-      <w:proofErr w:type="spellStart"/>
-      <w:r>
-        <w:t>giá</w:t>
-      </w:r>
-      <w:proofErr w:type="spellEnd"/>
-      <w:r>
-        <w:t xml:space="preserve"> </w:t>
-      </w:r>
-      <w:proofErr w:type="spellStart"/>
-      <w:r>
-        <w:t>theo</w:t>
-      </w:r>
-      <w:proofErr w:type="spellEnd"/>
-      <w:r>
-        <w:t xml:space="preserve"> </w:t>
-      </w:r>
-      <w:proofErr w:type="spellStart"/>
-      <w:proofErr w:type="gramStart"/>
-      <w:r>
-        <w:t>mùa</w:t>
-      </w:r>
-      <w:proofErr w:type="spellEnd"/>
-      <w:r>
-        <w:t>(</w:t>
-      </w:r>
-      <w:proofErr w:type="spellStart"/>
-      <w:proofErr w:type="gramEnd"/>
-      <w:r>
-        <w:t>từ</w:t>
-      </w:r>
-      <w:proofErr w:type="spellEnd"/>
-      <w:r>
-        <w:t xml:space="preserve"> </w:t>
-      </w:r>
-      <w:proofErr w:type="spellStart"/>
-      <w:r>
-        <w:t>ngày-đến</w:t>
-      </w:r>
-      <w:proofErr w:type="spellEnd"/>
-      <w:r>
-        <w:t xml:space="preserve"> </w:t>
-      </w:r>
-      <w:proofErr w:type="spellStart"/>
-      <w:r>
-        <w:t>ngày</w:t>
-      </w:r>
-      <w:proofErr w:type="spellEnd"/>
-      <w:r>
-        <w:t>)</w:t>
-      </w:r>
-    </w:p>
-    <w:p>
-      <w:pPr>
-        <w:pStyle w:val="ListParagraph"/>
-        <w:numPr>
-          <w:ilvl w:val="1"/>
-          <w:numId w:val="24"/>
-        </w:numPr>
-        <w:spacing w:after="160" w:line="259" w:lineRule="auto"/>
-      </w:pPr>
-      <w:proofErr w:type="spellStart"/>
-      <w:r>
-        <w:t>Sửa</w:t>
-      </w:r>
-      <w:proofErr w:type="spellEnd"/>
-      <w:r>
-        <w:t xml:space="preserve"> </w:t>
-      </w:r>
-      <w:proofErr w:type="spellStart"/>
-      <w:r>
-        <w:t>giá</w:t>
-      </w:r>
-      <w:proofErr w:type="spellEnd"/>
-      <w:r>
-        <w:t xml:space="preserve"> </w:t>
-      </w:r>
-      <w:proofErr w:type="spellStart"/>
-      <w:r>
-        <w:t>theo</w:t>
-      </w:r>
-      <w:proofErr w:type="spellEnd"/>
-      <w:r>
-        <w:t xml:space="preserve"> </w:t>
-      </w:r>
-      <w:proofErr w:type="spellStart"/>
-      <w:r>
-        <w:t>mùa</w:t>
-      </w:r>
-      <w:proofErr w:type="spellEnd"/>
-    </w:p>
-    <w:p>
-      <w:pPr>
-        <w:pStyle w:val="ListParagraph"/>
-        <w:numPr>
-          <w:ilvl w:val="1"/>
-          <w:numId w:val="24"/>
-        </w:numPr>
-        <w:spacing w:after="160" w:line="259" w:lineRule="auto"/>
-      </w:pPr>
-      <w:proofErr w:type="spellStart"/>
-      <w:r>
-        <w:t>Xoá</w:t>
-      </w:r>
-      <w:proofErr w:type="spellEnd"/>
-      <w:r>
-        <w:t xml:space="preserve"> </w:t>
-      </w:r>
-      <w:proofErr w:type="spellStart"/>
-      <w:r>
-        <w:t>giá</w:t>
-      </w:r>
-      <w:proofErr w:type="spellEnd"/>
-      <w:r>
-        <w:t xml:space="preserve"> </w:t>
-      </w:r>
-      <w:proofErr w:type="spellStart"/>
-      <w:r>
-        <w:t>theo</w:t>
-      </w:r>
-      <w:proofErr w:type="spellEnd"/>
-      <w:r>
-        <w:t xml:space="preserve"> </w:t>
-      </w:r>
-      <w:proofErr w:type="spellStart"/>
-      <w:r>
-        <w:t>mùa</w:t>
-      </w:r>
-      <w:proofErr w:type="spellEnd"/>
-    </w:p>
-    <w:p>
-      <w:pPr>
-        <w:pStyle w:val="ListParagraph"/>
-        <w:numPr>
-          <w:ilvl w:val="0"/>
-          <w:numId w:val="24"/>
-        </w:numPr>
-        <w:spacing w:after="160" w:line="259" w:lineRule="auto"/>
-      </w:pPr>
-      <w:r>
-        <w:t xml:space="preserve">Trang </w:t>
-      </w:r>
-      <w:proofErr w:type="spellStart"/>
-      <w:r>
-        <w:t>Đặt</w:t>
-      </w:r>
-      <w:proofErr w:type="spellEnd"/>
-      <w:r>
-        <w:t xml:space="preserve"> </w:t>
-      </w:r>
-      <w:proofErr w:type="spellStart"/>
-      <w:r>
-        <w:t>phòng</w:t>
-      </w:r>
-      <w:proofErr w:type="spellEnd"/>
-    </w:p>
-    <w:p>
-      <w:pPr>
-        <w:pStyle w:val="ListParagraph"/>
-        <w:numPr>
-          <w:ilvl w:val="1"/>
-          <w:numId w:val="24"/>
-        </w:numPr>
-        <w:spacing w:after="160" w:line="259" w:lineRule="auto"/>
-        <w:rPr>
-          <w:highlight w:val="yellow"/>
-        </w:rPr>
-      </w:pPr>
-      <w:r>
-        <w:rPr>
-          <w:highlight w:val="yellow"/>
-        </w:rPr>
-        <w:t xml:space="preserve">Load </w:t>
-      </w:r>
-      <w:proofErr w:type="spellStart"/>
-      <w:r>
-        <w:rPr>
-          <w:highlight w:val="yellow"/>
-        </w:rPr>
-        <w:t>loại</w:t>
-      </w:r>
-      <w:proofErr w:type="spellEnd"/>
-      <w:r>
-        <w:rPr>
-          <w:highlight w:val="yellow"/>
-        </w:rPr>
-        <w:t xml:space="preserve"> </w:t>
-      </w:r>
-      <w:proofErr w:type="spellStart"/>
-      <w:r>
-        <w:rPr>
-          <w:highlight w:val="yellow"/>
-        </w:rPr>
-        <w:t>phòng</w:t>
-      </w:r>
-      <w:proofErr w:type="spellEnd"/>
-    </w:p>
-    <w:p>
-      <w:pPr>
-        <w:pStyle w:val="ListParagraph"/>
-        <w:numPr>
-          <w:ilvl w:val="1"/>
-          <w:numId w:val="24"/>
-        </w:numPr>
-        <w:spacing w:after="160" w:line="259" w:lineRule="auto"/>
-      </w:pPr>
-      <w:r>
-        <w:t xml:space="preserve">Load </w:t>
-      </w:r>
-      <w:proofErr w:type="spellStart"/>
-      <w:r>
-        <w:t>lịch</w:t>
-      </w:r>
-      <w:proofErr w:type="spellEnd"/>
-      <w:r>
-        <w:t xml:space="preserve"> </w:t>
-      </w:r>
-      <w:proofErr w:type="spellStart"/>
-      <w:r>
-        <w:t>đặt</w:t>
-      </w:r>
-      <w:proofErr w:type="spellEnd"/>
-      <w:r>
-        <w:t xml:space="preserve"> </w:t>
-      </w:r>
-      <w:proofErr w:type="spellStart"/>
-      <w:r>
-        <w:t>phòng</w:t>
-      </w:r>
-      <w:proofErr w:type="spellEnd"/>
-      <w:r>
-        <w:t xml:space="preserve"> </w:t>
-      </w:r>
-      <w:proofErr w:type="spellStart"/>
-      <w:r>
-        <w:t>của</w:t>
-      </w:r>
-      <w:proofErr w:type="spellEnd"/>
-      <w:r>
-        <w:t xml:space="preserve"> </w:t>
-      </w:r>
-      <w:proofErr w:type="spellStart"/>
-      <w:r>
-        <w:t>khách</w:t>
-      </w:r>
-      <w:proofErr w:type="spellEnd"/>
-      <w:r>
-        <w:t xml:space="preserve"> </w:t>
-      </w:r>
-      <w:proofErr w:type="spellStart"/>
-      <w:r>
-        <w:t>hàng</w:t>
-      </w:r>
-      <w:proofErr w:type="spellEnd"/>
-    </w:p>
-    <w:p>
-      <w:pPr>
-        <w:pStyle w:val="ListParagraph"/>
-        <w:numPr>
-          <w:ilvl w:val="1"/>
-          <w:numId w:val="24"/>
-        </w:numPr>
-        <w:spacing w:after="160" w:line="259" w:lineRule="auto"/>
-      </w:pPr>
-      <w:r>
         <w:lastRenderedPageBreak/>
-        <w:t xml:space="preserve">Load </w:t>
-      </w:r>
-      <w:proofErr w:type="spellStart"/>
-      <w:r>
-        <w:t>khách</w:t>
-      </w:r>
-      <w:proofErr w:type="spellEnd"/>
-      <w:r>
-        <w:t xml:space="preserve"> </w:t>
-      </w:r>
-      <w:proofErr w:type="spellStart"/>
-      <w:r>
-        <w:t>hàng</w:t>
-      </w:r>
-      <w:proofErr w:type="spellEnd"/>
-      <w:r>
-        <w:t xml:space="preserve"> </w:t>
-      </w:r>
-      <w:proofErr w:type="spellStart"/>
-      <w:r>
-        <w:t>cũ</w:t>
-      </w:r>
-      <w:proofErr w:type="spellEnd"/>
-      <w:r>
-        <w:t xml:space="preserve"> (</w:t>
-      </w:r>
-      <w:proofErr w:type="spellStart"/>
-      <w:r>
-        <w:t>tên</w:t>
-      </w:r>
-      <w:proofErr w:type="spellEnd"/>
-      <w:r>
-        <w:t xml:space="preserve"> - </w:t>
-      </w:r>
-      <w:proofErr w:type="spellStart"/>
-      <w:r>
-        <w:t>số</w:t>
-      </w:r>
-      <w:proofErr w:type="spellEnd"/>
-      <w:r>
-        <w:t xml:space="preserve"> </w:t>
-      </w:r>
-      <w:proofErr w:type="spellStart"/>
-      <w:r>
-        <w:t>điện</w:t>
-      </w:r>
-      <w:proofErr w:type="spellEnd"/>
-      <w:r>
-        <w:t xml:space="preserve"> </w:t>
-      </w:r>
-      <w:proofErr w:type="spellStart"/>
-      <w:r>
-        <w:t>thoại</w:t>
-      </w:r>
-      <w:proofErr w:type="spellEnd"/>
-      <w:r>
-        <w:t>)</w:t>
-      </w:r>
-    </w:p>
-    <w:p>
-      <w:pPr>
-        <w:pStyle w:val="ListParagraph"/>
-        <w:numPr>
-          <w:ilvl w:val="1"/>
-          <w:numId w:val="24"/>
-        </w:numPr>
-        <w:spacing w:after="160" w:line="259" w:lineRule="auto"/>
-      </w:pPr>
-      <w:proofErr w:type="spellStart"/>
-      <w:r>
         <w:t>Thêm</w:t>
       </w:r>
       <w:proofErr w:type="spellEnd"/>
@@ -31702,6 +32053,7 @@
   <w:style w:type="character" w:default="1" w:styleId="DefaultParagraphFont">
     <w:name w:val="Default Paragraph Font"/>
     <w:uiPriority w:val="1"/>
+    <w:semiHidden/>
     <w:unhideWhenUsed/>
   </w:style>
   <w:style w:type="table" w:default="1" w:styleId="TableNormal">

</xml_diff>

<commit_message>
Xây dựng store procedure trang Hoá đơn
</commit_message>
<xml_diff>
--- a/Documents/Quản lý khách sạn(Phân tích).docx
+++ b/Documents/Quản lý khách sạn(Phân tích).docx
@@ -22680,20 +22680,35 @@
           <w:numId w:val="33"/>
         </w:numPr>
         <w:spacing w:after="160" w:line="259" w:lineRule="auto"/>
-      </w:pPr>
-      <w:r>
+        <w:rPr>
+          <w:highlight w:val="yellow"/>
+        </w:rPr>
+      </w:pPr>
+      <w:r>
+        <w:rPr>
+          <w:highlight w:val="yellow"/>
+        </w:rPr>
         <w:t xml:space="preserve">Trang </w:t>
       </w:r>
       <w:proofErr w:type="spellStart"/>
       <w:r>
+        <w:rPr>
+          <w:highlight w:val="yellow"/>
+        </w:rPr>
         <w:t>Tổng</w:t>
       </w:r>
       <w:proofErr w:type="spellEnd"/>
       <w:r>
-        <w:t xml:space="preserve"> </w:t>
-      </w:r>
-      <w:proofErr w:type="spellStart"/>
-      <w:r>
+        <w:rPr>
+          <w:highlight w:val="yellow"/>
+        </w:rPr>
+        <w:t xml:space="preserve"> </w:t>
+      </w:r>
+      <w:proofErr w:type="spellStart"/>
+      <w:r>
+        <w:rPr>
+          <w:highlight w:val="yellow"/>
+        </w:rPr>
         <w:t>quan</w:t>
       </w:r>
       <w:proofErr w:type="spellEnd"/>
@@ -23465,20 +23480,35 @@
           <w:numId w:val="24"/>
         </w:numPr>
         <w:spacing w:after="160" w:line="259" w:lineRule="auto"/>
-      </w:pPr>
-      <w:r>
+        <w:rPr>
+          <w:highlight w:val="yellow"/>
+        </w:rPr>
+      </w:pPr>
+      <w:r>
+        <w:rPr>
+          <w:highlight w:val="yellow"/>
+        </w:rPr>
         <w:t xml:space="preserve">Trang </w:t>
       </w:r>
       <w:proofErr w:type="spellStart"/>
       <w:r>
+        <w:rPr>
+          <w:highlight w:val="yellow"/>
+        </w:rPr>
         <w:t>Lịch</w:t>
       </w:r>
       <w:proofErr w:type="spellEnd"/>
       <w:r>
-        <w:t xml:space="preserve"> </w:t>
-      </w:r>
-      <w:proofErr w:type="spellStart"/>
-      <w:r>
+        <w:rPr>
+          <w:highlight w:val="yellow"/>
+        </w:rPr>
+        <w:t xml:space="preserve"> </w:t>
+      </w:r>
+      <w:proofErr w:type="spellStart"/>
+      <w:r>
+        <w:rPr>
+          <w:highlight w:val="yellow"/>
+        </w:rPr>
         <w:t>phòng</w:t>
       </w:r>
       <w:proofErr w:type="spellEnd"/>
@@ -23598,18 +23628,30 @@
         <w:spacing w:after="160" w:line="259" w:lineRule="auto"/>
       </w:pPr>
       <w:r>
+        <w:rPr>
+          <w:highlight w:val="yellow"/>
+        </w:rPr>
         <w:t xml:space="preserve">Trang Quản </w:t>
       </w:r>
       <w:proofErr w:type="spellStart"/>
       <w:r>
+        <w:rPr>
+          <w:highlight w:val="yellow"/>
+        </w:rPr>
         <w:t>lý</w:t>
       </w:r>
       <w:proofErr w:type="spellEnd"/>
       <w:r>
-        <w:t xml:space="preserve"> </w:t>
-      </w:r>
-      <w:proofErr w:type="spellStart"/>
-      <w:r>
+        <w:rPr>
+          <w:highlight w:val="yellow"/>
+        </w:rPr>
+        <w:t xml:space="preserve"> </w:t>
+      </w:r>
+      <w:proofErr w:type="spellStart"/>
+      <w:r>
+        <w:rPr>
+          <w:highlight w:val="yellow"/>
+        </w:rPr>
         <w:t>Phòng</w:t>
       </w:r>
       <w:proofErr w:type="spellEnd"/>
@@ -23995,20 +24037,35 @@
           <w:numId w:val="24"/>
         </w:numPr>
         <w:spacing w:after="160" w:line="259" w:lineRule="auto"/>
-      </w:pPr>
-      <w:r>
+        <w:rPr>
+          <w:highlight w:val="yellow"/>
+        </w:rPr>
+      </w:pPr>
+      <w:r>
+        <w:rPr>
+          <w:highlight w:val="yellow"/>
+        </w:rPr>
         <w:t xml:space="preserve">Trang Quản </w:t>
       </w:r>
       <w:proofErr w:type="spellStart"/>
       <w:r>
+        <w:rPr>
+          <w:highlight w:val="yellow"/>
+        </w:rPr>
         <w:t>lý</w:t>
       </w:r>
       <w:proofErr w:type="spellEnd"/>
       <w:r>
-        <w:t xml:space="preserve"> </w:t>
-      </w:r>
-      <w:proofErr w:type="spellStart"/>
-      <w:r>
+        <w:rPr>
+          <w:highlight w:val="yellow"/>
+        </w:rPr>
+        <w:t xml:space="preserve"> </w:t>
+      </w:r>
+      <w:proofErr w:type="spellStart"/>
+      <w:r>
+        <w:rPr>
+          <w:highlight w:val="yellow"/>
+        </w:rPr>
         <w:t>Giá</w:t>
       </w:r>
       <w:proofErr w:type="spellEnd"/>
@@ -25851,47 +25908,162 @@
           <w:numId w:val="24"/>
         </w:numPr>
         <w:spacing w:after="160" w:line="259" w:lineRule="auto"/>
-      </w:pPr>
-      <w:r>
-        <w:t xml:space="preserve">Load </w:t>
-      </w:r>
-      <w:proofErr w:type="spellStart"/>
-      <w:r>
+        <w:rPr>
+          <w:highlight w:val="yellow"/>
+        </w:rPr>
+      </w:pPr>
+      <w:r>
+        <w:rPr>
+          <w:highlight w:val="yellow"/>
+        </w:rPr>
+        <w:t>Load</w:t>
+      </w:r>
+      <w:r>
+        <w:rPr>
+          <w:highlight w:val="yellow"/>
+        </w:rPr>
+        <w:t xml:space="preserve"> </w:t>
+      </w:r>
+      <w:proofErr w:type="spellStart"/>
+      <w:r>
+        <w:rPr>
+          <w:highlight w:val="yellow"/>
+        </w:rPr>
+        <w:t>thông</w:t>
+      </w:r>
+      <w:proofErr w:type="spellEnd"/>
+      <w:r>
+        <w:rPr>
+          <w:highlight w:val="yellow"/>
+        </w:rPr>
+        <w:t xml:space="preserve"> tin KH </w:t>
+      </w:r>
+      <w:proofErr w:type="spellStart"/>
+      <w:r>
+        <w:rPr>
+          <w:highlight w:val="yellow"/>
+        </w:rPr>
+        <w:t>đã</w:t>
+      </w:r>
+      <w:proofErr w:type="spellEnd"/>
+      <w:r>
+        <w:rPr>
+          <w:highlight w:val="yellow"/>
+        </w:rPr>
+        <w:t xml:space="preserve"> </w:t>
+      </w:r>
+      <w:proofErr w:type="spellStart"/>
+      <w:r>
+        <w:rPr>
+          <w:highlight w:val="yellow"/>
+        </w:rPr>
+        <w:t>CheckOut</w:t>
+      </w:r>
+      <w:proofErr w:type="spellEnd"/>
+      <w:r>
+        <w:rPr>
+          <w:highlight w:val="yellow"/>
+        </w:rPr>
+        <w:t xml:space="preserve"> </w:t>
+      </w:r>
+      <w:proofErr w:type="spellStart"/>
+      <w:r>
+        <w:rPr>
+          <w:highlight w:val="yellow"/>
+        </w:rPr>
+        <w:t>đợi</w:t>
+      </w:r>
+      <w:proofErr w:type="spellEnd"/>
+      <w:r>
+        <w:rPr>
+          <w:highlight w:val="yellow"/>
+        </w:rPr>
+        <w:t xml:space="preserve"> </w:t>
+      </w:r>
+      <w:proofErr w:type="spellStart"/>
+      <w:r>
+        <w:rPr>
+          <w:highlight w:val="yellow"/>
+        </w:rPr>
+        <w:t>tạo</w:t>
+      </w:r>
+      <w:proofErr w:type="spellEnd"/>
+      <w:r>
+        <w:rPr>
+          <w:highlight w:val="yellow"/>
+        </w:rPr>
+        <w:t xml:space="preserve"> </w:t>
+      </w:r>
+      <w:proofErr w:type="spellStart"/>
+      <w:r>
+        <w:rPr>
+          <w:highlight w:val="yellow"/>
+        </w:rPr>
         <w:t>hoá</w:t>
       </w:r>
       <w:proofErr w:type="spellEnd"/>
       <w:r>
-        <w:t xml:space="preserve"> </w:t>
-      </w:r>
-      <w:proofErr w:type="spellStart"/>
-      <w:r>
+        <w:rPr>
+          <w:highlight w:val="yellow"/>
+        </w:rPr>
+        <w:t xml:space="preserve"> </w:t>
+      </w:r>
+      <w:proofErr w:type="spellStart"/>
+      <w:r>
+        <w:rPr>
+          <w:highlight w:val="yellow"/>
+        </w:rPr>
         <w:t>đơn</w:t>
       </w:r>
       <w:proofErr w:type="spellEnd"/>
       <w:r>
-        <w:t xml:space="preserve"> </w:t>
-      </w:r>
-      <w:proofErr w:type="spellStart"/>
-      <w:r>
-        <w:t>chưa</w:t>
-      </w:r>
-      <w:proofErr w:type="spellEnd"/>
-      <w:r>
-        <w:t xml:space="preserve"> </w:t>
-      </w:r>
-      <w:proofErr w:type="spellStart"/>
-      <w:r>
+        <w:rPr>
+          <w:highlight w:val="yellow"/>
+        </w:rPr>
+        <w:t xml:space="preserve"> </w:t>
+      </w:r>
+      <w:proofErr w:type="spellStart"/>
+      <w:r>
+        <w:rPr>
+          <w:highlight w:val="yellow"/>
+        </w:rPr>
+        <w:t>để</w:t>
+      </w:r>
+      <w:proofErr w:type="spellEnd"/>
+      <w:r>
+        <w:rPr>
+          <w:highlight w:val="yellow"/>
+        </w:rPr>
+        <w:t xml:space="preserve"> </w:t>
+      </w:r>
+      <w:proofErr w:type="spellStart"/>
+      <w:r>
+        <w:rPr>
+          <w:highlight w:val="yellow"/>
+        </w:rPr>
         <w:t>thanh</w:t>
       </w:r>
       <w:proofErr w:type="spellEnd"/>
       <w:r>
-        <w:t xml:space="preserve"> </w:t>
-      </w:r>
-      <w:proofErr w:type="spellStart"/>
-      <w:r>
+        <w:rPr>
+          <w:highlight w:val="yellow"/>
+        </w:rPr>
+        <w:t xml:space="preserve"> </w:t>
+      </w:r>
+      <w:proofErr w:type="spellStart"/>
+      <w:r>
+        <w:rPr>
+          <w:highlight w:val="yellow"/>
+        </w:rPr>
         <w:t>toán</w:t>
       </w:r>
       <w:proofErr w:type="spellEnd"/>
+      <w:r>
+        <w:rPr>
+          <w:highlight w:val="yellow"/>
+        </w:rPr>
+        <w:t xml:space="preserve"> ()</w:t>
+      </w:r>
     </w:p>
     <w:p>
       <w:pPr>
@@ -25901,47 +26073,170 @@
           <w:numId w:val="24"/>
         </w:numPr>
         <w:spacing w:after="160" w:line="259" w:lineRule="auto"/>
-      </w:pPr>
-      <w:r>
-        <w:t xml:space="preserve">Load </w:t>
-      </w:r>
-      <w:proofErr w:type="spellStart"/>
-      <w:r>
-        <w:t>Hoá</w:t>
-      </w:r>
-      <w:proofErr w:type="spellEnd"/>
-      <w:r>
-        <w:t xml:space="preserve"> </w:t>
-      </w:r>
-      <w:proofErr w:type="spellStart"/>
-      <w:r>
+        <w:rPr>
+          <w:highlight w:val="yellow"/>
+        </w:rPr>
+      </w:pPr>
+      <w:proofErr w:type="spellStart"/>
+      <w:r>
+        <w:rPr>
+          <w:highlight w:val="yellow"/>
+        </w:rPr>
+        <w:t>Tạo</w:t>
+      </w:r>
+      <w:proofErr w:type="spellEnd"/>
+      <w:r>
+        <w:rPr>
+          <w:highlight w:val="yellow"/>
+        </w:rPr>
+        <w:t xml:space="preserve"> </w:t>
+      </w:r>
+      <w:proofErr w:type="spellStart"/>
+      <w:r>
+        <w:rPr>
+          <w:highlight w:val="yellow"/>
+        </w:rPr>
+        <w:t>hoá</w:t>
+      </w:r>
+      <w:proofErr w:type="spellEnd"/>
+      <w:r>
+        <w:rPr>
+          <w:highlight w:val="yellow"/>
+        </w:rPr>
+        <w:t xml:space="preserve"> </w:t>
+      </w:r>
+      <w:proofErr w:type="spellStart"/>
+      <w:r>
+        <w:rPr>
+          <w:highlight w:val="yellow"/>
+        </w:rPr>
         <w:t>đơn</w:t>
       </w:r>
       <w:proofErr w:type="spellEnd"/>
       <w:r>
-        <w:t xml:space="preserve"> </w:t>
-      </w:r>
-      <w:proofErr w:type="spellStart"/>
-      <w:r>
-        <w:t>đã</w:t>
-      </w:r>
-      <w:proofErr w:type="spellEnd"/>
-      <w:r>
-        <w:t xml:space="preserve"> </w:t>
-      </w:r>
-      <w:proofErr w:type="spellStart"/>
-      <w:r>
-        <w:t>Xử</w:t>
-      </w:r>
-      <w:proofErr w:type="spellEnd"/>
-      <w:r>
-        <w:t xml:space="preserve"> </w:t>
-      </w:r>
-      <w:proofErr w:type="spellStart"/>
-      <w:r>
-        <w:t>lý</w:t>
-      </w:r>
-      <w:proofErr w:type="spellEnd"/>
+        <w:rPr>
+          <w:highlight w:val="yellow"/>
+        </w:rPr>
+        <w:t xml:space="preserve"> (</w:t>
+      </w:r>
+      <w:proofErr w:type="spellStart"/>
+      <w:r>
+        <w:rPr>
+          <w:highlight w:val="yellow"/>
+        </w:rPr>
+        <w:t>Thêm</w:t>
+      </w:r>
+      <w:proofErr w:type="spellEnd"/>
+      <w:r>
+        <w:rPr>
+          <w:highlight w:val="yellow"/>
+        </w:rPr>
+        <w:t xml:space="preserve">, </w:t>
+      </w:r>
+      <w:proofErr w:type="spellStart"/>
+      <w:r>
+        <w:rPr>
+          <w:highlight w:val="yellow"/>
+        </w:rPr>
+        <w:t>sửa</w:t>
+      </w:r>
+      <w:proofErr w:type="spellEnd"/>
+      <w:r>
+        <w:rPr>
+          <w:highlight w:val="yellow"/>
+        </w:rPr>
+        <w:t xml:space="preserve">, </w:t>
+      </w:r>
+      <w:proofErr w:type="spellStart"/>
+      <w:r>
+        <w:rPr>
+          <w:highlight w:val="yellow"/>
+        </w:rPr>
+        <w:t>xoá</w:t>
+      </w:r>
+      <w:proofErr w:type="spellEnd"/>
+      <w:r>
+        <w:rPr>
+          <w:highlight w:val="yellow"/>
+        </w:rPr>
+        <w:t xml:space="preserve"> </w:t>
+      </w:r>
+      <w:proofErr w:type="spellStart"/>
+      <w:r>
+        <w:rPr>
+          <w:highlight w:val="yellow"/>
+        </w:rPr>
+        <w:t>Dịch</w:t>
+      </w:r>
+      <w:proofErr w:type="spellEnd"/>
+      <w:r>
+        <w:rPr>
+          <w:highlight w:val="yellow"/>
+        </w:rPr>
+        <w:t xml:space="preserve"> </w:t>
+      </w:r>
+      <w:proofErr w:type="spellStart"/>
+      <w:r>
+        <w:rPr>
+          <w:highlight w:val="yellow"/>
+        </w:rPr>
+        <w:t>vụ</w:t>
+      </w:r>
+      <w:proofErr w:type="spellEnd"/>
+      <w:r>
+        <w:rPr>
+          <w:highlight w:val="yellow"/>
+        </w:rPr>
+        <w:t xml:space="preserve"> </w:t>
+      </w:r>
+      <w:proofErr w:type="spellStart"/>
+      <w:r>
+        <w:rPr>
+          <w:highlight w:val="yellow"/>
+        </w:rPr>
+        <w:t>sử</w:t>
+      </w:r>
+      <w:proofErr w:type="spellEnd"/>
+      <w:r>
+        <w:rPr>
+          <w:highlight w:val="yellow"/>
+        </w:rPr>
+        <w:t xml:space="preserve"> </w:t>
+      </w:r>
+      <w:proofErr w:type="spellStart"/>
+      <w:r>
+        <w:rPr>
+          <w:highlight w:val="yellow"/>
+        </w:rPr>
+        <w:t>dụng</w:t>
+      </w:r>
+      <w:proofErr w:type="spellEnd"/>
+      <w:r>
+        <w:rPr>
+          <w:highlight w:val="yellow"/>
+        </w:rPr>
+        <w:t xml:space="preserve">, mini bar, </w:t>
+      </w:r>
+      <w:proofErr w:type="spellStart"/>
+      <w:r>
+        <w:rPr>
+          <w:highlight w:val="yellow"/>
+        </w:rPr>
+        <w:t>phạt</w:t>
+      </w:r>
+      <w:proofErr w:type="spellEnd"/>
+      <w:r>
+        <w:rPr>
+          <w:highlight w:val="yellow"/>
+        </w:rPr>
+        <w:t>)</w:t>
+      </w:r>
+      <w:r>
+        <w:rPr>
+          <w:highlight w:val="yellow"/>
+        </w:rPr>
+        <w:t xml:space="preserve"> </w:t>
+      </w:r>
     </w:p>
     <w:p>
       <w:pPr>
@@ -25951,95 +26246,80 @@
           <w:numId w:val="24"/>
         </w:numPr>
         <w:spacing w:after="160" w:line="259" w:lineRule="auto"/>
-      </w:pPr>
-      <w:proofErr w:type="spellStart"/>
-      <w:r>
-        <w:t>Tạo</w:t>
-      </w:r>
-      <w:proofErr w:type="spellEnd"/>
-      <w:r>
-        <w:t xml:space="preserve"> </w:t>
-      </w:r>
-      <w:proofErr w:type="spellStart"/>
-      <w:r>
-        <w:t>hoá</w:t>
-      </w:r>
-      <w:proofErr w:type="spellEnd"/>
-      <w:r>
-        <w:t xml:space="preserve"> </w:t>
-      </w:r>
-      <w:proofErr w:type="spellStart"/>
-      <w:r>
+        <w:rPr>
+          <w:highlight w:val="yellow"/>
+        </w:rPr>
+      </w:pPr>
+      <w:r>
+        <w:rPr>
+          <w:highlight w:val="yellow"/>
+        </w:rPr>
+        <w:t xml:space="preserve">Load </w:t>
+      </w:r>
+      <w:proofErr w:type="spellStart"/>
+      <w:r>
+        <w:rPr>
+          <w:highlight w:val="yellow"/>
+        </w:rPr>
+        <w:t>Hoá</w:t>
+      </w:r>
+      <w:proofErr w:type="spellEnd"/>
+      <w:r>
+        <w:rPr>
+          <w:highlight w:val="yellow"/>
+        </w:rPr>
+        <w:t xml:space="preserve"> </w:t>
+      </w:r>
+      <w:proofErr w:type="spellStart"/>
+      <w:r>
+        <w:rPr>
+          <w:highlight w:val="yellow"/>
+        </w:rPr>
         <w:t>đơn</w:t>
       </w:r>
       <w:proofErr w:type="spellEnd"/>
       <w:r>
-        <w:t xml:space="preserve"> (</w:t>
-      </w:r>
-      <w:proofErr w:type="spellStart"/>
-      <w:r>
-        <w:t>Thêm</w:t>
-      </w:r>
-      <w:proofErr w:type="spellEnd"/>
-      <w:r>
-        <w:t xml:space="preserve">, </w:t>
-      </w:r>
-      <w:proofErr w:type="spellStart"/>
-      <w:r>
-        <w:t>sửa</w:t>
-      </w:r>
-      <w:proofErr w:type="spellEnd"/>
-      <w:r>
-        <w:t xml:space="preserve">, </w:t>
-      </w:r>
-      <w:proofErr w:type="spellStart"/>
-      <w:r>
-        <w:t>xoá</w:t>
-      </w:r>
-      <w:proofErr w:type="spellEnd"/>
-      <w:r>
-        <w:t xml:space="preserve"> </w:t>
-      </w:r>
-      <w:proofErr w:type="spellStart"/>
-      <w:r>
-        <w:t>Dịch</w:t>
-      </w:r>
-      <w:proofErr w:type="spellEnd"/>
-      <w:r>
-        <w:t xml:space="preserve"> </w:t>
-      </w:r>
-      <w:proofErr w:type="spellStart"/>
-      <w:r>
-        <w:t>vụ</w:t>
-      </w:r>
-      <w:proofErr w:type="spellEnd"/>
-      <w:r>
-        <w:t xml:space="preserve"> </w:t>
-      </w:r>
-      <w:proofErr w:type="spellStart"/>
-      <w:r>
-        <w:t>sử</w:t>
-      </w:r>
-      <w:proofErr w:type="spellEnd"/>
-      <w:r>
-        <w:t xml:space="preserve"> </w:t>
-      </w:r>
-      <w:proofErr w:type="spellStart"/>
-      <w:r>
-        <w:t>dụng</w:t>
-      </w:r>
-      <w:proofErr w:type="spellEnd"/>
-      <w:r>
-        <w:t xml:space="preserve">, mini bar, </w:t>
-      </w:r>
-      <w:proofErr w:type="spellStart"/>
-      <w:r>
-        <w:t>phạt</w:t>
-      </w:r>
-      <w:proofErr w:type="spellEnd"/>
-      <w:r>
-        <w:t>)</w:t>
-      </w:r>
+        <w:rPr>
+          <w:highlight w:val="yellow"/>
+        </w:rPr>
+        <w:t xml:space="preserve"> </w:t>
+      </w:r>
+      <w:proofErr w:type="spellStart"/>
+      <w:r>
+        <w:rPr>
+          <w:highlight w:val="yellow"/>
+        </w:rPr>
+        <w:t>đã</w:t>
+      </w:r>
+      <w:proofErr w:type="spellEnd"/>
+      <w:r>
+        <w:rPr>
+          <w:highlight w:val="yellow"/>
+        </w:rPr>
+        <w:t xml:space="preserve"> </w:t>
+      </w:r>
+      <w:proofErr w:type="spellStart"/>
+      <w:r>
+        <w:rPr>
+          <w:highlight w:val="yellow"/>
+        </w:rPr>
+        <w:t>Xử</w:t>
+      </w:r>
+      <w:proofErr w:type="spellEnd"/>
+      <w:r>
+        <w:rPr>
+          <w:highlight w:val="yellow"/>
+        </w:rPr>
+        <w:t xml:space="preserve"> </w:t>
+      </w:r>
+      <w:proofErr w:type="spellStart"/>
+      <w:r>
+        <w:rPr>
+          <w:highlight w:val="yellow"/>
+        </w:rPr>
+        <w:t>lý</w:t>
+      </w:r>
+      <w:proofErr w:type="spellEnd"/>
     </w:p>
     <w:p>
       <w:pPr>
@@ -26049,20 +26329,35 @@
           <w:numId w:val="24"/>
         </w:numPr>
         <w:spacing w:after="160" w:line="259" w:lineRule="auto"/>
-      </w:pPr>
-      <w:r>
+        <w:rPr>
+          <w:highlight w:val="yellow"/>
+        </w:rPr>
+      </w:pPr>
+      <w:r>
+        <w:rPr>
+          <w:highlight w:val="yellow"/>
+        </w:rPr>
         <w:t xml:space="preserve">Trang </w:t>
       </w:r>
       <w:proofErr w:type="spellStart"/>
       <w:r>
+        <w:rPr>
+          <w:highlight w:val="yellow"/>
+        </w:rPr>
         <w:t>báo</w:t>
       </w:r>
       <w:proofErr w:type="spellEnd"/>
       <w:r>
-        <w:t xml:space="preserve"> </w:t>
-      </w:r>
-      <w:proofErr w:type="spellStart"/>
-      <w:r>
+        <w:rPr>
+          <w:highlight w:val="yellow"/>
+        </w:rPr>
+        <w:t xml:space="preserve"> </w:t>
+      </w:r>
+      <w:proofErr w:type="spellStart"/>
+      <w:r>
+        <w:rPr>
+          <w:highlight w:val="yellow"/>
+        </w:rPr>
         <w:t>cáo</w:t>
       </w:r>
       <w:proofErr w:type="spellEnd"/>
@@ -26075,32 +26370,56 @@
           <w:numId w:val="24"/>
         </w:numPr>
         <w:spacing w:after="160" w:line="259" w:lineRule="auto"/>
-      </w:pPr>
-      <w:r>
+        <w:rPr>
+          <w:highlight w:val="yellow"/>
+        </w:rPr>
+      </w:pPr>
+      <w:r>
+        <w:rPr>
+          <w:highlight w:val="yellow"/>
+        </w:rPr>
         <w:t xml:space="preserve">Báo </w:t>
       </w:r>
       <w:proofErr w:type="spellStart"/>
       <w:r>
+        <w:rPr>
+          <w:highlight w:val="yellow"/>
+        </w:rPr>
         <w:t>cáo</w:t>
       </w:r>
       <w:proofErr w:type="spellEnd"/>
       <w:r>
-        <w:t xml:space="preserve"> </w:t>
-      </w:r>
-      <w:proofErr w:type="spellStart"/>
-      <w:r>
+        <w:rPr>
+          <w:highlight w:val="yellow"/>
+        </w:rPr>
+        <w:t xml:space="preserve"> </w:t>
+      </w:r>
+      <w:proofErr w:type="spellStart"/>
+      <w:r>
+        <w:rPr>
+          <w:highlight w:val="yellow"/>
+        </w:rPr>
         <w:t>theo</w:t>
       </w:r>
       <w:proofErr w:type="spellEnd"/>
       <w:r>
-        <w:t xml:space="preserve"> </w:t>
-      </w:r>
-      <w:proofErr w:type="spellStart"/>
-      <w:r>
+        <w:rPr>
+          <w:highlight w:val="yellow"/>
+        </w:rPr>
+        <w:t xml:space="preserve"> </w:t>
+      </w:r>
+      <w:proofErr w:type="spellStart"/>
+      <w:r>
+        <w:rPr>
+          <w:highlight w:val="yellow"/>
+        </w:rPr>
         <w:t>tháng</w:t>
       </w:r>
       <w:proofErr w:type="spellEnd"/>
       <w:r>
+        <w:rPr>
+          <w:highlight w:val="yellow"/>
+        </w:rPr>
         <w:t xml:space="preserve"> </w:t>
       </w:r>
     </w:p>
@@ -26112,56 +26431,98 @@
           <w:numId w:val="24"/>
         </w:numPr>
         <w:spacing w:after="160" w:line="259" w:lineRule="auto"/>
-      </w:pPr>
-      <w:r>
+        <w:rPr>
+          <w:highlight w:val="yellow"/>
+        </w:rPr>
+      </w:pPr>
+      <w:r>
+        <w:rPr>
+          <w:highlight w:val="yellow"/>
+        </w:rPr>
         <w:t xml:space="preserve">Công </w:t>
       </w:r>
       <w:proofErr w:type="spellStart"/>
       <w:r>
+        <w:rPr>
+          <w:highlight w:val="yellow"/>
+        </w:rPr>
         <w:t>suất</w:t>
       </w:r>
       <w:proofErr w:type="spellEnd"/>
       <w:r>
-        <w:t xml:space="preserve"> </w:t>
-      </w:r>
-      <w:proofErr w:type="spellStart"/>
-      <w:r>
+        <w:rPr>
+          <w:highlight w:val="yellow"/>
+        </w:rPr>
+        <w:t xml:space="preserve"> </w:t>
+      </w:r>
+      <w:proofErr w:type="spellStart"/>
+      <w:r>
+        <w:rPr>
+          <w:highlight w:val="yellow"/>
+        </w:rPr>
         <w:t>phòng</w:t>
       </w:r>
       <w:proofErr w:type="spellEnd"/>
       <w:r>
+        <w:rPr>
+          <w:highlight w:val="yellow"/>
+        </w:rPr>
         <w:t xml:space="preserve"> (%</w:t>
       </w:r>
       <w:proofErr w:type="spellStart"/>
       <w:r>
+        <w:rPr>
+          <w:highlight w:val="yellow"/>
+        </w:rPr>
         <w:t>phòng</w:t>
       </w:r>
       <w:proofErr w:type="spellEnd"/>
       <w:r>
-        <w:t xml:space="preserve"> </w:t>
-      </w:r>
-      <w:proofErr w:type="spellStart"/>
-      <w:r>
+        <w:rPr>
+          <w:highlight w:val="yellow"/>
+        </w:rPr>
+        <w:t xml:space="preserve"> </w:t>
+      </w:r>
+      <w:proofErr w:type="spellStart"/>
+      <w:r>
+        <w:rPr>
+          <w:highlight w:val="yellow"/>
+        </w:rPr>
         <w:t>được</w:t>
       </w:r>
       <w:proofErr w:type="spellEnd"/>
       <w:r>
-        <w:t xml:space="preserve"> </w:t>
-      </w:r>
-      <w:proofErr w:type="spellStart"/>
-      <w:r>
+        <w:rPr>
+          <w:highlight w:val="yellow"/>
+        </w:rPr>
+        <w:t xml:space="preserve"> </w:t>
+      </w:r>
+      <w:proofErr w:type="spellStart"/>
+      <w:r>
+        <w:rPr>
+          <w:highlight w:val="yellow"/>
+        </w:rPr>
         <w:t>sử</w:t>
       </w:r>
       <w:proofErr w:type="spellEnd"/>
       <w:r>
-        <w:t xml:space="preserve"> </w:t>
-      </w:r>
-      <w:proofErr w:type="spellStart"/>
-      <w:r>
+        <w:rPr>
+          <w:highlight w:val="yellow"/>
+        </w:rPr>
+        <w:t xml:space="preserve"> </w:t>
+      </w:r>
+      <w:proofErr w:type="spellStart"/>
+      <w:r>
+        <w:rPr>
+          <w:highlight w:val="yellow"/>
+        </w:rPr>
         <w:t>dụng</w:t>
       </w:r>
       <w:proofErr w:type="spellEnd"/>
       <w:r>
+        <w:rPr>
+          <w:highlight w:val="yellow"/>
+        </w:rPr>
         <w:t>)</w:t>
       </w:r>
     </w:p>
@@ -26173,12 +26534,21 @@
           <w:numId w:val="24"/>
         </w:numPr>
         <w:spacing w:after="160" w:line="259" w:lineRule="auto"/>
-      </w:pPr>
-      <w:r>
+        <w:rPr>
+          <w:highlight w:val="yellow"/>
+        </w:rPr>
+      </w:pPr>
+      <w:r>
+        <w:rPr>
+          <w:highlight w:val="yellow"/>
+        </w:rPr>
         <w:t xml:space="preserve">Doanh </w:t>
       </w:r>
       <w:proofErr w:type="spellStart"/>
       <w:r>
+        <w:rPr>
+          <w:highlight w:val="yellow"/>
+        </w:rPr>
         <w:t>thu</w:t>
       </w:r>
       <w:proofErr w:type="spellEnd"/>
@@ -26191,33 +26561,57 @@
           <w:numId w:val="24"/>
         </w:numPr>
         <w:spacing w:after="160" w:line="259" w:lineRule="auto"/>
-      </w:pPr>
-      <w:proofErr w:type="spellStart"/>
-      <w:r>
+        <w:rPr>
+          <w:highlight w:val="yellow"/>
+        </w:rPr>
+      </w:pPr>
+      <w:proofErr w:type="spellStart"/>
+      <w:r>
+        <w:rPr>
+          <w:highlight w:val="yellow"/>
+        </w:rPr>
         <w:t>Số</w:t>
       </w:r>
       <w:proofErr w:type="spellEnd"/>
       <w:r>
-        <w:t xml:space="preserve"> </w:t>
-      </w:r>
-      <w:proofErr w:type="spellStart"/>
-      <w:r>
+        <w:rPr>
+          <w:highlight w:val="yellow"/>
+        </w:rPr>
+        <w:t xml:space="preserve"> </w:t>
+      </w:r>
+      <w:proofErr w:type="spellStart"/>
+      <w:r>
+        <w:rPr>
+          <w:highlight w:val="yellow"/>
+        </w:rPr>
         <w:t>lượt</w:t>
       </w:r>
       <w:proofErr w:type="spellEnd"/>
       <w:r>
-        <w:t xml:space="preserve"> </w:t>
-      </w:r>
-      <w:proofErr w:type="spellStart"/>
-      <w:r>
+        <w:rPr>
+          <w:highlight w:val="yellow"/>
+        </w:rPr>
+        <w:t xml:space="preserve"> </w:t>
+      </w:r>
+      <w:proofErr w:type="spellStart"/>
+      <w:r>
+        <w:rPr>
+          <w:highlight w:val="yellow"/>
+        </w:rPr>
         <w:t>lưu</w:t>
       </w:r>
       <w:proofErr w:type="spellEnd"/>
       <w:r>
-        <w:t xml:space="preserve"> </w:t>
-      </w:r>
-      <w:proofErr w:type="spellStart"/>
-      <w:r>
+        <w:rPr>
+          <w:highlight w:val="yellow"/>
+        </w:rPr>
+        <w:t xml:space="preserve"> </w:t>
+      </w:r>
+      <w:proofErr w:type="spellStart"/>
+      <w:r>
+        <w:rPr>
+          <w:highlight w:val="yellow"/>
+        </w:rPr>
         <w:t>trú</w:t>
       </w:r>
       <w:proofErr w:type="spellEnd"/>
@@ -26230,33 +26624,57 @@
           <w:numId w:val="24"/>
         </w:numPr>
         <w:spacing w:after="160" w:line="259" w:lineRule="auto"/>
-      </w:pPr>
-      <w:proofErr w:type="spellStart"/>
-      <w:r>
+        <w:rPr>
+          <w:highlight w:val="yellow"/>
+        </w:rPr>
+      </w:pPr>
+      <w:proofErr w:type="spellStart"/>
+      <w:r>
+        <w:rPr>
+          <w:highlight w:val="yellow"/>
+        </w:rPr>
         <w:t>Số</w:t>
       </w:r>
       <w:proofErr w:type="spellEnd"/>
       <w:r>
-        <w:t xml:space="preserve"> </w:t>
-      </w:r>
-      <w:proofErr w:type="spellStart"/>
-      <w:r>
+        <w:rPr>
+          <w:highlight w:val="yellow"/>
+        </w:rPr>
+        <w:t xml:space="preserve"> </w:t>
+      </w:r>
+      <w:proofErr w:type="spellStart"/>
+      <w:r>
+        <w:rPr>
+          <w:highlight w:val="yellow"/>
+        </w:rPr>
         <w:t>lượt</w:t>
       </w:r>
       <w:proofErr w:type="spellEnd"/>
       <w:r>
-        <w:t xml:space="preserve"> </w:t>
-      </w:r>
-      <w:proofErr w:type="spellStart"/>
-      <w:r>
+        <w:rPr>
+          <w:highlight w:val="yellow"/>
+        </w:rPr>
+        <w:t xml:space="preserve"> </w:t>
+      </w:r>
+      <w:proofErr w:type="spellStart"/>
+      <w:r>
+        <w:rPr>
+          <w:highlight w:val="yellow"/>
+        </w:rPr>
         <w:t>đặt</w:t>
       </w:r>
       <w:proofErr w:type="spellEnd"/>
       <w:r>
-        <w:t xml:space="preserve"> </w:t>
-      </w:r>
-      <w:proofErr w:type="spellStart"/>
-      <w:r>
+        <w:rPr>
+          <w:highlight w:val="yellow"/>
+        </w:rPr>
+        <w:t xml:space="preserve"> </w:t>
+      </w:r>
+      <w:proofErr w:type="spellStart"/>
+      <w:r>
+        <w:rPr>
+          <w:highlight w:val="yellow"/>
+        </w:rPr>
         <w:t>phòng</w:t>
       </w:r>
       <w:proofErr w:type="spellEnd"/>
@@ -26269,28 +26687,49 @@
           <w:numId w:val="24"/>
         </w:numPr>
         <w:spacing w:after="160" w:line="259" w:lineRule="auto"/>
-      </w:pPr>
-      <w:r>
+        <w:rPr>
+          <w:highlight w:val="yellow"/>
+        </w:rPr>
+      </w:pPr>
+      <w:r>
+        <w:rPr>
+          <w:highlight w:val="yellow"/>
+        </w:rPr>
         <w:t xml:space="preserve">Doanh </w:t>
       </w:r>
       <w:proofErr w:type="spellStart"/>
       <w:r>
+        <w:rPr>
+          <w:highlight w:val="yellow"/>
+        </w:rPr>
         <w:t>thu</w:t>
       </w:r>
       <w:proofErr w:type="spellEnd"/>
       <w:r>
-        <w:t xml:space="preserve"> </w:t>
-      </w:r>
-      <w:proofErr w:type="spellStart"/>
-      <w:r>
+        <w:rPr>
+          <w:highlight w:val="yellow"/>
+        </w:rPr>
+        <w:t xml:space="preserve"> </w:t>
+      </w:r>
+      <w:proofErr w:type="spellStart"/>
+      <w:r>
+        <w:rPr>
+          <w:highlight w:val="yellow"/>
+        </w:rPr>
         <w:t>theo</w:t>
       </w:r>
       <w:proofErr w:type="spellEnd"/>
       <w:r>
-        <w:t xml:space="preserve"> </w:t>
-      </w:r>
-      <w:proofErr w:type="spellStart"/>
-      <w:r>
+        <w:rPr>
+          <w:highlight w:val="yellow"/>
+        </w:rPr>
+        <w:t xml:space="preserve"> </w:t>
+      </w:r>
+      <w:proofErr w:type="spellStart"/>
+      <w:r>
+        <w:rPr>
+          <w:highlight w:val="yellow"/>
+        </w:rPr>
         <w:t>ngày</w:t>
       </w:r>
       <w:proofErr w:type="spellEnd"/>
@@ -26303,28 +26742,49 @@
           <w:numId w:val="24"/>
         </w:numPr>
         <w:spacing w:after="160" w:line="259" w:lineRule="auto"/>
-      </w:pPr>
-      <w:r>
+        <w:rPr>
+          <w:highlight w:val="yellow"/>
+        </w:rPr>
+      </w:pPr>
+      <w:r>
+        <w:rPr>
+          <w:highlight w:val="yellow"/>
+        </w:rPr>
         <w:t xml:space="preserve">Doanh </w:t>
       </w:r>
       <w:proofErr w:type="spellStart"/>
       <w:r>
+        <w:rPr>
+          <w:highlight w:val="yellow"/>
+        </w:rPr>
         <w:t>thu</w:t>
       </w:r>
       <w:proofErr w:type="spellEnd"/>
       <w:r>
-        <w:t xml:space="preserve"> </w:t>
-      </w:r>
-      <w:proofErr w:type="spellStart"/>
-      <w:r>
+        <w:rPr>
+          <w:highlight w:val="yellow"/>
+        </w:rPr>
+        <w:t xml:space="preserve"> </w:t>
+      </w:r>
+      <w:proofErr w:type="spellStart"/>
+      <w:r>
+        <w:rPr>
+          <w:highlight w:val="yellow"/>
+        </w:rPr>
         <w:t>theo</w:t>
       </w:r>
       <w:proofErr w:type="spellEnd"/>
       <w:r>
-        <w:t xml:space="preserve"> </w:t>
-      </w:r>
-      <w:proofErr w:type="spellStart"/>
-      <w:r>
+        <w:rPr>
+          <w:highlight w:val="yellow"/>
+        </w:rPr>
+        <w:t xml:space="preserve"> </w:t>
+      </w:r>
+      <w:proofErr w:type="spellStart"/>
+      <w:r>
+        <w:rPr>
+          <w:highlight w:val="yellow"/>
+        </w:rPr>
         <w:t>kênh</w:t>
       </w:r>
       <w:proofErr w:type="spellEnd"/>
@@ -26337,36 +26797,63 @@
           <w:numId w:val="24"/>
         </w:numPr>
         <w:spacing w:after="160" w:line="259" w:lineRule="auto"/>
-      </w:pPr>
-      <w:r>
+        <w:rPr>
+          <w:highlight w:val="yellow"/>
+        </w:rPr>
+      </w:pPr>
+      <w:r>
+        <w:rPr>
+          <w:highlight w:val="yellow"/>
+        </w:rPr>
         <w:t xml:space="preserve">Doanh </w:t>
       </w:r>
       <w:proofErr w:type="spellStart"/>
       <w:r>
+        <w:rPr>
+          <w:highlight w:val="yellow"/>
+        </w:rPr>
         <w:t>thu</w:t>
       </w:r>
       <w:proofErr w:type="spellEnd"/>
       <w:r>
-        <w:t xml:space="preserve"> </w:t>
-      </w:r>
-      <w:proofErr w:type="spellStart"/>
-      <w:r>
+        <w:rPr>
+          <w:highlight w:val="yellow"/>
+        </w:rPr>
+        <w:t xml:space="preserve"> </w:t>
+      </w:r>
+      <w:proofErr w:type="spellStart"/>
+      <w:r>
+        <w:rPr>
+          <w:highlight w:val="yellow"/>
+        </w:rPr>
         <w:t>theo</w:t>
       </w:r>
       <w:proofErr w:type="spellEnd"/>
       <w:r>
-        <w:t xml:space="preserve"> </w:t>
-      </w:r>
-      <w:proofErr w:type="spellStart"/>
-      <w:r>
+        <w:rPr>
+          <w:highlight w:val="yellow"/>
+        </w:rPr>
+        <w:t xml:space="preserve"> </w:t>
+      </w:r>
+      <w:proofErr w:type="spellStart"/>
+      <w:r>
+        <w:rPr>
+          <w:highlight w:val="yellow"/>
+        </w:rPr>
         <w:t>loại</w:t>
       </w:r>
       <w:proofErr w:type="spellEnd"/>
       <w:r>
-        <w:t xml:space="preserve"> </w:t>
-      </w:r>
-      <w:proofErr w:type="spellStart"/>
-      <w:r>
+        <w:rPr>
+          <w:highlight w:val="yellow"/>
+        </w:rPr>
+        <w:t xml:space="preserve"> </w:t>
+      </w:r>
+      <w:proofErr w:type="spellStart"/>
+      <w:r>
+        <w:rPr>
+          <w:highlight w:val="yellow"/>
+        </w:rPr>
         <w:t>phòng</w:t>
       </w:r>
       <w:proofErr w:type="spellEnd"/>
@@ -26379,36 +26866,63 @@
           <w:numId w:val="24"/>
         </w:numPr>
         <w:spacing w:after="160" w:line="259" w:lineRule="auto"/>
-      </w:pPr>
-      <w:r>
+        <w:rPr>
+          <w:highlight w:val="yellow"/>
+        </w:rPr>
+      </w:pPr>
+      <w:r>
+        <w:rPr>
+          <w:highlight w:val="yellow"/>
+        </w:rPr>
         <w:t xml:space="preserve">Công </w:t>
       </w:r>
       <w:proofErr w:type="spellStart"/>
       <w:r>
+        <w:rPr>
+          <w:highlight w:val="yellow"/>
+        </w:rPr>
         <w:t>suất</w:t>
       </w:r>
       <w:proofErr w:type="spellEnd"/>
       <w:r>
-        <w:t xml:space="preserve"> </w:t>
-      </w:r>
-      <w:proofErr w:type="spellStart"/>
-      <w:r>
+        <w:rPr>
+          <w:highlight w:val="yellow"/>
+        </w:rPr>
+        <w:t xml:space="preserve"> </w:t>
+      </w:r>
+      <w:proofErr w:type="spellStart"/>
+      <w:r>
+        <w:rPr>
+          <w:highlight w:val="yellow"/>
+        </w:rPr>
         <w:t>theo</w:t>
       </w:r>
       <w:proofErr w:type="spellEnd"/>
       <w:r>
-        <w:t xml:space="preserve"> </w:t>
-      </w:r>
-      <w:proofErr w:type="spellStart"/>
-      <w:r>
+        <w:rPr>
+          <w:highlight w:val="yellow"/>
+        </w:rPr>
+        <w:t xml:space="preserve"> </w:t>
+      </w:r>
+      <w:proofErr w:type="spellStart"/>
+      <w:r>
+        <w:rPr>
+          <w:highlight w:val="yellow"/>
+        </w:rPr>
         <w:t>loại</w:t>
       </w:r>
       <w:proofErr w:type="spellEnd"/>
       <w:r>
-        <w:t xml:space="preserve"> </w:t>
-      </w:r>
-      <w:proofErr w:type="spellStart"/>
-      <w:r>
+        <w:rPr>
+          <w:highlight w:val="yellow"/>
+        </w:rPr>
+        <w:t xml:space="preserve"> </w:t>
+      </w:r>
+      <w:proofErr w:type="spellStart"/>
+      <w:r>
+        <w:rPr>
+          <w:highlight w:val="yellow"/>
+        </w:rPr>
         <w:t>phòng</w:t>
       </w:r>
       <w:proofErr w:type="spellEnd"/>
@@ -26421,20 +26935,35 @@
           <w:numId w:val="24"/>
         </w:numPr>
         <w:spacing w:after="160" w:line="259" w:lineRule="auto"/>
-      </w:pPr>
-      <w:r>
+        <w:rPr>
+          <w:highlight w:val="yellow"/>
+        </w:rPr>
+      </w:pPr>
+      <w:r>
+        <w:rPr>
+          <w:highlight w:val="yellow"/>
+        </w:rPr>
         <w:t xml:space="preserve">Trang </w:t>
       </w:r>
       <w:proofErr w:type="spellStart"/>
       <w:r>
+        <w:rPr>
+          <w:highlight w:val="yellow"/>
+        </w:rPr>
         <w:t>nhân</w:t>
       </w:r>
       <w:proofErr w:type="spellEnd"/>
       <w:r>
-        <w:t xml:space="preserve"> </w:t>
-      </w:r>
-      <w:proofErr w:type="spellStart"/>
-      <w:r>
+        <w:rPr>
+          <w:highlight w:val="yellow"/>
+        </w:rPr>
+        <w:t xml:space="preserve"> </w:t>
+      </w:r>
+      <w:proofErr w:type="spellStart"/>
+      <w:r>
+        <w:rPr>
+          <w:highlight w:val="yellow"/>
+        </w:rPr>
         <w:t>viên</w:t>
       </w:r>
       <w:proofErr w:type="spellEnd"/>
@@ -26569,8 +27098,14 @@
           <w:numId w:val="24"/>
         </w:numPr>
         <w:spacing w:after="160" w:line="259" w:lineRule="auto"/>
-      </w:pPr>
-      <w:r>
+        <w:rPr>
+          <w:highlight w:val="yellow"/>
+        </w:rPr>
+      </w:pPr>
+      <w:r>
+        <w:rPr>
+          <w:highlight w:val="yellow"/>
+        </w:rPr>
         <w:t>Login</w:t>
       </w:r>
     </w:p>

</xml_diff>

<commit_message>
Chỉnh sửa lại giao diện, Xây dựng store procedure trang Đặt phòng
</commit_message>
<xml_diff>
--- a/Documents/Quản lý khách sạn(Phân tích).docx
+++ b/Documents/Quản lý khách sạn(Phân tích).docx
@@ -6717,13 +6717,8 @@
         </w:numPr>
         <w:spacing w:after="160" w:line="259" w:lineRule="auto"/>
       </w:pPr>
-      <w:proofErr w:type="spellStart"/>
-      <w:r>
-        <w:t>Làm</w:t>
-      </w:r>
-      <w:proofErr w:type="spellEnd"/>
-      <w:r>
-        <w:t xml:space="preserve"> </w:t>
+      <w:r>
+        <w:t xml:space="preserve">Làm </w:t>
       </w:r>
       <w:proofErr w:type="spellStart"/>
       <w:r>
@@ -15856,13 +15851,8 @@
         </w:numPr>
         <w:spacing w:after="160" w:line="259" w:lineRule="auto"/>
       </w:pPr>
-      <w:proofErr w:type="spellStart"/>
-      <w:r>
-        <w:t>Làm</w:t>
-      </w:r>
-      <w:proofErr w:type="spellEnd"/>
-      <w:r>
-        <w:t xml:space="preserve"> </w:t>
+      <w:r>
+        <w:t xml:space="preserve">Làm </w:t>
       </w:r>
       <w:proofErr w:type="spellStart"/>
       <w:r>
@@ -24770,52 +24760,91 @@
           <w:numId w:val="24"/>
         </w:numPr>
         <w:spacing w:after="160" w:line="259" w:lineRule="auto"/>
-      </w:pPr>
-      <w:r>
+        <w:rPr>
+          <w:highlight w:val="yellow"/>
+        </w:rPr>
+      </w:pPr>
+      <w:r>
+        <w:rPr>
+          <w:highlight w:val="yellow"/>
+        </w:rPr>
         <w:t xml:space="preserve">Load </w:t>
       </w:r>
       <w:proofErr w:type="spellStart"/>
       <w:r>
+        <w:rPr>
+          <w:highlight w:val="yellow"/>
+        </w:rPr>
         <w:t>lịch</w:t>
       </w:r>
       <w:proofErr w:type="spellEnd"/>
       <w:r>
-        <w:t xml:space="preserve"> </w:t>
-      </w:r>
-      <w:proofErr w:type="spellStart"/>
-      <w:r>
+        <w:rPr>
+          <w:highlight w:val="yellow"/>
+        </w:rPr>
+        <w:t xml:space="preserve"> </w:t>
+      </w:r>
+      <w:proofErr w:type="spellStart"/>
+      <w:r>
+        <w:rPr>
+          <w:highlight w:val="yellow"/>
+        </w:rPr>
         <w:t>đặt</w:t>
       </w:r>
       <w:proofErr w:type="spellEnd"/>
       <w:r>
-        <w:t xml:space="preserve"> </w:t>
-      </w:r>
-      <w:proofErr w:type="spellStart"/>
-      <w:r>
+        <w:rPr>
+          <w:highlight w:val="yellow"/>
+        </w:rPr>
+        <w:t xml:space="preserve"> </w:t>
+      </w:r>
+      <w:proofErr w:type="spellStart"/>
+      <w:r>
+        <w:rPr>
+          <w:highlight w:val="yellow"/>
+        </w:rPr>
         <w:t>phòng</w:t>
       </w:r>
       <w:proofErr w:type="spellEnd"/>
       <w:r>
-        <w:t xml:space="preserve"> </w:t>
-      </w:r>
-      <w:proofErr w:type="spellStart"/>
-      <w:r>
+        <w:rPr>
+          <w:highlight w:val="yellow"/>
+        </w:rPr>
+        <w:t xml:space="preserve"> </w:t>
+      </w:r>
+      <w:proofErr w:type="spellStart"/>
+      <w:r>
+        <w:rPr>
+          <w:highlight w:val="yellow"/>
+        </w:rPr>
         <w:t>của</w:t>
       </w:r>
       <w:proofErr w:type="spellEnd"/>
       <w:r>
-        <w:t xml:space="preserve"> </w:t>
-      </w:r>
-      <w:proofErr w:type="spellStart"/>
-      <w:r>
+        <w:rPr>
+          <w:highlight w:val="yellow"/>
+        </w:rPr>
+        <w:t xml:space="preserve"> </w:t>
+      </w:r>
+      <w:proofErr w:type="spellStart"/>
+      <w:r>
+        <w:rPr>
+          <w:highlight w:val="yellow"/>
+        </w:rPr>
         <w:t>khách</w:t>
       </w:r>
       <w:proofErr w:type="spellEnd"/>
       <w:r>
-        <w:t xml:space="preserve"> </w:t>
-      </w:r>
-      <w:proofErr w:type="spellStart"/>
-      <w:r>
+        <w:rPr>
+          <w:highlight w:val="yellow"/>
+        </w:rPr>
+        <w:t xml:space="preserve"> </w:t>
+      </w:r>
+      <w:proofErr w:type="spellStart"/>
+      <w:r>
+        <w:rPr>
+          <w:highlight w:val="yellow"/>
+        </w:rPr>
         <w:t>hàng</w:t>
       </w:r>
       <w:proofErr w:type="spellEnd"/>
@@ -24828,66 +24857,38 @@
           <w:numId w:val="24"/>
         </w:numPr>
         <w:spacing w:after="160" w:line="259" w:lineRule="auto"/>
-      </w:pPr>
-      <w:r>
+        <w:rPr>
+          <w:highlight w:val="yellow"/>
+        </w:rPr>
+      </w:pPr>
+      <w:r>
+        <w:rPr>
+          <w:highlight w:val="yellow"/>
+        </w:rPr>
         <w:t xml:space="preserve">Load </w:t>
       </w:r>
       <w:proofErr w:type="spellStart"/>
       <w:r>
-        <w:t>khách</w:t>
-      </w:r>
-      <w:proofErr w:type="spellEnd"/>
-      <w:r>
-        <w:t xml:space="preserve"> </w:t>
-      </w:r>
-      <w:proofErr w:type="spellStart"/>
-      <w:r>
-        <w:t>hàng</w:t>
-      </w:r>
-      <w:proofErr w:type="spellEnd"/>
-      <w:r>
-        <w:t xml:space="preserve"> </w:t>
-      </w:r>
-      <w:proofErr w:type="spellStart"/>
-      <w:r>
-        <w:t>cũ</w:t>
-      </w:r>
-      <w:proofErr w:type="spellEnd"/>
-      <w:r>
-        <w:t xml:space="preserve"> (</w:t>
-      </w:r>
-      <w:proofErr w:type="spellStart"/>
-      <w:r>
-        <w:t>tên</w:t>
-      </w:r>
-      <w:proofErr w:type="spellEnd"/>
-      <w:r>
-        <w:t xml:space="preserve"> - </w:t>
-      </w:r>
-      <w:proofErr w:type="spellStart"/>
-      <w:r>
-        <w:t>số</w:t>
-      </w:r>
-      <w:proofErr w:type="spellEnd"/>
-      <w:r>
-        <w:t xml:space="preserve"> </w:t>
-      </w:r>
-      <w:proofErr w:type="spellStart"/>
-      <w:r>
-        <w:t>điện</w:t>
-      </w:r>
-      <w:proofErr w:type="spellEnd"/>
-      <w:r>
-        <w:t xml:space="preserve"> </w:t>
-      </w:r>
-      <w:proofErr w:type="spellStart"/>
-      <w:r>
-        <w:t>thoại</w:t>
-      </w:r>
-      <w:proofErr w:type="spellEnd"/>
-      <w:r>
-        <w:t>)</w:t>
-      </w:r>
+        <w:rPr>
+          <w:highlight w:val="yellow"/>
+        </w:rPr>
+        <w:t>lịch</w:t>
+      </w:r>
+      <w:proofErr w:type="spellEnd"/>
+      <w:r>
+        <w:rPr>
+          <w:highlight w:val="yellow"/>
+        </w:rPr>
+        <w:t xml:space="preserve"> </w:t>
+      </w:r>
+      <w:proofErr w:type="spellStart"/>
+      <w:r>
+        <w:rPr>
+          <w:highlight w:val="yellow"/>
+        </w:rPr>
+        <w:t>đặt</w:t>
+      </w:r>
+      <w:proofErr w:type="spellEnd"/>
     </w:p>
     <w:p>
       <w:pPr>
@@ -24897,111 +24898,120 @@
           <w:numId w:val="24"/>
         </w:numPr>
         <w:spacing w:after="160" w:line="259" w:lineRule="auto"/>
-      </w:pPr>
-      <w:proofErr w:type="spellStart"/>
-      <w:r>
+        <w:rPr>
+          <w:highlight w:val="yellow"/>
+        </w:rPr>
+      </w:pPr>
+      <w:r>
+        <w:rPr>
+          <w:highlight w:val="yellow"/>
+        </w:rPr>
         <w:lastRenderedPageBreak/>
-        <w:t>Thêm</w:t>
-      </w:r>
-      <w:proofErr w:type="spellEnd"/>
-      <w:r>
-        <w:t xml:space="preserve"> </w:t>
-      </w:r>
-      <w:proofErr w:type="spellStart"/>
-      <w:r>
-        <w:t>lịch</w:t>
-      </w:r>
-      <w:proofErr w:type="spellEnd"/>
-      <w:r>
-        <w:t xml:space="preserve"> </w:t>
-      </w:r>
-      <w:proofErr w:type="spellStart"/>
-      <w:r>
-        <w:t>đặt</w:t>
-      </w:r>
-      <w:proofErr w:type="spellEnd"/>
-      <w:r>
-        <w:t xml:space="preserve"> </w:t>
-      </w:r>
-      <w:proofErr w:type="spellStart"/>
-      <w:r>
-        <w:t>của</w:t>
-      </w:r>
-      <w:proofErr w:type="spellEnd"/>
-      <w:r>
-        <w:t xml:space="preserve"> </w:t>
-      </w:r>
-      <w:proofErr w:type="spellStart"/>
-      <w:r>
+        <w:t xml:space="preserve">Load </w:t>
+      </w:r>
+      <w:proofErr w:type="spellStart"/>
+      <w:r>
+        <w:rPr>
+          <w:highlight w:val="yellow"/>
+        </w:rPr>
         <w:t>khách</w:t>
       </w:r>
       <w:proofErr w:type="spellEnd"/>
       <w:r>
-        <w:t xml:space="preserve"> </w:t>
-      </w:r>
-      <w:proofErr w:type="spellStart"/>
-      <w:r>
+        <w:rPr>
+          <w:highlight w:val="yellow"/>
+        </w:rPr>
+        <w:t xml:space="preserve"> </w:t>
+      </w:r>
+      <w:proofErr w:type="spellStart"/>
+      <w:r>
+        <w:rPr>
+          <w:highlight w:val="yellow"/>
+        </w:rPr>
+        <w:t>hàng</w:t>
+      </w:r>
+      <w:proofErr w:type="spellEnd"/>
+      <w:r>
+        <w:rPr>
+          <w:highlight w:val="yellow"/>
+        </w:rPr>
+        <w:t xml:space="preserve"> </w:t>
+      </w:r>
+      <w:proofErr w:type="spellStart"/>
+      <w:r>
+        <w:rPr>
+          <w:highlight w:val="yellow"/>
+        </w:rPr>
         <w:t>cũ</w:t>
       </w:r>
       <w:proofErr w:type="spellEnd"/>
       <w:r>
+        <w:rPr>
+          <w:highlight w:val="yellow"/>
+        </w:rPr>
         <w:t xml:space="preserve"> (</w:t>
       </w:r>
       <w:proofErr w:type="spellStart"/>
       <w:r>
-        <w:t>dựa</w:t>
-      </w:r>
-      <w:proofErr w:type="spellEnd"/>
-      <w:r>
-        <w:t xml:space="preserve"> </w:t>
-      </w:r>
-      <w:proofErr w:type="spellStart"/>
-      <w:r>
-        <w:t>theo</w:t>
-      </w:r>
-      <w:proofErr w:type="spellEnd"/>
-      <w:r>
-        <w:t xml:space="preserve"> </w:t>
-      </w:r>
-      <w:proofErr w:type="spellStart"/>
-      <w:r>
-        <w:t>thông</w:t>
-      </w:r>
-      <w:proofErr w:type="spellEnd"/>
-      <w:r>
-        <w:t xml:space="preserve"> tin </w:t>
-      </w:r>
-      <w:proofErr w:type="spellStart"/>
-      <w:r>
-        <w:t>khách</w:t>
-      </w:r>
-      <w:proofErr w:type="spellEnd"/>
-      <w:r>
-        <w:t xml:space="preserve"> </w:t>
-      </w:r>
-      <w:proofErr w:type="spellStart"/>
-      <w:r>
-        <w:t>hàng</w:t>
-      </w:r>
-      <w:proofErr w:type="spellEnd"/>
-      <w:r>
-        <w:t xml:space="preserve"> </w:t>
-      </w:r>
-      <w:proofErr w:type="spellStart"/>
-      <w:r>
-        <w:t>đã</w:t>
-      </w:r>
-      <w:proofErr w:type="spellEnd"/>
-      <w:r>
-        <w:t xml:space="preserve"> </w:t>
-      </w:r>
-      <w:proofErr w:type="spellStart"/>
-      <w:r>
-        <w:t>lưu</w:t>
-      </w:r>
-      <w:proofErr w:type="spellEnd"/>
-      <w:r>
+        <w:rPr>
+          <w:highlight w:val="yellow"/>
+        </w:rPr>
+        <w:t>tên</w:t>
+      </w:r>
+      <w:proofErr w:type="spellEnd"/>
+      <w:r>
+        <w:rPr>
+          <w:highlight w:val="yellow"/>
+        </w:rPr>
+        <w:t xml:space="preserve"> - </w:t>
+      </w:r>
+      <w:proofErr w:type="spellStart"/>
+      <w:r>
+        <w:rPr>
+          <w:highlight w:val="yellow"/>
+        </w:rPr>
+        <w:t>số</w:t>
+      </w:r>
+      <w:proofErr w:type="spellEnd"/>
+      <w:r>
+        <w:rPr>
+          <w:highlight w:val="yellow"/>
+        </w:rPr>
+        <w:t xml:space="preserve"> </w:t>
+      </w:r>
+      <w:proofErr w:type="spellStart"/>
+      <w:r>
+        <w:rPr>
+          <w:highlight w:val="yellow"/>
+        </w:rPr>
+        <w:t>điện</w:t>
+      </w:r>
+      <w:proofErr w:type="spellEnd"/>
+      <w:r>
+        <w:rPr>
+          <w:highlight w:val="yellow"/>
+        </w:rPr>
+        <w:t xml:space="preserve"> </w:t>
+      </w:r>
+      <w:proofErr w:type="spellStart"/>
+      <w:r>
+        <w:rPr>
+          <w:highlight w:val="yellow"/>
+        </w:rPr>
+        <w:t>thoại</w:t>
+      </w:r>
+      <w:proofErr w:type="spellEnd"/>
+      <w:r>
+        <w:rPr>
+          <w:highlight w:val="yellow"/>
+        </w:rPr>
         <w:t>)</w:t>
+      </w:r>
+      <w:r>
+        <w:rPr>
+          <w:highlight w:val="yellow"/>
+        </w:rPr>
+        <w:t xml:space="preserve"> (Load KH)</w:t>
       </w:r>
     </w:p>
     <w:p>
@@ -25012,77 +25022,190 @@
           <w:numId w:val="24"/>
         </w:numPr>
         <w:spacing w:after="160" w:line="259" w:lineRule="auto"/>
-      </w:pPr>
-      <w:proofErr w:type="spellStart"/>
-      <w:r>
+        <w:rPr>
+          <w:highlight w:val="yellow"/>
+        </w:rPr>
+      </w:pPr>
+      <w:proofErr w:type="spellStart"/>
+      <w:r>
+        <w:rPr>
+          <w:highlight w:val="yellow"/>
+        </w:rPr>
         <w:t>Thêm</w:t>
       </w:r>
       <w:proofErr w:type="spellEnd"/>
       <w:r>
-        <w:t xml:space="preserve"> </w:t>
-      </w:r>
-      <w:proofErr w:type="spellStart"/>
-      <w:r>
+        <w:rPr>
+          <w:highlight w:val="yellow"/>
+        </w:rPr>
+        <w:t xml:space="preserve"> </w:t>
+      </w:r>
+      <w:proofErr w:type="spellStart"/>
+      <w:r>
+        <w:rPr>
+          <w:highlight w:val="yellow"/>
+        </w:rPr>
         <w:t>lịch</w:t>
       </w:r>
       <w:proofErr w:type="spellEnd"/>
       <w:r>
-        <w:t xml:space="preserve"> </w:t>
-      </w:r>
-      <w:proofErr w:type="spellStart"/>
-      <w:r>
+        <w:rPr>
+          <w:highlight w:val="yellow"/>
+        </w:rPr>
+        <w:t xml:space="preserve"> </w:t>
+      </w:r>
+      <w:proofErr w:type="spellStart"/>
+      <w:r>
+        <w:rPr>
+          <w:highlight w:val="yellow"/>
+        </w:rPr>
         <w:t>đặt</w:t>
       </w:r>
       <w:proofErr w:type="spellEnd"/>
       <w:r>
-        <w:t xml:space="preserve"> </w:t>
-      </w:r>
-      <w:proofErr w:type="spellStart"/>
-      <w:r>
+        <w:rPr>
+          <w:highlight w:val="yellow"/>
+        </w:rPr>
+        <w:t xml:space="preserve"> </w:t>
+      </w:r>
+      <w:proofErr w:type="spellStart"/>
+      <w:r>
+        <w:rPr>
+          <w:highlight w:val="yellow"/>
+        </w:rPr>
+        <w:t>của</w:t>
+      </w:r>
+      <w:proofErr w:type="spellEnd"/>
+      <w:r>
+        <w:rPr>
+          <w:highlight w:val="yellow"/>
+        </w:rPr>
+        <w:t xml:space="preserve"> </w:t>
+      </w:r>
+      <w:proofErr w:type="spellStart"/>
+      <w:r>
+        <w:rPr>
+          <w:highlight w:val="yellow"/>
+        </w:rPr>
         <w:t>khách</w:t>
       </w:r>
       <w:proofErr w:type="spellEnd"/>
       <w:r>
-        <w:t xml:space="preserve"> </w:t>
-      </w:r>
-      <w:proofErr w:type="spellStart"/>
-      <w:r>
-        <w:t>mới</w:t>
-      </w:r>
-      <w:proofErr w:type="spellEnd"/>
-      <w:r>
-        <w:t xml:space="preserve"> (Lưu </w:t>
-      </w:r>
-      <w:proofErr w:type="spellStart"/>
-      <w:r>
+        <w:rPr>
+          <w:highlight w:val="yellow"/>
+        </w:rPr>
+        <w:t xml:space="preserve"> </w:t>
+      </w:r>
+      <w:proofErr w:type="spellStart"/>
+      <w:r>
+        <w:rPr>
+          <w:highlight w:val="yellow"/>
+        </w:rPr>
+        <w:t>cũ</w:t>
+      </w:r>
+      <w:proofErr w:type="spellEnd"/>
+      <w:r>
+        <w:rPr>
+          <w:highlight w:val="yellow"/>
+        </w:rPr>
+        <w:t xml:space="preserve"> (</w:t>
+      </w:r>
+      <w:proofErr w:type="spellStart"/>
+      <w:r>
+        <w:rPr>
+          <w:highlight w:val="yellow"/>
+        </w:rPr>
+        <w:t>dựa</w:t>
+      </w:r>
+      <w:proofErr w:type="spellEnd"/>
+      <w:r>
+        <w:rPr>
+          <w:highlight w:val="yellow"/>
+        </w:rPr>
+        <w:t xml:space="preserve"> </w:t>
+      </w:r>
+      <w:proofErr w:type="spellStart"/>
+      <w:r>
+        <w:rPr>
+          <w:highlight w:val="yellow"/>
+        </w:rPr>
+        <w:t>theo</w:t>
+      </w:r>
+      <w:proofErr w:type="spellEnd"/>
+      <w:r>
+        <w:rPr>
+          <w:highlight w:val="yellow"/>
+        </w:rPr>
+        <w:t xml:space="preserve"> </w:t>
+      </w:r>
+      <w:proofErr w:type="spellStart"/>
+      <w:r>
+        <w:rPr>
+          <w:highlight w:val="yellow"/>
+        </w:rPr>
         <w:t>thông</w:t>
       </w:r>
       <w:proofErr w:type="spellEnd"/>
       <w:r>
+        <w:rPr>
+          <w:highlight w:val="yellow"/>
+        </w:rPr>
         <w:t xml:space="preserve"> tin </w:t>
       </w:r>
       <w:proofErr w:type="spellStart"/>
       <w:r>
+        <w:rPr>
+          <w:highlight w:val="yellow"/>
+        </w:rPr>
         <w:t>khách</w:t>
       </w:r>
       <w:proofErr w:type="spellEnd"/>
       <w:r>
-        <w:t xml:space="preserve"> </w:t>
-      </w:r>
-      <w:proofErr w:type="spellStart"/>
-      <w:r>
+        <w:rPr>
+          <w:highlight w:val="yellow"/>
+        </w:rPr>
+        <w:t xml:space="preserve"> </w:t>
+      </w:r>
+      <w:proofErr w:type="spellStart"/>
+      <w:r>
+        <w:rPr>
+          <w:highlight w:val="yellow"/>
+        </w:rPr>
         <w:t>hàng</w:t>
       </w:r>
       <w:proofErr w:type="spellEnd"/>
       <w:r>
-        <w:t xml:space="preserve"> </w:t>
-      </w:r>
-      <w:proofErr w:type="spellStart"/>
-      <w:r>
-        <w:t>mới</w:t>
-      </w:r>
-      <w:proofErr w:type="spellEnd"/>
-      <w:r>
+        <w:rPr>
+          <w:highlight w:val="yellow"/>
+        </w:rPr>
+        <w:t xml:space="preserve"> </w:t>
+      </w:r>
+      <w:proofErr w:type="spellStart"/>
+      <w:r>
+        <w:rPr>
+          <w:highlight w:val="yellow"/>
+        </w:rPr>
+        <w:t>đã</w:t>
+      </w:r>
+      <w:proofErr w:type="spellEnd"/>
+      <w:r>
+        <w:rPr>
+          <w:highlight w:val="yellow"/>
+        </w:rPr>
+        <w:t xml:space="preserve"> </w:t>
+      </w:r>
+      <w:proofErr w:type="spellStart"/>
+      <w:r>
+        <w:rPr>
+          <w:highlight w:val="yellow"/>
+        </w:rPr>
+        <w:t>lưu</w:t>
+      </w:r>
+      <w:proofErr w:type="spellEnd"/>
+      <w:r>
+        <w:rPr>
+          <w:highlight w:val="yellow"/>
+        </w:rPr>
         <w:t>)</w:t>
       </w:r>
     </w:p>
@@ -25094,36 +25217,136 @@
           <w:numId w:val="24"/>
         </w:numPr>
         <w:spacing w:after="160" w:line="259" w:lineRule="auto"/>
-      </w:pPr>
-      <w:proofErr w:type="spellStart"/>
-      <w:r>
-        <w:t>Sửa</w:t>
-      </w:r>
-      <w:proofErr w:type="spellEnd"/>
-      <w:r>
-        <w:t xml:space="preserve"> </w:t>
-      </w:r>
-      <w:proofErr w:type="spellStart"/>
-      <w:r>
+        <w:rPr>
+          <w:highlight w:val="yellow"/>
+        </w:rPr>
+      </w:pPr>
+      <w:proofErr w:type="spellStart"/>
+      <w:r>
+        <w:rPr>
+          <w:highlight w:val="yellow"/>
+        </w:rPr>
+        <w:t>Thêm</w:t>
+      </w:r>
+      <w:proofErr w:type="spellEnd"/>
+      <w:r>
+        <w:rPr>
+          <w:highlight w:val="yellow"/>
+        </w:rPr>
+        <w:t xml:space="preserve"> </w:t>
+      </w:r>
+      <w:proofErr w:type="spellStart"/>
+      <w:r>
+        <w:rPr>
+          <w:highlight w:val="yellow"/>
+        </w:rPr>
+        <w:t>lịch</w:t>
+      </w:r>
+      <w:proofErr w:type="spellEnd"/>
+      <w:r>
+        <w:rPr>
+          <w:highlight w:val="yellow"/>
+        </w:rPr>
+        <w:t xml:space="preserve"> </w:t>
+      </w:r>
+      <w:proofErr w:type="spellStart"/>
+      <w:r>
+        <w:rPr>
+          <w:highlight w:val="yellow"/>
+        </w:rPr>
+        <w:t>đặt</w:t>
+      </w:r>
+      <w:proofErr w:type="spellEnd"/>
+      <w:r>
+        <w:rPr>
+          <w:highlight w:val="yellow"/>
+        </w:rPr>
+        <w:t xml:space="preserve"> </w:t>
+      </w:r>
+      <w:proofErr w:type="spellStart"/>
+      <w:r>
+        <w:rPr>
+          <w:highlight w:val="yellow"/>
+        </w:rPr>
+        <w:t>khách</w:t>
+      </w:r>
+      <w:proofErr w:type="spellEnd"/>
+      <w:r>
+        <w:rPr>
+          <w:highlight w:val="yellow"/>
+        </w:rPr>
+        <w:t xml:space="preserve"> </w:t>
+      </w:r>
+      <w:proofErr w:type="spellStart"/>
+      <w:r>
+        <w:rPr>
+          <w:highlight w:val="yellow"/>
+        </w:rPr>
+        <w:t>mới</w:t>
+      </w:r>
+      <w:proofErr w:type="spellEnd"/>
+      <w:r>
+        <w:rPr>
+          <w:highlight w:val="yellow"/>
+        </w:rPr>
+        <w:t xml:space="preserve"> (Lưu </w:t>
+      </w:r>
+      <w:proofErr w:type="spellStart"/>
+      <w:r>
+        <w:rPr>
+          <w:highlight w:val="yellow"/>
+        </w:rPr>
         <w:t>thông</w:t>
       </w:r>
       <w:proofErr w:type="spellEnd"/>
       <w:r>
+        <w:rPr>
+          <w:highlight w:val="yellow"/>
+        </w:rPr>
         <w:t xml:space="preserve"> tin </w:t>
       </w:r>
       <w:proofErr w:type="spellStart"/>
       <w:r>
-        <w:t>lịch</w:t>
-      </w:r>
-      <w:proofErr w:type="spellEnd"/>
-      <w:r>
-        <w:t xml:space="preserve"> </w:t>
-      </w:r>
-      <w:proofErr w:type="spellStart"/>
-      <w:r>
-        <w:t>đặt</w:t>
-      </w:r>
-      <w:proofErr w:type="spellEnd"/>
+        <w:rPr>
+          <w:highlight w:val="yellow"/>
+        </w:rPr>
+        <w:t>khách</w:t>
+      </w:r>
+      <w:proofErr w:type="spellEnd"/>
+      <w:r>
+        <w:rPr>
+          <w:highlight w:val="yellow"/>
+        </w:rPr>
+        <w:t xml:space="preserve"> </w:t>
+      </w:r>
+      <w:proofErr w:type="spellStart"/>
+      <w:r>
+        <w:rPr>
+          <w:highlight w:val="yellow"/>
+        </w:rPr>
+        <w:t>hàng</w:t>
+      </w:r>
+      <w:proofErr w:type="spellEnd"/>
+      <w:r>
+        <w:rPr>
+          <w:highlight w:val="yellow"/>
+        </w:rPr>
+        <w:t xml:space="preserve"> </w:t>
+      </w:r>
+      <w:proofErr w:type="spellStart"/>
+      <w:r>
+        <w:rPr>
+          <w:highlight w:val="yellow"/>
+        </w:rPr>
+        <w:t>mới</w:t>
+      </w:r>
+      <w:proofErr w:type="spellEnd"/>
+      <w:r>
+        <w:rPr>
+          <w:highlight w:val="yellow"/>
+        </w:rPr>
+        <w:t>)</w:t>
+      </w:r>
     </w:p>
     <w:p>
       <w:pPr>
@@ -25133,37 +25356,127 @@
           <w:numId w:val="24"/>
         </w:numPr>
         <w:spacing w:after="160" w:line="259" w:lineRule="auto"/>
-      </w:pPr>
-      <w:proofErr w:type="spellStart"/>
-      <w:r>
+        <w:rPr>
+          <w:highlight w:val="yellow"/>
+        </w:rPr>
+      </w:pPr>
+      <w:proofErr w:type="spellStart"/>
+      <w:r>
+        <w:rPr>
+          <w:highlight w:val="yellow"/>
+        </w:rPr>
+        <w:t>Sửa</w:t>
+      </w:r>
+      <w:proofErr w:type="spellEnd"/>
+      <w:r>
+        <w:rPr>
+          <w:highlight w:val="yellow"/>
+        </w:rPr>
+        <w:t xml:space="preserve"> </w:t>
+      </w:r>
+      <w:proofErr w:type="spellStart"/>
+      <w:r>
+        <w:rPr>
+          <w:highlight w:val="yellow"/>
+        </w:rPr>
+        <w:t>thông</w:t>
+      </w:r>
+      <w:proofErr w:type="spellEnd"/>
+      <w:r>
+        <w:rPr>
+          <w:highlight w:val="yellow"/>
+        </w:rPr>
+        <w:t xml:space="preserve"> tin </w:t>
+      </w:r>
+      <w:proofErr w:type="spellStart"/>
+      <w:r>
+        <w:rPr>
+          <w:highlight w:val="yellow"/>
+        </w:rPr>
+        <w:t>lịch</w:t>
+      </w:r>
+      <w:proofErr w:type="spellEnd"/>
+      <w:r>
+        <w:rPr>
+          <w:highlight w:val="yellow"/>
+        </w:rPr>
+        <w:t xml:space="preserve"> </w:t>
+      </w:r>
+      <w:proofErr w:type="spellStart"/>
+      <w:r>
+        <w:rPr>
+          <w:highlight w:val="yellow"/>
+        </w:rPr>
+        <w:t>đặt</w:t>
+      </w:r>
+      <w:proofErr w:type="spellEnd"/>
+    </w:p>
+    <w:p>
+      <w:pPr>
+        <w:pStyle w:val="ListParagraph"/>
+        <w:numPr>
+          <w:ilvl w:val="1"/>
+          <w:numId w:val="24"/>
+        </w:numPr>
+        <w:spacing w:after="160" w:line="259" w:lineRule="auto"/>
+        <w:rPr>
+          <w:highlight w:val="yellow"/>
+        </w:rPr>
+      </w:pPr>
+      <w:proofErr w:type="spellStart"/>
+      <w:r>
+        <w:rPr>
+          <w:highlight w:val="yellow"/>
+        </w:rPr>
         <w:t>Xoá</w:t>
       </w:r>
       <w:proofErr w:type="spellEnd"/>
       <w:r>
+        <w:rPr>
+          <w:highlight w:val="yellow"/>
+        </w:rPr>
         <w:t xml:space="preserve"> (</w:t>
       </w:r>
       <w:proofErr w:type="spellStart"/>
       <w:r>
+        <w:rPr>
+          <w:highlight w:val="yellow"/>
+        </w:rPr>
         <w:t>Huỷ</w:t>
       </w:r>
       <w:proofErr w:type="spellEnd"/>
       <w:r>
-        <w:t xml:space="preserve"> </w:t>
-      </w:r>
-      <w:proofErr w:type="spellStart"/>
-      <w:r>
+        <w:rPr>
+          <w:highlight w:val="yellow"/>
+        </w:rPr>
+        <w:t xml:space="preserve"> </w:t>
+      </w:r>
+      <w:proofErr w:type="spellStart"/>
+      <w:r>
+        <w:rPr>
+          <w:highlight w:val="yellow"/>
+        </w:rPr>
         <w:t>lịch</w:t>
       </w:r>
       <w:proofErr w:type="spellEnd"/>
       <w:r>
-        <w:t xml:space="preserve"> </w:t>
-      </w:r>
-      <w:proofErr w:type="spellStart"/>
-      <w:r>
+        <w:rPr>
+          <w:highlight w:val="yellow"/>
+        </w:rPr>
+        <w:t xml:space="preserve"> </w:t>
+      </w:r>
+      <w:proofErr w:type="spellStart"/>
+      <w:r>
+        <w:rPr>
+          <w:highlight w:val="yellow"/>
+        </w:rPr>
         <w:t>đặt</w:t>
       </w:r>
       <w:proofErr w:type="spellEnd"/>
       <w:r>
+        <w:rPr>
+          <w:highlight w:val="yellow"/>
+        </w:rPr>
         <w:t>)</w:t>
       </w:r>
     </w:p>

</xml_diff>

<commit_message>
Xây dựng các store procedure trang Nhân/trả phòng, và chỉnh sửa giao diện trang Nhận/trả phòng, thêm thao tác Gia hạn và Gọi DV
</commit_message>
<xml_diff>
--- a/Documents/Quản lý khách sạn(Phân tích).docx
+++ b/Documents/Quản lý khách sạn(Phân tích).docx
@@ -25529,80 +25529,140 @@
           <w:numId w:val="24"/>
         </w:numPr>
         <w:spacing w:after="160" w:line="259" w:lineRule="auto"/>
-      </w:pPr>
-      <w:r>
+        <w:rPr>
+          <w:highlight w:val="yellow"/>
+        </w:rPr>
+      </w:pPr>
+      <w:r>
+        <w:rPr>
+          <w:highlight w:val="yellow"/>
+        </w:rPr>
         <w:t xml:space="preserve">Load </w:t>
       </w:r>
       <w:proofErr w:type="spellStart"/>
       <w:r>
+        <w:rPr>
+          <w:highlight w:val="yellow"/>
+        </w:rPr>
         <w:t>thông</w:t>
       </w:r>
       <w:proofErr w:type="spellEnd"/>
       <w:r>
+        <w:rPr>
+          <w:highlight w:val="yellow"/>
+        </w:rPr>
         <w:t xml:space="preserve"> tin </w:t>
       </w:r>
       <w:proofErr w:type="spellStart"/>
       <w:r>
+        <w:rPr>
+          <w:highlight w:val="yellow"/>
+        </w:rPr>
         <w:t>khách</w:t>
       </w:r>
       <w:proofErr w:type="spellEnd"/>
       <w:r>
-        <w:t xml:space="preserve"> </w:t>
-      </w:r>
-      <w:proofErr w:type="spellStart"/>
-      <w:r>
+        <w:rPr>
+          <w:highlight w:val="yellow"/>
+        </w:rPr>
+        <w:t xml:space="preserve"> </w:t>
+      </w:r>
+      <w:proofErr w:type="spellStart"/>
+      <w:r>
+        <w:rPr>
+          <w:highlight w:val="yellow"/>
+        </w:rPr>
         <w:t>hàng</w:t>
       </w:r>
       <w:proofErr w:type="spellEnd"/>
       <w:r>
-        <w:t xml:space="preserve"> </w:t>
-      </w:r>
-      <w:proofErr w:type="spellStart"/>
-      <w:r>
+        <w:rPr>
+          <w:highlight w:val="yellow"/>
+        </w:rPr>
+        <w:t xml:space="preserve"> </w:t>
+      </w:r>
+      <w:proofErr w:type="spellStart"/>
+      <w:r>
+        <w:rPr>
+          <w:highlight w:val="yellow"/>
+        </w:rPr>
         <w:t>đang</w:t>
       </w:r>
       <w:proofErr w:type="spellEnd"/>
       <w:r>
-        <w:t xml:space="preserve"> </w:t>
-      </w:r>
-      <w:proofErr w:type="spellStart"/>
-      <w:r>
+        <w:rPr>
+          <w:highlight w:val="yellow"/>
+        </w:rPr>
+        <w:t xml:space="preserve"> </w:t>
+      </w:r>
+      <w:proofErr w:type="spellStart"/>
+      <w:r>
+        <w:rPr>
+          <w:highlight w:val="yellow"/>
+        </w:rPr>
         <w:t>lưu</w:t>
       </w:r>
       <w:proofErr w:type="spellEnd"/>
       <w:r>
-        <w:t xml:space="preserve"> </w:t>
-      </w:r>
-      <w:proofErr w:type="spellStart"/>
-      <w:r>
+        <w:rPr>
+          <w:highlight w:val="yellow"/>
+        </w:rPr>
+        <w:t xml:space="preserve"> </w:t>
+      </w:r>
+      <w:proofErr w:type="spellStart"/>
+      <w:r>
+        <w:rPr>
+          <w:highlight w:val="yellow"/>
+        </w:rPr>
         <w:t>trú</w:t>
       </w:r>
       <w:proofErr w:type="spellEnd"/>
       <w:r>
+        <w:rPr>
+          <w:highlight w:val="yellow"/>
+        </w:rPr>
         <w:t xml:space="preserve"> (</w:t>
       </w:r>
       <w:proofErr w:type="spellStart"/>
       <w:r>
+        <w:rPr>
+          <w:highlight w:val="yellow"/>
+        </w:rPr>
         <w:t>Tên</w:t>
       </w:r>
       <w:proofErr w:type="spellEnd"/>
       <w:r>
+        <w:rPr>
+          <w:highlight w:val="yellow"/>
+        </w:rPr>
         <w:t xml:space="preserve"> KH, </w:t>
       </w:r>
       <w:proofErr w:type="spellStart"/>
       <w:r>
+        <w:rPr>
+          <w:highlight w:val="yellow"/>
+        </w:rPr>
         <w:t>phòng-kiểu</w:t>
       </w:r>
       <w:proofErr w:type="spellEnd"/>
       <w:r>
-        <w:t xml:space="preserve"> </w:t>
-      </w:r>
-      <w:proofErr w:type="spellStart"/>
-      <w:r>
+        <w:rPr>
+          <w:highlight w:val="yellow"/>
+        </w:rPr>
+        <w:t xml:space="preserve"> </w:t>
+      </w:r>
+      <w:proofErr w:type="spellStart"/>
+      <w:r>
+        <w:rPr>
+          <w:highlight w:val="yellow"/>
+        </w:rPr>
         <w:t>phòng</w:t>
       </w:r>
       <w:proofErr w:type="spellEnd"/>
       <w:r>
+        <w:rPr>
+          <w:highlight w:val="yellow"/>
+        </w:rPr>
         <w:t>, CI/CO)</w:t>
       </w:r>
     </w:p>
@@ -25614,48 +25674,84 @@
           <w:numId w:val="24"/>
         </w:numPr>
         <w:spacing w:after="160" w:line="259" w:lineRule="auto"/>
-      </w:pPr>
-      <w:r>
+        <w:rPr>
+          <w:highlight w:val="yellow"/>
+        </w:rPr>
+      </w:pPr>
+      <w:r>
+        <w:rPr>
+          <w:highlight w:val="yellow"/>
+        </w:rPr>
         <w:t xml:space="preserve">Load </w:t>
       </w:r>
       <w:proofErr w:type="spellStart"/>
       <w:r>
+        <w:rPr>
+          <w:highlight w:val="yellow"/>
+        </w:rPr>
         <w:t>thông</w:t>
       </w:r>
       <w:proofErr w:type="spellEnd"/>
       <w:r>
+        <w:rPr>
+          <w:highlight w:val="yellow"/>
+        </w:rPr>
         <w:t xml:space="preserve"> tin KH </w:t>
       </w:r>
       <w:proofErr w:type="spellStart"/>
       <w:r>
+        <w:rPr>
+          <w:highlight w:val="yellow"/>
+        </w:rPr>
         <w:t>chờ</w:t>
       </w:r>
       <w:proofErr w:type="spellEnd"/>
       <w:r>
+        <w:rPr>
+          <w:highlight w:val="yellow"/>
+        </w:rPr>
         <w:t xml:space="preserve"> CI (</w:t>
       </w:r>
       <w:proofErr w:type="spellStart"/>
       <w:r>
+        <w:rPr>
+          <w:highlight w:val="yellow"/>
+        </w:rPr>
         <w:t>Tên</w:t>
       </w:r>
       <w:proofErr w:type="spellEnd"/>
       <w:r>
+        <w:rPr>
+          <w:highlight w:val="yellow"/>
+        </w:rPr>
         <w:t xml:space="preserve"> KH, </w:t>
       </w:r>
       <w:proofErr w:type="spellStart"/>
       <w:r>
+        <w:rPr>
+          <w:highlight w:val="yellow"/>
+        </w:rPr>
         <w:t>kiểu</w:t>
       </w:r>
       <w:proofErr w:type="spellEnd"/>
       <w:r>
-        <w:t xml:space="preserve"> </w:t>
-      </w:r>
-      <w:proofErr w:type="spellStart"/>
-      <w:r>
+        <w:rPr>
+          <w:highlight w:val="yellow"/>
+        </w:rPr>
+        <w:t xml:space="preserve"> </w:t>
+      </w:r>
+      <w:proofErr w:type="spellStart"/>
+      <w:r>
+        <w:rPr>
+          <w:highlight w:val="yellow"/>
+        </w:rPr>
         <w:t>phòng</w:t>
       </w:r>
       <w:proofErr w:type="spellEnd"/>
       <w:r>
+        <w:rPr>
+          <w:highlight w:val="yellow"/>
+        </w:rPr>
         <w:t>, CI/CO)</w:t>
       </w:r>
     </w:p>
@@ -25667,53 +25763,92 @@
           <w:numId w:val="24"/>
         </w:numPr>
         <w:spacing w:after="160" w:line="259" w:lineRule="auto"/>
-      </w:pPr>
-      <w:proofErr w:type="spellStart"/>
-      <w:r>
+        <w:rPr>
+          <w:highlight w:val="yellow"/>
+        </w:rPr>
+      </w:pPr>
+      <w:proofErr w:type="spellStart"/>
+      <w:r>
+        <w:rPr>
+          <w:highlight w:val="yellow"/>
+        </w:rPr>
         <w:t>CheckIn</w:t>
       </w:r>
       <w:proofErr w:type="spellEnd"/>
       <w:r>
-        <w:t xml:space="preserve"> </w:t>
-      </w:r>
-      <w:proofErr w:type="spellStart"/>
-      <w:r>
+        <w:rPr>
+          <w:highlight w:val="yellow"/>
+        </w:rPr>
+        <w:t xml:space="preserve"> </w:t>
+      </w:r>
+      <w:proofErr w:type="spellStart"/>
+      <w:r>
+        <w:rPr>
+          <w:highlight w:val="yellow"/>
+        </w:rPr>
         <w:t>theo</w:t>
       </w:r>
       <w:proofErr w:type="spellEnd"/>
       <w:r>
-        <w:t xml:space="preserve"> </w:t>
-      </w:r>
-      <w:proofErr w:type="spellStart"/>
-      <w:r>
+        <w:rPr>
+          <w:highlight w:val="yellow"/>
+        </w:rPr>
+        <w:t xml:space="preserve"> </w:t>
+      </w:r>
+      <w:proofErr w:type="spellStart"/>
+      <w:r>
+        <w:rPr>
+          <w:highlight w:val="yellow"/>
+        </w:rPr>
         <w:t>lịch</w:t>
       </w:r>
       <w:proofErr w:type="spellEnd"/>
       <w:r>
-        <w:t xml:space="preserve"> </w:t>
-      </w:r>
-      <w:proofErr w:type="spellStart"/>
-      <w:r>
+        <w:rPr>
+          <w:highlight w:val="yellow"/>
+        </w:rPr>
+        <w:t xml:space="preserve"> </w:t>
+      </w:r>
+      <w:proofErr w:type="spellStart"/>
+      <w:r>
+        <w:rPr>
+          <w:highlight w:val="yellow"/>
+        </w:rPr>
         <w:t>đặt</w:t>
       </w:r>
       <w:proofErr w:type="spellEnd"/>
       <w:r>
+        <w:rPr>
+          <w:highlight w:val="yellow"/>
+        </w:rPr>
         <w:t xml:space="preserve"> (</w:t>
       </w:r>
       <w:proofErr w:type="spellStart"/>
       <w:r>
+        <w:rPr>
+          <w:highlight w:val="yellow"/>
+        </w:rPr>
         <w:t>chọn</w:t>
       </w:r>
       <w:proofErr w:type="spellEnd"/>
       <w:r>
-        <w:t xml:space="preserve"> </w:t>
-      </w:r>
-      <w:proofErr w:type="spellStart"/>
-      <w:r>
+        <w:rPr>
+          <w:highlight w:val="yellow"/>
+        </w:rPr>
+        <w:t xml:space="preserve"> </w:t>
+      </w:r>
+      <w:proofErr w:type="spellStart"/>
+      <w:r>
+        <w:rPr>
+          <w:highlight w:val="yellow"/>
+        </w:rPr>
         <w:t>phòng</w:t>
       </w:r>
       <w:proofErr w:type="spellEnd"/>
       <w:r>
+        <w:rPr>
+          <w:highlight w:val="yellow"/>
+        </w:rPr>
         <w:t>)</w:t>
       </w:r>
     </w:p>
@@ -25725,53 +25860,92 @@
           <w:numId w:val="24"/>
         </w:numPr>
         <w:spacing w:after="160" w:line="259" w:lineRule="auto"/>
-      </w:pPr>
-      <w:proofErr w:type="spellStart"/>
-      <w:r>
+        <w:rPr>
+          <w:highlight w:val="yellow"/>
+        </w:rPr>
+      </w:pPr>
+      <w:proofErr w:type="spellStart"/>
+      <w:r>
+        <w:rPr>
+          <w:highlight w:val="yellow"/>
+        </w:rPr>
         <w:t>CheckIn</w:t>
       </w:r>
       <w:proofErr w:type="spellEnd"/>
       <w:r>
+        <w:rPr>
+          <w:highlight w:val="yellow"/>
+        </w:rPr>
         <w:t xml:space="preserve"> Walkin (Thông tin KH, </w:t>
       </w:r>
       <w:proofErr w:type="spellStart"/>
       <w:r>
+        <w:rPr>
+          <w:highlight w:val="yellow"/>
+        </w:rPr>
         <w:t>Phòng-Kiểu</w:t>
       </w:r>
       <w:proofErr w:type="spellEnd"/>
       <w:r>
-        <w:t xml:space="preserve"> </w:t>
-      </w:r>
-      <w:proofErr w:type="spellStart"/>
-      <w:r>
+        <w:rPr>
+          <w:highlight w:val="yellow"/>
+        </w:rPr>
+        <w:t xml:space="preserve"> </w:t>
+      </w:r>
+      <w:proofErr w:type="spellStart"/>
+      <w:r>
+        <w:rPr>
+          <w:highlight w:val="yellow"/>
+        </w:rPr>
         <w:t>phòng</w:t>
       </w:r>
       <w:proofErr w:type="spellEnd"/>
       <w:r>
+        <w:rPr>
+          <w:highlight w:val="yellow"/>
+        </w:rPr>
         <w:t xml:space="preserve">, </w:t>
       </w:r>
       <w:proofErr w:type="spellStart"/>
       <w:r>
+        <w:rPr>
+          <w:highlight w:val="yellow"/>
+        </w:rPr>
         <w:t>Ngày</w:t>
       </w:r>
       <w:proofErr w:type="spellEnd"/>
       <w:r>
+        <w:rPr>
+          <w:highlight w:val="yellow"/>
+        </w:rPr>
         <w:t xml:space="preserve"> CO </w:t>
       </w:r>
       <w:proofErr w:type="spellStart"/>
       <w:r>
+        <w:rPr>
+          <w:highlight w:val="yellow"/>
+        </w:rPr>
         <w:t>dự</w:t>
       </w:r>
       <w:proofErr w:type="spellEnd"/>
       <w:r>
-        <w:t xml:space="preserve"> </w:t>
-      </w:r>
-      <w:proofErr w:type="spellStart"/>
-      <w:r>
+        <w:rPr>
+          <w:highlight w:val="yellow"/>
+        </w:rPr>
+        <w:t xml:space="preserve"> </w:t>
+      </w:r>
+      <w:proofErr w:type="spellStart"/>
+      <w:r>
+        <w:rPr>
+          <w:highlight w:val="yellow"/>
+        </w:rPr>
         <w:t>kiến</w:t>
       </w:r>
       <w:proofErr w:type="spellEnd"/>
       <w:r>
+        <w:rPr>
+          <w:highlight w:val="yellow"/>
+        </w:rPr>
         <w:t>)</w:t>
       </w:r>
     </w:p>
@@ -25783,17 +25957,29 @@
           <w:numId w:val="24"/>
         </w:numPr>
         <w:spacing w:after="160" w:line="259" w:lineRule="auto"/>
-      </w:pPr>
-      <w:proofErr w:type="spellStart"/>
-      <w:r>
+        <w:rPr>
+          <w:highlight w:val="yellow"/>
+        </w:rPr>
+      </w:pPr>
+      <w:proofErr w:type="spellStart"/>
+      <w:r>
+        <w:rPr>
+          <w:highlight w:val="yellow"/>
+        </w:rPr>
         <w:t>Chuyển</w:t>
       </w:r>
       <w:proofErr w:type="spellEnd"/>
       <w:r>
-        <w:t xml:space="preserve"> </w:t>
-      </w:r>
-      <w:proofErr w:type="spellStart"/>
-      <w:r>
+        <w:rPr>
+          <w:highlight w:val="yellow"/>
+        </w:rPr>
+        <w:t xml:space="preserve"> </w:t>
+      </w:r>
+      <w:proofErr w:type="spellStart"/>
+      <w:r>
+        <w:rPr>
+          <w:highlight w:val="yellow"/>
+        </w:rPr>
         <w:t>phòng</w:t>
       </w:r>
       <w:proofErr w:type="spellEnd"/>
@@ -25806,12 +25992,21 @@
           <w:numId w:val="24"/>
         </w:numPr>
         <w:spacing w:after="160" w:line="259" w:lineRule="auto"/>
-      </w:pPr>
-      <w:r>
+        <w:rPr>
+          <w:highlight w:val="yellow"/>
+        </w:rPr>
+      </w:pPr>
+      <w:r>
+        <w:rPr>
+          <w:highlight w:val="yellow"/>
+        </w:rPr>
         <w:t xml:space="preserve">Gia </w:t>
       </w:r>
       <w:proofErr w:type="spellStart"/>
       <w:r>
+        <w:rPr>
+          <w:highlight w:val="yellow"/>
+        </w:rPr>
         <w:t>hạn</w:t>
       </w:r>
       <w:proofErr w:type="spellEnd"/>

</xml_diff>

<commit_message>
Xây dựng store procedure thêm, sửa, xoá DV, minibar, phạt
</commit_message>
<xml_diff>
--- a/Documents/Quản lý khách sạn(Phân tích).docx
+++ b/Documents/Quản lý khách sạn(Phân tích).docx
@@ -24693,20 +24693,35 @@
           <w:numId w:val="24"/>
         </w:numPr>
         <w:spacing w:after="160" w:line="259" w:lineRule="auto"/>
-      </w:pPr>
-      <w:r>
+        <w:rPr>
+          <w:highlight w:val="yellow"/>
+        </w:rPr>
+      </w:pPr>
+      <w:r>
+        <w:rPr>
+          <w:highlight w:val="yellow"/>
+        </w:rPr>
         <w:t xml:space="preserve">Trang </w:t>
       </w:r>
       <w:proofErr w:type="spellStart"/>
       <w:r>
+        <w:rPr>
+          <w:highlight w:val="yellow"/>
+        </w:rPr>
         <w:t>Đặt</w:t>
       </w:r>
       <w:proofErr w:type="spellEnd"/>
       <w:r>
-        <w:t xml:space="preserve"> </w:t>
-      </w:r>
-      <w:proofErr w:type="spellStart"/>
-      <w:r>
+        <w:rPr>
+          <w:highlight w:val="yellow"/>
+        </w:rPr>
+        <w:t xml:space="preserve"> </w:t>
+      </w:r>
+      <w:proofErr w:type="spellStart"/>
+      <w:r>
+        <w:rPr>
+          <w:highlight w:val="yellow"/>
+        </w:rPr>
         <w:t>phòng</w:t>
       </w:r>
       <w:proofErr w:type="spellEnd"/>
@@ -25495,28 +25510,49 @@
           <w:numId w:val="24"/>
         </w:numPr>
         <w:spacing w:after="160" w:line="259" w:lineRule="auto"/>
-      </w:pPr>
-      <w:r>
+        <w:rPr>
+          <w:highlight w:val="yellow"/>
+        </w:rPr>
+      </w:pPr>
+      <w:r>
+        <w:rPr>
+          <w:highlight w:val="yellow"/>
+        </w:rPr>
         <w:t xml:space="preserve">Trang </w:t>
       </w:r>
       <w:proofErr w:type="spellStart"/>
       <w:r>
+        <w:rPr>
+          <w:highlight w:val="yellow"/>
+        </w:rPr>
         <w:t>Nhận</w:t>
       </w:r>
       <w:proofErr w:type="spellEnd"/>
       <w:r>
+        <w:rPr>
+          <w:highlight w:val="yellow"/>
+        </w:rPr>
         <w:t>/</w:t>
       </w:r>
       <w:proofErr w:type="spellStart"/>
       <w:r>
+        <w:rPr>
+          <w:highlight w:val="yellow"/>
+        </w:rPr>
         <w:t>trả</w:t>
       </w:r>
       <w:proofErr w:type="spellEnd"/>
       <w:r>
-        <w:t xml:space="preserve"> </w:t>
-      </w:r>
-      <w:proofErr w:type="spellStart"/>
-      <w:r>
+        <w:rPr>
+          <w:highlight w:val="yellow"/>
+        </w:rPr>
+        <w:t xml:space="preserve"> </w:t>
+      </w:r>
+      <w:proofErr w:type="spellStart"/>
+      <w:r>
+        <w:rPr>
+          <w:highlight w:val="yellow"/>
+        </w:rPr>
         <w:t>phòng</w:t>
       </w:r>
       <w:proofErr w:type="spellEnd"/>
@@ -26019,61 +26055,106 @@
           <w:numId w:val="24"/>
         </w:numPr>
         <w:spacing w:after="160" w:line="259" w:lineRule="auto"/>
-      </w:pPr>
-      <w:proofErr w:type="spellStart"/>
-      <w:r>
+        <w:rPr>
+          <w:highlight w:val="yellow"/>
+        </w:rPr>
+      </w:pPr>
+      <w:proofErr w:type="spellStart"/>
+      <w:r>
+        <w:rPr>
+          <w:highlight w:val="yellow"/>
+        </w:rPr>
         <w:t>Gọi</w:t>
       </w:r>
       <w:proofErr w:type="spellEnd"/>
       <w:r>
-        <w:t xml:space="preserve"> </w:t>
-      </w:r>
-      <w:proofErr w:type="spellStart"/>
-      <w:r>
+        <w:rPr>
+          <w:highlight w:val="yellow"/>
+        </w:rPr>
+        <w:t xml:space="preserve"> </w:t>
+      </w:r>
+      <w:proofErr w:type="spellStart"/>
+      <w:r>
+        <w:rPr>
+          <w:highlight w:val="yellow"/>
+        </w:rPr>
         <w:t>dịch</w:t>
       </w:r>
       <w:proofErr w:type="spellEnd"/>
       <w:r>
-        <w:t xml:space="preserve"> </w:t>
-      </w:r>
-      <w:proofErr w:type="spellStart"/>
-      <w:r>
+        <w:rPr>
+          <w:highlight w:val="yellow"/>
+        </w:rPr>
+        <w:t xml:space="preserve"> </w:t>
+      </w:r>
+      <w:proofErr w:type="spellStart"/>
+      <w:r>
+        <w:rPr>
+          <w:highlight w:val="yellow"/>
+        </w:rPr>
         <w:t>vụ</w:t>
       </w:r>
       <w:proofErr w:type="spellEnd"/>
       <w:r>
+        <w:rPr>
+          <w:highlight w:val="yellow"/>
+        </w:rPr>
         <w:t xml:space="preserve"> (</w:t>
       </w:r>
       <w:proofErr w:type="spellStart"/>
       <w:r>
+        <w:rPr>
+          <w:highlight w:val="yellow"/>
+        </w:rPr>
         <w:t>Sử</w:t>
       </w:r>
       <w:proofErr w:type="spellEnd"/>
       <w:r>
-        <w:t xml:space="preserve"> </w:t>
-      </w:r>
-      <w:proofErr w:type="spellStart"/>
-      <w:r>
+        <w:rPr>
+          <w:highlight w:val="yellow"/>
+        </w:rPr>
+        <w:t xml:space="preserve"> </w:t>
+      </w:r>
+      <w:proofErr w:type="spellStart"/>
+      <w:r>
+        <w:rPr>
+          <w:highlight w:val="yellow"/>
+        </w:rPr>
         <w:t>dụng</w:t>
       </w:r>
       <w:proofErr w:type="spellEnd"/>
       <w:r>
-        <w:t xml:space="preserve"> </w:t>
-      </w:r>
-      <w:proofErr w:type="spellStart"/>
-      <w:r>
+        <w:rPr>
+          <w:highlight w:val="yellow"/>
+        </w:rPr>
+        <w:t xml:space="preserve"> </w:t>
+      </w:r>
+      <w:proofErr w:type="spellStart"/>
+      <w:r>
+        <w:rPr>
+          <w:highlight w:val="yellow"/>
+        </w:rPr>
         <w:t>dịch</w:t>
       </w:r>
       <w:proofErr w:type="spellEnd"/>
       <w:r>
-        <w:t xml:space="preserve"> </w:t>
-      </w:r>
-      <w:proofErr w:type="spellStart"/>
-      <w:r>
+        <w:rPr>
+          <w:highlight w:val="yellow"/>
+        </w:rPr>
+        <w:t xml:space="preserve"> </w:t>
+      </w:r>
+      <w:proofErr w:type="spellStart"/>
+      <w:r>
+        <w:rPr>
+          <w:highlight w:val="yellow"/>
+        </w:rPr>
         <w:t>vụ</w:t>
       </w:r>
       <w:proofErr w:type="spellEnd"/>
       <w:r>
+        <w:rPr>
+          <w:highlight w:val="yellow"/>
+        </w:rPr>
         <w:t>)</w:t>
       </w:r>
     </w:p>
@@ -26085,6 +26166,83 @@
           <w:numId w:val="24"/>
         </w:numPr>
         <w:spacing w:after="160" w:line="259" w:lineRule="auto"/>
+        <w:rPr>
+          <w:highlight w:val="yellow"/>
+        </w:rPr>
+      </w:pPr>
+      <w:proofErr w:type="spellStart"/>
+      <w:r>
+        <w:rPr>
+          <w:highlight w:val="yellow"/>
+        </w:rPr>
+        <w:t>Thêm</w:t>
+      </w:r>
+      <w:proofErr w:type="spellEnd"/>
+      <w:r>
+        <w:rPr>
+          <w:highlight w:val="yellow"/>
+        </w:rPr>
+        <w:t xml:space="preserve">, </w:t>
+      </w:r>
+      <w:proofErr w:type="spellStart"/>
+      <w:r>
+        <w:rPr>
+          <w:highlight w:val="yellow"/>
+        </w:rPr>
+        <w:t>sửa</w:t>
+      </w:r>
+      <w:proofErr w:type="spellEnd"/>
+      <w:r>
+        <w:rPr>
+          <w:highlight w:val="yellow"/>
+        </w:rPr>
+        <w:t xml:space="preserve">, </w:t>
+      </w:r>
+      <w:proofErr w:type="spellStart"/>
+      <w:r>
+        <w:rPr>
+          <w:highlight w:val="yellow"/>
+        </w:rPr>
+        <w:t>xoá</w:t>
+      </w:r>
+      <w:proofErr w:type="spellEnd"/>
+      <w:r>
+        <w:rPr>
+          <w:highlight w:val="yellow"/>
+        </w:rPr>
+        <w:t xml:space="preserve"> </w:t>
+      </w:r>
+      <w:proofErr w:type="spellStart"/>
+      <w:r>
+        <w:rPr>
+          <w:highlight w:val="yellow"/>
+        </w:rPr>
+        <w:t>MinibarUsages</w:t>
+      </w:r>
+      <w:proofErr w:type="spellEnd"/>
+      <w:r>
+        <w:rPr>
+          <w:highlight w:val="yellow"/>
+        </w:rPr>
+        <w:t xml:space="preserve">; </w:t>
+      </w:r>
+      <w:proofErr w:type="spellStart"/>
+      <w:r>
+        <w:rPr>
+          <w:highlight w:val="yellow"/>
+        </w:rPr>
+        <w:t>Phạt</w:t>
+      </w:r>
+      <w:proofErr w:type="spellEnd"/>
+    </w:p>
+    <w:p>
+      <w:pPr>
+        <w:pStyle w:val="ListParagraph"/>
+        <w:numPr>
+          <w:ilvl w:val="1"/>
+          <w:numId w:val="24"/>
+        </w:numPr>
+        <w:spacing w:after="160" w:line="259" w:lineRule="auto"/>
       </w:pPr>
       <w:r>
         <w:t>Check Out</w:t>
@@ -26165,20 +26323,35 @@
           <w:numId w:val="24"/>
         </w:numPr>
         <w:spacing w:after="160" w:line="259" w:lineRule="auto"/>
-      </w:pPr>
-      <w:r>
+        <w:rPr>
+          <w:highlight w:val="yellow"/>
+        </w:rPr>
+      </w:pPr>
+      <w:r>
+        <w:rPr>
+          <w:highlight w:val="yellow"/>
+        </w:rPr>
         <w:t xml:space="preserve">Trang </w:t>
       </w:r>
       <w:proofErr w:type="spellStart"/>
       <w:r>
+        <w:rPr>
+          <w:highlight w:val="yellow"/>
+        </w:rPr>
         <w:t>Khách</w:t>
       </w:r>
       <w:proofErr w:type="spellEnd"/>
       <w:r>
-        <w:t xml:space="preserve"> </w:t>
-      </w:r>
-      <w:proofErr w:type="spellStart"/>
-      <w:r>
+        <w:rPr>
+          <w:highlight w:val="yellow"/>
+        </w:rPr>
+        <w:t xml:space="preserve"> </w:t>
+      </w:r>
+      <w:proofErr w:type="spellStart"/>
+      <w:r>
+        <w:rPr>
+          <w:highlight w:val="yellow"/>
+        </w:rPr>
         <w:t>hàng</w:t>
       </w:r>
       <w:proofErr w:type="spellEnd"/>
@@ -26390,20 +26563,35 @@
           <w:numId w:val="24"/>
         </w:numPr>
         <w:spacing w:after="160" w:line="259" w:lineRule="auto"/>
-      </w:pPr>
-      <w:r>
+        <w:rPr>
+          <w:highlight w:val="yellow"/>
+        </w:rPr>
+      </w:pPr>
+      <w:r>
+        <w:rPr>
+          <w:highlight w:val="yellow"/>
+        </w:rPr>
         <w:t xml:space="preserve">Trang </w:t>
       </w:r>
       <w:proofErr w:type="spellStart"/>
       <w:r>
+        <w:rPr>
+          <w:highlight w:val="yellow"/>
+        </w:rPr>
         <w:t>Hoá</w:t>
       </w:r>
       <w:proofErr w:type="spellEnd"/>
       <w:r>
-        <w:t xml:space="preserve"> </w:t>
-      </w:r>
-      <w:proofErr w:type="spellStart"/>
-      <w:r>
+        <w:rPr>
+          <w:highlight w:val="yellow"/>
+        </w:rPr>
+        <w:t xml:space="preserve"> </w:t>
+      </w:r>
+      <w:proofErr w:type="spellStart"/>
+      <w:r>
+        <w:rPr>
+          <w:highlight w:val="yellow"/>
+        </w:rPr>
         <w:t>đơn</w:t>
       </w:r>
       <w:proofErr w:type="spellEnd"/>
@@ -27669,6 +27857,7 @@
         <w:rPr>
           <w:highlight w:val="yellow"/>
         </w:rPr>
+        <w:lastRenderedPageBreak/>
         <w:t>Đăng</w:t>
       </w:r>
       <w:proofErr w:type="spellEnd"/>

</xml_diff>

<commit_message>
Xây dựng API tải lên trang QL phòng, chỉnh lại btn thêm các trang khác
</commit_message>
<xml_diff>
--- a/Documents/Quản lý khách sạn(Phân tích).docx
+++ b/Documents/Quản lý khách sạn(Phân tích).docx
@@ -27921,6 +27921,233 @@
         <w:rPr>
           <w:highlight w:val="yellow"/>
         </w:rPr>
+        <w:t xml:space="preserve"> hàng</w:t>
+      </w:r>
+    </w:p>
+    <w:p>
+      <w:pPr>
+        <w:spacing w:after="160" w:line="259" w:lineRule="auto"/>
+        <w:rPr>
+          <w:highlight w:val="yellow"/>
+        </w:rPr>
+      </w:pPr>
+    </w:p>
+    <w:p>
+      <w:pPr>
+        <w:spacing w:after="160" w:line="259" w:lineRule="auto"/>
+      </w:pPr>
+    </w:p>
+    <w:p>
+      <w:pPr>
+        <w:pStyle w:val="ListParagraph"/>
+        <w:numPr>
+          <w:ilvl w:val="0"/>
+          <w:numId w:val="33"/>
+        </w:numPr>
+        <w:spacing w:after="160" w:line="259" w:lineRule="auto"/>
+      </w:pPr>
+      <w:proofErr w:type="spellStart"/>
+      <w:r>
+        <w:t>Tổng</w:t>
+      </w:r>
+      <w:proofErr w:type="spellEnd"/>
+      <w:r>
+        <w:t xml:space="preserve"> </w:t>
+      </w:r>
+      <w:proofErr w:type="spellStart"/>
+      <w:r>
+        <w:t>quan</w:t>
+      </w:r>
+      <w:proofErr w:type="spellEnd"/>
+    </w:p>
+    <w:p>
+      <w:pPr>
+        <w:pStyle w:val="ListParagraph"/>
+        <w:numPr>
+          <w:ilvl w:val="0"/>
+          <w:numId w:val="33"/>
+        </w:numPr>
+        <w:spacing w:after="160" w:line="259" w:lineRule="auto"/>
+      </w:pPr>
+      <w:proofErr w:type="spellStart"/>
+      <w:r>
+        <w:t>Lịch</w:t>
+      </w:r>
+      <w:proofErr w:type="spellEnd"/>
+      <w:r>
+        <w:t xml:space="preserve"> </w:t>
+      </w:r>
+      <w:proofErr w:type="spellStart"/>
+      <w:r>
+        <w:t>phòng</w:t>
+      </w:r>
+      <w:proofErr w:type="spellEnd"/>
+    </w:p>
+    <w:p>
+      <w:pPr>
+        <w:pStyle w:val="ListParagraph"/>
+        <w:numPr>
+          <w:ilvl w:val="0"/>
+          <w:numId w:val="33"/>
+        </w:numPr>
+        <w:spacing w:after="160" w:line="259" w:lineRule="auto"/>
+      </w:pPr>
+      <w:r>
+        <w:t xml:space="preserve">Quản </w:t>
+      </w:r>
+      <w:proofErr w:type="spellStart"/>
+      <w:r>
+        <w:t>lý</w:t>
+      </w:r>
+      <w:proofErr w:type="spellEnd"/>
+      <w:r>
+        <w:t xml:space="preserve"> </w:t>
+      </w:r>
+      <w:proofErr w:type="spellStart"/>
+      <w:r>
+        <w:t>phòng</w:t>
+      </w:r>
+      <w:proofErr w:type="spellEnd"/>
+    </w:p>
+    <w:p>
+      <w:pPr>
+        <w:pStyle w:val="ListParagraph"/>
+        <w:numPr>
+          <w:ilvl w:val="0"/>
+          <w:numId w:val="33"/>
+        </w:numPr>
+        <w:spacing w:after="160" w:line="259" w:lineRule="auto"/>
+        <w:rPr>
+          <w:highlight w:val="yellow"/>
+        </w:rPr>
+      </w:pPr>
+      <w:proofErr w:type="spellStart"/>
+      <w:r>
+        <w:rPr>
+          <w:highlight w:val="yellow"/>
+        </w:rPr>
+        <w:t>Loại</w:t>
+      </w:r>
+      <w:proofErr w:type="spellEnd"/>
+      <w:r>
+        <w:rPr>
+          <w:highlight w:val="yellow"/>
+        </w:rPr>
+        <w:t xml:space="preserve"> </w:t>
+      </w:r>
+      <w:proofErr w:type="spellStart"/>
+      <w:r>
+        <w:rPr>
+          <w:highlight w:val="yellow"/>
+        </w:rPr>
+        <w:t>phòng</w:t>
+      </w:r>
+      <w:proofErr w:type="spellEnd"/>
+    </w:p>
+    <w:p>
+      <w:pPr>
+        <w:pStyle w:val="ListParagraph"/>
+        <w:numPr>
+          <w:ilvl w:val="0"/>
+          <w:numId w:val="33"/>
+        </w:numPr>
+        <w:spacing w:after="160" w:line="259" w:lineRule="auto"/>
+      </w:pPr>
+      <w:r>
+        <w:t xml:space="preserve">Quản </w:t>
+      </w:r>
+      <w:proofErr w:type="spellStart"/>
+      <w:r>
+        <w:t>lý</w:t>
+      </w:r>
+      <w:proofErr w:type="spellEnd"/>
+      <w:r>
+        <w:t xml:space="preserve"> </w:t>
+      </w:r>
+      <w:proofErr w:type="spellStart"/>
+      <w:r>
+        <w:t>giá</w:t>
+      </w:r>
+      <w:proofErr w:type="spellEnd"/>
+    </w:p>
+    <w:p>
+      <w:pPr>
+        <w:pStyle w:val="ListParagraph"/>
+        <w:numPr>
+          <w:ilvl w:val="0"/>
+          <w:numId w:val="33"/>
+        </w:numPr>
+        <w:spacing w:after="160" w:line="259" w:lineRule="auto"/>
+      </w:pPr>
+      <w:proofErr w:type="spellStart"/>
+      <w:r>
+        <w:t>Đặt</w:t>
+      </w:r>
+      <w:proofErr w:type="spellEnd"/>
+      <w:r>
+        <w:t xml:space="preserve"> </w:t>
+      </w:r>
+      <w:proofErr w:type="spellStart"/>
+      <w:r>
+        <w:t>phòng</w:t>
+      </w:r>
+      <w:proofErr w:type="spellEnd"/>
+    </w:p>
+    <w:p>
+      <w:pPr>
+        <w:pStyle w:val="ListParagraph"/>
+        <w:numPr>
+          <w:ilvl w:val="0"/>
+          <w:numId w:val="33"/>
+        </w:numPr>
+        <w:spacing w:after="160" w:line="259" w:lineRule="auto"/>
+      </w:pPr>
+      <w:proofErr w:type="spellStart"/>
+      <w:r>
+        <w:t>Nhận</w:t>
+      </w:r>
+      <w:proofErr w:type="spellEnd"/>
+      <w:r>
+        <w:t xml:space="preserve"> </w:t>
+      </w:r>
+      <w:proofErr w:type="spellStart"/>
+      <w:r>
+        <w:t>trả</w:t>
+      </w:r>
+      <w:proofErr w:type="spellEnd"/>
+      <w:r>
+        <w:t xml:space="preserve"> </w:t>
+      </w:r>
+      <w:proofErr w:type="spellStart"/>
+      <w:r>
+        <w:t>phòng</w:t>
+      </w:r>
+      <w:proofErr w:type="spellEnd"/>
+    </w:p>
+    <w:p>
+      <w:pPr>
+        <w:pStyle w:val="ListParagraph"/>
+        <w:numPr>
+          <w:ilvl w:val="0"/>
+          <w:numId w:val="33"/>
+        </w:numPr>
+        <w:spacing w:after="160" w:line="259" w:lineRule="auto"/>
+        <w:rPr>
+          <w:highlight w:val="yellow"/>
+        </w:rPr>
+      </w:pPr>
+      <w:proofErr w:type="spellStart"/>
+      <w:r>
+        <w:rPr>
+          <w:highlight w:val="yellow"/>
+        </w:rPr>
+        <w:t>Khách</w:t>
+      </w:r>
+      <w:proofErr w:type="spellEnd"/>
+      <w:r>
+        <w:rPr>
+          <w:highlight w:val="yellow"/>
+        </w:rPr>
         <w:t xml:space="preserve"> </w:t>
       </w:r>
       <w:proofErr w:type="spellStart"/>
@@ -27929,6 +28156,108 @@
           <w:highlight w:val="yellow"/>
         </w:rPr>
         <w:t>hàng</w:t>
+      </w:r>
+      <w:proofErr w:type="spellEnd"/>
+    </w:p>
+    <w:p>
+      <w:pPr>
+        <w:pStyle w:val="ListParagraph"/>
+        <w:numPr>
+          <w:ilvl w:val="0"/>
+          <w:numId w:val="33"/>
+        </w:numPr>
+        <w:spacing w:after="160" w:line="259" w:lineRule="auto"/>
+      </w:pPr>
+      <w:proofErr w:type="spellStart"/>
+      <w:r>
+        <w:t>Dịch</w:t>
+      </w:r>
+      <w:proofErr w:type="spellEnd"/>
+      <w:r>
+        <w:t xml:space="preserve"> </w:t>
+      </w:r>
+      <w:proofErr w:type="spellStart"/>
+      <w:r>
+        <w:t>vụ</w:t>
+      </w:r>
+      <w:proofErr w:type="spellEnd"/>
+      <w:r>
+        <w:t xml:space="preserve"> </w:t>
+      </w:r>
+    </w:p>
+    <w:p>
+      <w:pPr>
+        <w:pStyle w:val="ListParagraph"/>
+        <w:numPr>
+          <w:ilvl w:val="0"/>
+          <w:numId w:val="33"/>
+        </w:numPr>
+        <w:spacing w:after="160" w:line="259" w:lineRule="auto"/>
+      </w:pPr>
+      <w:proofErr w:type="spellStart"/>
+      <w:r>
+        <w:t>Hoá</w:t>
+      </w:r>
+      <w:proofErr w:type="spellEnd"/>
+      <w:r>
+        <w:t xml:space="preserve"> </w:t>
+      </w:r>
+      <w:proofErr w:type="spellStart"/>
+      <w:r>
+        <w:t>đơn</w:t>
+      </w:r>
+      <w:proofErr w:type="spellEnd"/>
+    </w:p>
+    <w:p>
+      <w:pPr>
+        <w:pStyle w:val="ListParagraph"/>
+        <w:numPr>
+          <w:ilvl w:val="0"/>
+          <w:numId w:val="33"/>
+        </w:numPr>
+        <w:spacing w:after="160" w:line="259" w:lineRule="auto"/>
+      </w:pPr>
+      <w:r>
+        <w:t xml:space="preserve">Báo </w:t>
+      </w:r>
+      <w:proofErr w:type="spellStart"/>
+      <w:r>
+        <w:t>cáo</w:t>
+      </w:r>
+      <w:proofErr w:type="spellEnd"/>
+    </w:p>
+    <w:p>
+      <w:pPr>
+        <w:pStyle w:val="ListParagraph"/>
+        <w:numPr>
+          <w:ilvl w:val="0"/>
+          <w:numId w:val="33"/>
+        </w:numPr>
+        <w:spacing w:after="160" w:line="259" w:lineRule="auto"/>
+        <w:rPr>
+          <w:highlight w:val="yellow"/>
+        </w:rPr>
+      </w:pPr>
+      <w:proofErr w:type="spellStart"/>
+      <w:r>
+        <w:rPr>
+          <w:highlight w:val="yellow"/>
+        </w:rPr>
+        <w:t>Nhân</w:t>
+      </w:r>
+      <w:proofErr w:type="spellEnd"/>
+      <w:r>
+        <w:rPr>
+          <w:highlight w:val="yellow"/>
+        </w:rPr>
+        <w:t xml:space="preserve"> </w:t>
+      </w:r>
+      <w:proofErr w:type="spellStart"/>
+      <w:r>
+        <w:rPr>
+          <w:highlight w:val="yellow"/>
+        </w:rPr>
+        <w:t>viên</w:t>
       </w:r>
       <w:proofErr w:type="spellEnd"/>
     </w:p>
@@ -28096,7 +28425,7 @@
   <w:abstractNum w:abstractNumId="1" w15:restartNumberingAfterBreak="0">
     <w:nsid w:val="0477080E"/>
     <w:multiLevelType w:val="hybridMultilevel"/>
-    <w:tmpl w:val="71A8D276"/>
+    <w:tmpl w:val="E2EC091A"/>
     <w:lvl w:ilvl="0" w:tplc="04090001">
       <w:start w:val="1"/>
       <w:numFmt w:val="bullet"/>

</xml_diff>

<commit_message>
Load API lên trang Lịch phòng
</commit_message>
<xml_diff>
--- a/Documents/Quản lý khách sạn(Phân tích).docx
+++ b/Documents/Quản lý khách sạn(Phân tích).docx
@@ -27921,8 +27921,16 @@
         <w:rPr>
           <w:highlight w:val="yellow"/>
         </w:rPr>
-        <w:t xml:space="preserve"> hàng</w:t>
-      </w:r>
+        <w:t xml:space="preserve"> </w:t>
+      </w:r>
+      <w:proofErr w:type="spellStart"/>
+      <w:r>
+        <w:rPr>
+          <w:highlight w:val="yellow"/>
+        </w:rPr>
+        <w:t>hàng</w:t>
+      </w:r>
+      <w:proofErr w:type="spellEnd"/>
     </w:p>
     <w:p>
       <w:pPr>
@@ -27968,17 +27976,29 @@
           <w:numId w:val="33"/>
         </w:numPr>
         <w:spacing w:after="160" w:line="259" w:lineRule="auto"/>
-      </w:pPr>
-      <w:proofErr w:type="spellStart"/>
-      <w:r>
+        <w:rPr>
+          <w:highlight w:val="yellow"/>
+        </w:rPr>
+      </w:pPr>
+      <w:proofErr w:type="spellStart"/>
+      <w:r>
+        <w:rPr>
+          <w:highlight w:val="yellow"/>
+        </w:rPr>
         <w:t>Lịch</w:t>
       </w:r>
       <w:proofErr w:type="spellEnd"/>
       <w:r>
-        <w:t xml:space="preserve"> </w:t>
-      </w:r>
-      <w:proofErr w:type="spellStart"/>
-      <w:r>
+        <w:rPr>
+          <w:highlight w:val="yellow"/>
+        </w:rPr>
+        <w:t xml:space="preserve"> </w:t>
+      </w:r>
+      <w:proofErr w:type="spellStart"/>
+      <w:r>
+        <w:rPr>
+          <w:highlight w:val="yellow"/>
+        </w:rPr>
         <w:t>phòng</w:t>
       </w:r>
       <w:proofErr w:type="spellEnd"/>
@@ -27991,20 +28011,35 @@
           <w:numId w:val="33"/>
         </w:numPr>
         <w:spacing w:after="160" w:line="259" w:lineRule="auto"/>
-      </w:pPr>
-      <w:r>
+        <w:rPr>
+          <w:highlight w:val="yellow"/>
+        </w:rPr>
+      </w:pPr>
+      <w:r>
+        <w:rPr>
+          <w:highlight w:val="yellow"/>
+        </w:rPr>
         <w:t xml:space="preserve">Quản </w:t>
       </w:r>
       <w:proofErr w:type="spellStart"/>
       <w:r>
+        <w:rPr>
+          <w:highlight w:val="yellow"/>
+        </w:rPr>
         <w:t>lý</w:t>
       </w:r>
       <w:proofErr w:type="spellEnd"/>
       <w:r>
-        <w:t xml:space="preserve"> </w:t>
-      </w:r>
-      <w:proofErr w:type="spellStart"/>
-      <w:r>
+        <w:rPr>
+          <w:highlight w:val="yellow"/>
+        </w:rPr>
+        <w:t xml:space="preserve"> </w:t>
+      </w:r>
+      <w:proofErr w:type="spellStart"/>
+      <w:r>
+        <w:rPr>
+          <w:highlight w:val="yellow"/>
+        </w:rPr>
         <w:t>phòng</w:t>
       </w:r>
       <w:proofErr w:type="spellEnd"/>
@@ -28052,20 +28087,35 @@
           <w:numId w:val="33"/>
         </w:numPr>
         <w:spacing w:after="160" w:line="259" w:lineRule="auto"/>
-      </w:pPr>
-      <w:r>
+        <w:rPr>
+          <w:highlight w:val="yellow"/>
+        </w:rPr>
+      </w:pPr>
+      <w:r>
+        <w:rPr>
+          <w:highlight w:val="yellow"/>
+        </w:rPr>
         <w:t xml:space="preserve">Quản </w:t>
       </w:r>
       <w:proofErr w:type="spellStart"/>
       <w:r>
+        <w:rPr>
+          <w:highlight w:val="yellow"/>
+        </w:rPr>
         <w:t>lý</w:t>
       </w:r>
       <w:proofErr w:type="spellEnd"/>
       <w:r>
-        <w:t xml:space="preserve"> </w:t>
-      </w:r>
-      <w:proofErr w:type="spellStart"/>
-      <w:r>
+        <w:rPr>
+          <w:highlight w:val="yellow"/>
+        </w:rPr>
+        <w:t xml:space="preserve"> </w:t>
+      </w:r>
+      <w:proofErr w:type="spellStart"/>
+      <w:r>
+        <w:rPr>
+          <w:highlight w:val="yellow"/>
+        </w:rPr>
         <w:t>giá</w:t>
       </w:r>
       <w:proofErr w:type="spellEnd"/>
@@ -28167,21 +28217,36 @@
           <w:numId w:val="33"/>
         </w:numPr>
         <w:spacing w:after="160" w:line="259" w:lineRule="auto"/>
-      </w:pPr>
-      <w:proofErr w:type="spellStart"/>
-      <w:r>
+        <w:rPr>
+          <w:highlight w:val="yellow"/>
+        </w:rPr>
+      </w:pPr>
+      <w:proofErr w:type="spellStart"/>
+      <w:r>
+        <w:rPr>
+          <w:highlight w:val="yellow"/>
+        </w:rPr>
         <w:t>Dịch</w:t>
       </w:r>
       <w:proofErr w:type="spellEnd"/>
       <w:r>
-        <w:t xml:space="preserve"> </w:t>
-      </w:r>
-      <w:proofErr w:type="spellStart"/>
-      <w:r>
+        <w:rPr>
+          <w:highlight w:val="yellow"/>
+        </w:rPr>
+        <w:t xml:space="preserve"> </w:t>
+      </w:r>
+      <w:proofErr w:type="spellStart"/>
+      <w:r>
+        <w:rPr>
+          <w:highlight w:val="yellow"/>
+        </w:rPr>
         <w:t>vụ</w:t>
       </w:r>
       <w:proofErr w:type="spellEnd"/>
       <w:r>
+        <w:rPr>
+          <w:highlight w:val="yellow"/>
+        </w:rPr>
         <w:t xml:space="preserve"> </w:t>
       </w:r>
     </w:p>

</xml_diff>

<commit_message>
Load API lên trang Đặt phòng
</commit_message>
<xml_diff>
--- a/Documents/Quản lý khách sạn(Phân tích).docx
+++ b/Documents/Quản lý khách sạn(Phân tích).docx
@@ -28128,17 +28128,29 @@
           <w:numId w:val="33"/>
         </w:numPr>
         <w:spacing w:after="160" w:line="259" w:lineRule="auto"/>
-      </w:pPr>
-      <w:proofErr w:type="spellStart"/>
-      <w:r>
+        <w:rPr>
+          <w:highlight w:val="yellow"/>
+        </w:rPr>
+      </w:pPr>
+      <w:proofErr w:type="spellStart"/>
+      <w:r>
+        <w:rPr>
+          <w:highlight w:val="yellow"/>
+        </w:rPr>
         <w:t>Đặt</w:t>
       </w:r>
       <w:proofErr w:type="spellEnd"/>
       <w:r>
-        <w:t xml:space="preserve"> </w:t>
-      </w:r>
-      <w:proofErr w:type="spellStart"/>
-      <w:r>
+        <w:rPr>
+          <w:highlight w:val="yellow"/>
+        </w:rPr>
+        <w:t xml:space="preserve"> </w:t>
+      </w:r>
+      <w:proofErr w:type="spellStart"/>
+      <w:r>
+        <w:rPr>
+          <w:highlight w:val="yellow"/>
+        </w:rPr>
         <w:t>phòng</w:t>
       </w:r>
       <w:proofErr w:type="spellEnd"/>

</xml_diff>

<commit_message>
Xử lý phần CheckIn theo lịch đặt
</commit_message>
<xml_diff>
--- a/Documents/Quản lý khách sạn(Phân tích).docx
+++ b/Documents/Quản lý khách sạn(Phân tích).docx
@@ -28185,6 +28185,20 @@
         <w:t>phòng</w:t>
       </w:r>
       <w:proofErr w:type="spellEnd"/>
+      <w:r>
+        <w:t xml:space="preserve"> (</w:t>
+      </w:r>
+      <w:proofErr w:type="spellStart"/>
+      <w:r>
+        <w:rPr>
+          <w:highlight w:val="yellow"/>
+        </w:rPr>
+        <w:t>CheckIN</w:t>
+      </w:r>
+      <w:proofErr w:type="spellEnd"/>
+      <w:r>
+        <w:t>)</w:t>
+      </w:r>
     </w:p>
     <w:p>
       <w:pPr>

</xml_diff>

<commit_message>
Xử lý phần checkOut, minibar, penalties
</commit_message>
<xml_diff>
--- a/Documents/Quản lý khách sạn(Phân tích).docx
+++ b/Documents/Quản lý khách sạn(Phân tích).docx
@@ -28196,6 +28196,189 @@
         <w:t>CheckIN</w:t>
       </w:r>
       <w:proofErr w:type="spellEnd"/>
+      <w:r>
+        <w:t xml:space="preserve"> </w:t>
+      </w:r>
+      <w:proofErr w:type="spellStart"/>
+      <w:r>
+        <w:rPr>
+          <w:highlight w:val="yellow"/>
+        </w:rPr>
+        <w:t>theo</w:t>
+      </w:r>
+      <w:proofErr w:type="spellEnd"/>
+      <w:r>
+        <w:rPr>
+          <w:highlight w:val="yellow"/>
+        </w:rPr>
+        <w:t xml:space="preserve"> </w:t>
+      </w:r>
+      <w:proofErr w:type="spellStart"/>
+      <w:r>
+        <w:rPr>
+          <w:highlight w:val="yellow"/>
+        </w:rPr>
+        <w:t>đặt</w:t>
+      </w:r>
+      <w:proofErr w:type="spellEnd"/>
+      <w:r>
+        <w:rPr>
+          <w:highlight w:val="yellow"/>
+        </w:rPr>
+        <w:t xml:space="preserve"> </w:t>
+      </w:r>
+      <w:proofErr w:type="spellStart"/>
+      <w:r>
+        <w:rPr>
+          <w:highlight w:val="yellow"/>
+        </w:rPr>
+        <w:t>phòng</w:t>
+      </w:r>
+      <w:proofErr w:type="spellEnd"/>
+      <w:r>
+        <w:rPr>
+          <w:highlight w:val="yellow"/>
+        </w:rPr>
+        <w:t xml:space="preserve">, </w:t>
+      </w:r>
+      <w:proofErr w:type="spellStart"/>
+      <w:r>
+        <w:rPr>
+          <w:highlight w:val="yellow"/>
+        </w:rPr>
+        <w:t>CheckIN</w:t>
+      </w:r>
+      <w:proofErr w:type="spellEnd"/>
+      <w:r>
+        <w:rPr>
+          <w:highlight w:val="yellow"/>
+        </w:rPr>
+        <w:t xml:space="preserve"> </w:t>
+      </w:r>
+      <w:proofErr w:type="spellStart"/>
+      <w:r>
+        <w:rPr>
+          <w:highlight w:val="yellow"/>
+        </w:rPr>
+        <w:t>walkin</w:t>
+      </w:r>
+      <w:proofErr w:type="spellEnd"/>
+      <w:r>
+        <w:rPr>
+          <w:highlight w:val="yellow"/>
+        </w:rPr>
+        <w:t xml:space="preserve">, </w:t>
+      </w:r>
+      <w:proofErr w:type="spellStart"/>
+      <w:r>
+        <w:rPr>
+          <w:highlight w:val="yellow"/>
+        </w:rPr>
+        <w:t>chuyển</w:t>
+      </w:r>
+      <w:proofErr w:type="spellEnd"/>
+      <w:r>
+        <w:rPr>
+          <w:highlight w:val="yellow"/>
+        </w:rPr>
+        <w:t xml:space="preserve"> </w:t>
+      </w:r>
+      <w:proofErr w:type="spellStart"/>
+      <w:r>
+        <w:rPr>
+          <w:highlight w:val="yellow"/>
+        </w:rPr>
+        <w:t>phòng</w:t>
+      </w:r>
+      <w:proofErr w:type="spellEnd"/>
+      <w:r>
+        <w:rPr>
+          <w:highlight w:val="yellow"/>
+        </w:rPr>
+        <w:t xml:space="preserve">, </w:t>
+      </w:r>
+      <w:proofErr w:type="spellStart"/>
+      <w:r>
+        <w:rPr>
+          <w:highlight w:val="yellow"/>
+        </w:rPr>
+        <w:t>gia</w:t>
+      </w:r>
+      <w:proofErr w:type="spellEnd"/>
+      <w:r>
+        <w:rPr>
+          <w:highlight w:val="yellow"/>
+        </w:rPr>
+        <w:t xml:space="preserve"> </w:t>
+      </w:r>
+      <w:proofErr w:type="spellStart"/>
+      <w:r>
+        <w:rPr>
+          <w:highlight w:val="yellow"/>
+        </w:rPr>
+        <w:t>hạn</w:t>
+      </w:r>
+      <w:proofErr w:type="spellEnd"/>
+      <w:r>
+        <w:rPr>
+          <w:highlight w:val="yellow"/>
+        </w:rPr>
+        <w:t xml:space="preserve">, </w:t>
+      </w:r>
+      <w:proofErr w:type="spellStart"/>
+      <w:r>
+        <w:rPr>
+          <w:highlight w:val="yellow"/>
+        </w:rPr>
+        <w:t>gọi</w:t>
+      </w:r>
+      <w:proofErr w:type="spellEnd"/>
+      <w:r>
+        <w:rPr>
+          <w:highlight w:val="yellow"/>
+        </w:rPr>
+        <w:t xml:space="preserve"> </w:t>
+      </w:r>
+      <w:proofErr w:type="spellStart"/>
+      <w:r>
+        <w:rPr>
+          <w:highlight w:val="yellow"/>
+        </w:rPr>
+        <w:t>dịch</w:t>
+      </w:r>
+      <w:proofErr w:type="spellEnd"/>
+      <w:r>
+        <w:rPr>
+          <w:highlight w:val="yellow"/>
+        </w:rPr>
+        <w:t xml:space="preserve"> </w:t>
+      </w:r>
+      <w:proofErr w:type="spellStart"/>
+      <w:r>
+        <w:rPr>
+          <w:highlight w:val="yellow"/>
+        </w:rPr>
+        <w:t>vụ</w:t>
+      </w:r>
+      <w:proofErr w:type="spellEnd"/>
+      <w:r>
+        <w:t xml:space="preserve">, Minibar, </w:t>
+      </w:r>
+      <w:proofErr w:type="spellStart"/>
+      <w:proofErr w:type="gramStart"/>
+      <w:r>
+        <w:t>Phạt</w:t>
+      </w:r>
+      <w:proofErr w:type="spellEnd"/>
+      <w:r>
+        <w:t xml:space="preserve"> ,</w:t>
+      </w:r>
+      <w:proofErr w:type="spellStart"/>
+      <w:r>
+        <w:t>CheckOut</w:t>
+      </w:r>
+      <w:proofErr w:type="spellEnd"/>
+      <w:proofErr w:type="gramEnd"/>
       <w:r>
         <w:t>)</w:t>
       </w:r>

</xml_diff>

<commit_message>
Xử lý Phần CheckOut, phần load phòng trống trong đặt phòng, Load API trang Hoá đơn
</commit_message>
<xml_diff>
--- a/Documents/Quản lý khách sạn(Phân tích).docx
+++ b/Documents/Quản lý khách sạn(Phân tích).docx
@@ -20856,15 +20856,7 @@
       </w:r>
       <w:proofErr w:type="spellEnd"/>
       <w:r>
-        <w:t xml:space="preserve"> </w:t>
-      </w:r>
-      <w:proofErr w:type="gramStart"/>
-      <w:r>
-        <w:t>NVARCHAR(</w:t>
-      </w:r>
-      <w:proofErr w:type="gramEnd"/>
-      <w:r>
-        <w:t>50),</w:t>
+        <w:t xml:space="preserve"> NVARCHAR(50),</w:t>
       </w:r>
     </w:p>
     <w:p>
@@ -20880,15 +20872,7 @@
       </w:r>
       <w:proofErr w:type="spellEnd"/>
       <w:r>
-        <w:t xml:space="preserve"> </w:t>
-      </w:r>
-      <w:proofErr w:type="gramStart"/>
-      <w:r>
-        <w:t>NVARCHAR(</w:t>
-      </w:r>
-      <w:proofErr w:type="gramEnd"/>
-      <w:r>
-        <w:t>100)</w:t>
+        <w:t xml:space="preserve"> NVARCHAR(100)</w:t>
       </w:r>
     </w:p>
     <w:p>
@@ -20925,15 +20909,7 @@
       </w:r>
       <w:proofErr w:type="spellEnd"/>
       <w:r>
-        <w:t xml:space="preserve"> INT </w:t>
-      </w:r>
-      <w:proofErr w:type="gramStart"/>
-      <w:r>
-        <w:t>IDENTITY(</w:t>
-      </w:r>
-      <w:proofErr w:type="gramEnd"/>
-      <w:r>
-        <w:t>1,1) PRIMARY KEY,</w:t>
+        <w:t xml:space="preserve"> INT IDENTITY(1,1) PRIMARY KEY,</w:t>
       </w:r>
     </w:p>
     <w:p>
@@ -21006,15 +20982,7 @@
         <w:spacing w:after="160" w:line="259" w:lineRule="auto"/>
       </w:pPr>
       <w:r>
-        <w:t xml:space="preserve">    Status </w:t>
-      </w:r>
-      <w:proofErr w:type="gramStart"/>
-      <w:r>
-        <w:t>NVARCHAR(</w:t>
-      </w:r>
-      <w:proofErr w:type="gramEnd"/>
-      <w:r>
-        <w:t>20)</w:t>
+        <w:t xml:space="preserve">    Status NVARCHAR(20)</w:t>
       </w:r>
     </w:p>
     <w:p>
@@ -21038,14 +21006,9 @@
       </w:r>
       <w:proofErr w:type="spellEnd"/>
       <w:r>
-        <w:t xml:space="preserve">) REFERENCES </w:t>
-      </w:r>
-      <w:proofErr w:type="gramStart"/>
-      <w:r>
-        <w:t>Reservations(</w:t>
-      </w:r>
-      <w:proofErr w:type="spellStart"/>
-      <w:proofErr w:type="gramEnd"/>
+        <w:t>) REFERENCES Reservations(</w:t>
+      </w:r>
+      <w:proofErr w:type="spellStart"/>
       <w:r>
         <w:t>ReservationID</w:t>
       </w:r>
@@ -21067,14 +21030,9 @@
       </w:r>
       <w:proofErr w:type="spellEnd"/>
       <w:r>
-        <w:t xml:space="preserve">) REFERENCES </w:t>
-      </w:r>
-      <w:proofErr w:type="gramStart"/>
-      <w:r>
-        <w:t>Guests(</w:t>
-      </w:r>
-      <w:proofErr w:type="spellStart"/>
-      <w:proofErr w:type="gramEnd"/>
+        <w:t>) REFERENCES Guests(</w:t>
+      </w:r>
+      <w:proofErr w:type="spellStart"/>
       <w:r>
         <w:t>GuestID</w:t>
       </w:r>
@@ -21117,15 +21075,7 @@
         <w:spacing w:after="160" w:line="259" w:lineRule="auto"/>
       </w:pPr>
       <w:r>
-        <w:t xml:space="preserve">    ID INT </w:t>
-      </w:r>
-      <w:proofErr w:type="gramStart"/>
-      <w:r>
-        <w:t>IDENTITY(</w:t>
-      </w:r>
-      <w:proofErr w:type="gramEnd"/>
-      <w:r>
-        <w:t>1,1) PRIMARY KEY,</w:t>
+        <w:t xml:space="preserve">    ID INT IDENTITY(1,1) PRIMARY KEY,</w:t>
       </w:r>
     </w:p>
     <w:p>
@@ -21205,15 +21155,7 @@
       </w:r>
       <w:proofErr w:type="spellEnd"/>
       <w:r>
-        <w:t xml:space="preserve"> </w:t>
-      </w:r>
-      <w:proofErr w:type="gramStart"/>
-      <w:r>
-        <w:t>DECIMAL(</w:t>
-      </w:r>
-      <w:proofErr w:type="gramEnd"/>
-      <w:r>
-        <w:t>12,2),</w:t>
+        <w:t xml:space="preserve"> DECIMAL(12,2),</w:t>
       </w:r>
     </w:p>
     <w:p>
@@ -21229,14 +21171,9 @@
       </w:r>
       <w:proofErr w:type="spellEnd"/>
       <w:r>
-        <w:t xml:space="preserve">) REFERENCES </w:t>
-      </w:r>
-      <w:proofErr w:type="gramStart"/>
-      <w:r>
-        <w:t>Stays(</w:t>
-      </w:r>
-      <w:proofErr w:type="spellStart"/>
-      <w:proofErr w:type="gramEnd"/>
+        <w:t>) REFERENCES Stays(</w:t>
+      </w:r>
+      <w:proofErr w:type="spellStart"/>
       <w:r>
         <w:t>StayID</w:t>
       </w:r>
@@ -21258,14 +21195,9 @@
       </w:r>
       <w:proofErr w:type="spellEnd"/>
       <w:r>
-        <w:t xml:space="preserve">) REFERENCES </w:t>
-      </w:r>
-      <w:proofErr w:type="gramStart"/>
-      <w:r>
-        <w:t>Rooms(</w:t>
-      </w:r>
-      <w:proofErr w:type="spellStart"/>
-      <w:proofErr w:type="gramEnd"/>
+        <w:t>) REFERENCES Rooms(</w:t>
+      </w:r>
+      <w:proofErr w:type="spellStart"/>
       <w:r>
         <w:t>RoomID</w:t>
       </w:r>
@@ -21308,15 +21240,7 @@
       </w:r>
       <w:proofErr w:type="spellEnd"/>
       <w:r>
-        <w:t xml:space="preserve"> INT </w:t>
-      </w:r>
-      <w:proofErr w:type="gramStart"/>
-      <w:r>
-        <w:t>IDENTITY(</w:t>
-      </w:r>
-      <w:proofErr w:type="gramEnd"/>
-      <w:r>
-        <w:t>1,1) PRIMARY KEY,</w:t>
+        <w:t xml:space="preserve"> INT IDENTITY(1,1) PRIMARY KEY,</w:t>
       </w:r>
     </w:p>
     <w:p>
@@ -21332,31 +21256,15 @@
       </w:r>
       <w:proofErr w:type="spellEnd"/>
       <w:r>
-        <w:t xml:space="preserve"> </w:t>
-      </w:r>
-      <w:proofErr w:type="gramStart"/>
-      <w:r>
-        <w:t>NVARCHAR(</w:t>
-      </w:r>
-      <w:proofErr w:type="gramEnd"/>
-      <w:r>
-        <w:t>150),</w:t>
-      </w:r>
-    </w:p>
-    <w:p>
-      <w:pPr>
-        <w:spacing w:after="160" w:line="259" w:lineRule="auto"/>
-      </w:pPr>
-      <w:r>
-        <w:t xml:space="preserve">    Price </w:t>
-      </w:r>
-      <w:proofErr w:type="gramStart"/>
-      <w:r>
-        <w:t>DECIMAL(</w:t>
-      </w:r>
-      <w:proofErr w:type="gramEnd"/>
-      <w:r>
-        <w:t>12,2),</w:t>
+        <w:t xml:space="preserve"> NVARCHAR(150),</w:t>
+      </w:r>
+    </w:p>
+    <w:p>
+      <w:pPr>
+        <w:spacing w:after="160" w:line="259" w:lineRule="auto"/>
+      </w:pPr>
+      <w:r>
+        <w:t xml:space="preserve">    Price DECIMAL(12,2),</w:t>
       </w:r>
     </w:p>
     <w:p>
@@ -21365,15 +21273,7 @@
       </w:pPr>
       <w:r>
         <w:tab/>
-        <w:t xml:space="preserve">Status </w:t>
-      </w:r>
-      <w:proofErr w:type="gramStart"/>
-      <w:r>
-        <w:t>NVARCHAR(</w:t>
-      </w:r>
-      <w:proofErr w:type="gramEnd"/>
-      <w:r>
-        <w:t>20) DEFAULT 'TRUE' CHECK (Status IN ('TRUE','FALSE'))</w:t>
+        <w:t>Status NVARCHAR(20) DEFAULT 'TRUE' CHECK (Status IN ('TRUE','FALSE'))</w:t>
       </w:r>
     </w:p>
     <w:p>
@@ -21418,15 +21318,7 @@
       </w:r>
       <w:proofErr w:type="spellEnd"/>
       <w:r>
-        <w:t xml:space="preserve"> INT </w:t>
-      </w:r>
-      <w:proofErr w:type="gramStart"/>
-      <w:r>
-        <w:t>IDENTITY(</w:t>
-      </w:r>
-      <w:proofErr w:type="gramEnd"/>
-      <w:r>
-        <w:t>1,1) PRIMARY KEY,</w:t>
+        <w:t xml:space="preserve"> INT IDENTITY(1,1) PRIMARY KEY,</w:t>
       </w:r>
     </w:p>
     <w:p>
@@ -21483,13 +21375,29 @@
       </w:r>
       <w:proofErr w:type="spellEnd"/>
       <w:r>
-        <w:t xml:space="preserve"> DATETIME DEFAULT </w:t>
-      </w:r>
-      <w:proofErr w:type="gramStart"/>
-      <w:r>
-        <w:t>GETDATE(</w:t>
-      </w:r>
-      <w:proofErr w:type="gramEnd"/>
+        <w:t xml:space="preserve"> DATETIME DEFAULT GETDATE(),</w:t>
+      </w:r>
+    </w:p>
+    <w:p>
+      <w:pPr>
+        <w:spacing w:after="160" w:line="259" w:lineRule="auto"/>
+      </w:pPr>
+      <w:r>
+        <w:t xml:space="preserve">    FOREIGN KEY (</w:t>
+      </w:r>
+      <w:proofErr w:type="spellStart"/>
+      <w:r>
+        <w:t>StayID</w:t>
+      </w:r>
+      <w:proofErr w:type="spellEnd"/>
+      <w:r>
+        <w:t>) REFERENCES Stays(</w:t>
+      </w:r>
+      <w:proofErr w:type="spellStart"/>
+      <w:r>
+        <w:t>StayID</w:t>
+      </w:r>
+      <w:proofErr w:type="spellEnd"/>
       <w:r>
         <w:t>),</w:t>
       </w:r>
@@ -21503,47 +21411,13 @@
       </w:r>
       <w:proofErr w:type="spellStart"/>
       <w:r>
-        <w:t>StayID</w:t>
-      </w:r>
-      <w:proofErr w:type="spellEnd"/>
-      <w:r>
-        <w:t xml:space="preserve">) REFERENCES </w:t>
-      </w:r>
-      <w:proofErr w:type="gramStart"/>
-      <w:r>
-        <w:t>Stays(</w:t>
-      </w:r>
-      <w:proofErr w:type="spellStart"/>
-      <w:proofErr w:type="gramEnd"/>
-      <w:r>
-        <w:t>StayID</w:t>
-      </w:r>
-      <w:proofErr w:type="spellEnd"/>
-      <w:r>
-        <w:t>),</w:t>
-      </w:r>
-    </w:p>
-    <w:p>
-      <w:pPr>
-        <w:spacing w:after="160" w:line="259" w:lineRule="auto"/>
-      </w:pPr>
-      <w:r>
-        <w:t xml:space="preserve">    FOREIGN KEY (</w:t>
-      </w:r>
-      <w:proofErr w:type="spellStart"/>
-      <w:r>
         <w:t>ServiceID</w:t>
       </w:r>
       <w:proofErr w:type="spellEnd"/>
       <w:r>
-        <w:t xml:space="preserve">) REFERENCES </w:t>
-      </w:r>
-      <w:proofErr w:type="gramStart"/>
-      <w:r>
-        <w:t>Services(</w:t>
-      </w:r>
-      <w:proofErr w:type="spellStart"/>
-      <w:proofErr w:type="gramEnd"/>
+        <w:t>) REFERENCES Services(</w:t>
+      </w:r>
+      <w:proofErr w:type="spellStart"/>
       <w:r>
         <w:t>ServiceID</w:t>
       </w:r>
@@ -21594,15 +21468,7 @@
       </w:r>
       <w:proofErr w:type="spellEnd"/>
       <w:r>
-        <w:t xml:space="preserve"> INT </w:t>
-      </w:r>
-      <w:proofErr w:type="gramStart"/>
-      <w:r>
-        <w:t>IDENTITY(</w:t>
-      </w:r>
-      <w:proofErr w:type="gramEnd"/>
-      <w:r>
-        <w:t>1,1) PRIMARY KEY,</w:t>
+        <w:t xml:space="preserve"> INT IDENTITY(1,1) PRIMARY KEY,</w:t>
       </w:r>
     </w:p>
     <w:p>
@@ -21634,31 +21500,15 @@
       </w:r>
       <w:proofErr w:type="spellEnd"/>
       <w:r>
-        <w:t xml:space="preserve"> </w:t>
-      </w:r>
-      <w:proofErr w:type="gramStart"/>
-      <w:r>
-        <w:t>NVARCHAR(</w:t>
-      </w:r>
-      <w:proofErr w:type="gramEnd"/>
-      <w:r>
-        <w:t>150),</w:t>
-      </w:r>
-    </w:p>
-    <w:p>
-      <w:pPr>
-        <w:spacing w:after="160" w:line="259" w:lineRule="auto"/>
-      </w:pPr>
-      <w:r>
-        <w:t xml:space="preserve">    Price </w:t>
-      </w:r>
-      <w:proofErr w:type="gramStart"/>
-      <w:r>
-        <w:t>DECIMAL(</w:t>
-      </w:r>
-      <w:proofErr w:type="gramEnd"/>
-      <w:r>
-        <w:t>12,2),</w:t>
+        <w:t xml:space="preserve"> NVARCHAR(150),</w:t>
+      </w:r>
+    </w:p>
+    <w:p>
+      <w:pPr>
+        <w:spacing w:after="160" w:line="259" w:lineRule="auto"/>
+      </w:pPr>
+      <w:r>
+        <w:t xml:space="preserve">    Price DECIMAL(12,2),</w:t>
       </w:r>
     </w:p>
     <w:p>
@@ -21678,7 +21528,6 @@
         <w:t xml:space="preserve">) REFERENCES </w:t>
       </w:r>
       <w:proofErr w:type="spellStart"/>
-      <w:proofErr w:type="gramStart"/>
       <w:r>
         <w:t>RoomTypes</w:t>
       </w:r>
@@ -21687,7 +21536,6 @@
         <w:t>(</w:t>
       </w:r>
       <w:proofErr w:type="spellStart"/>
-      <w:proofErr w:type="gramEnd"/>
       <w:r>
         <w:t>RoomTypeID</w:t>
       </w:r>
@@ -21730,15 +21578,7 @@
         <w:spacing w:after="160" w:line="259" w:lineRule="auto"/>
       </w:pPr>
       <w:r>
-        <w:t xml:space="preserve">    ID INT </w:t>
-      </w:r>
-      <w:proofErr w:type="gramStart"/>
-      <w:r>
-        <w:t>IDENTITY(</w:t>
-      </w:r>
-      <w:proofErr w:type="gramEnd"/>
-      <w:r>
-        <w:t>1,1) PRIMARY KEY,</w:t>
+        <w:t xml:space="preserve">    ID INT IDENTITY(1,1) PRIMARY KEY,</w:t>
       </w:r>
     </w:p>
     <w:p>
@@ -21794,75 +21634,116 @@
       </w:r>
       <w:proofErr w:type="spellEnd"/>
       <w:r>
+        <w:t>) REFERENCES Stays(</w:t>
+      </w:r>
+      <w:proofErr w:type="spellStart"/>
+      <w:r>
+        <w:t>StayID</w:t>
+      </w:r>
+      <w:proofErr w:type="spellEnd"/>
+      <w:r>
+        <w:t>),</w:t>
+      </w:r>
+    </w:p>
+    <w:p>
+      <w:pPr>
+        <w:spacing w:after="160" w:line="259" w:lineRule="auto"/>
+      </w:pPr>
+      <w:r>
+        <w:t xml:space="preserve">    FOREIGN KEY (</w:t>
+      </w:r>
+      <w:proofErr w:type="spellStart"/>
+      <w:r>
+        <w:t>MinibarID</w:t>
+      </w:r>
+      <w:proofErr w:type="spellEnd"/>
+      <w:r>
         <w:t xml:space="preserve">) REFERENCES </w:t>
       </w:r>
-      <w:proofErr w:type="gramStart"/>
-      <w:r>
-        <w:t>Stays(</w:t>
-      </w:r>
-      <w:proofErr w:type="spellStart"/>
-      <w:proofErr w:type="gramEnd"/>
+      <w:proofErr w:type="spellStart"/>
+      <w:r>
+        <w:t>MinibarItems</w:t>
+      </w:r>
+      <w:proofErr w:type="spellEnd"/>
+      <w:r>
+        <w:t>(</w:t>
+      </w:r>
+      <w:proofErr w:type="spellStart"/>
+      <w:r>
+        <w:t>MinibarID</w:t>
+      </w:r>
+      <w:proofErr w:type="spellEnd"/>
+      <w:r>
+        <w:t>)</w:t>
+      </w:r>
+    </w:p>
+    <w:p>
+      <w:pPr>
+        <w:spacing w:after="160" w:line="259" w:lineRule="auto"/>
+      </w:pPr>
+      <w:r>
+        <w:t>)</w:t>
+      </w:r>
+    </w:p>
+    <w:p>
+      <w:pPr>
+        <w:spacing w:after="160" w:line="259" w:lineRule="auto"/>
+      </w:pPr>
+    </w:p>
+    <w:p>
+      <w:pPr>
+        <w:spacing w:after="160" w:line="259" w:lineRule="auto"/>
+      </w:pPr>
+      <w:r>
+        <w:t>CREATE TABLE Penalties (</w:t>
+      </w:r>
+    </w:p>
+    <w:p>
+      <w:pPr>
+        <w:spacing w:after="160" w:line="259" w:lineRule="auto"/>
+      </w:pPr>
+      <w:r>
+        <w:t xml:space="preserve">    </w:t>
+      </w:r>
+      <w:proofErr w:type="spellStart"/>
+      <w:r>
+        <w:t>PenaltyID</w:t>
+      </w:r>
+      <w:proofErr w:type="spellEnd"/>
+      <w:r>
+        <w:t xml:space="preserve"> INT IDENTITY(1,1) PRIMARY KEY,</w:t>
+      </w:r>
+    </w:p>
+    <w:p>
+      <w:pPr>
+        <w:spacing w:after="160" w:line="259" w:lineRule="auto"/>
+      </w:pPr>
+      <w:r>
+        <w:t xml:space="preserve">    </w:t>
+      </w:r>
+      <w:proofErr w:type="spellStart"/>
       <w:r>
         <w:t>StayID</w:t>
       </w:r>
       <w:proofErr w:type="spellEnd"/>
       <w:r>
-        <w:t>),</w:t>
-      </w:r>
-    </w:p>
-    <w:p>
-      <w:pPr>
-        <w:spacing w:after="160" w:line="259" w:lineRule="auto"/>
-      </w:pPr>
-      <w:r>
-        <w:t xml:space="preserve">    FOREIGN KEY (</w:t>
-      </w:r>
-      <w:proofErr w:type="spellStart"/>
-      <w:r>
-        <w:t>MinibarID</w:t>
-      </w:r>
-      <w:proofErr w:type="spellEnd"/>
-      <w:r>
-        <w:t xml:space="preserve">) REFERENCES </w:t>
-      </w:r>
-      <w:proofErr w:type="spellStart"/>
-      <w:proofErr w:type="gramStart"/>
-      <w:r>
-        <w:t>MinibarItems</w:t>
-      </w:r>
-      <w:proofErr w:type="spellEnd"/>
-      <w:r>
-        <w:t>(</w:t>
-      </w:r>
-      <w:proofErr w:type="spellStart"/>
-      <w:proofErr w:type="gramEnd"/>
-      <w:r>
-        <w:t>MinibarID</w:t>
-      </w:r>
-      <w:proofErr w:type="spellEnd"/>
-      <w:r>
-        <w:t>)</w:t>
-      </w:r>
-    </w:p>
-    <w:p>
-      <w:pPr>
-        <w:spacing w:after="160" w:line="259" w:lineRule="auto"/>
-      </w:pPr>
-      <w:r>
-        <w:t>)</w:t>
-      </w:r>
-    </w:p>
-    <w:p>
-      <w:pPr>
-        <w:spacing w:after="160" w:line="259" w:lineRule="auto"/>
-      </w:pPr>
-    </w:p>
-    <w:p>
-      <w:pPr>
-        <w:spacing w:after="160" w:line="259" w:lineRule="auto"/>
-      </w:pPr>
-      <w:r>
-        <w:t>CREATE TABLE Penalties (</w:t>
+        <w:t xml:space="preserve"> INT NOT NULL,</w:t>
+      </w:r>
+    </w:p>
+    <w:p>
+      <w:pPr>
+        <w:spacing w:after="160" w:line="259" w:lineRule="auto"/>
+      </w:pPr>
+      <w:r>
+        <w:t xml:space="preserve">    Reason NVARCHAR(255) NOT NULL,</w:t>
+      </w:r>
+    </w:p>
+    <w:p>
+      <w:pPr>
+        <w:spacing w:after="160" w:line="259" w:lineRule="auto"/>
+      </w:pPr>
+      <w:r>
+        <w:t xml:space="preserve">    Amount DECIMAL(14,2) NOT NULL,</w:t>
       </w:r>
     </w:p>
     <w:p>
@@ -21874,91 +21755,11 @@
       </w:r>
       <w:proofErr w:type="spellStart"/>
       <w:r>
-        <w:t>PenaltyID</w:t>
-      </w:r>
-      <w:proofErr w:type="spellEnd"/>
-      <w:r>
-        <w:t xml:space="preserve"> INT </w:t>
-      </w:r>
-      <w:proofErr w:type="gramStart"/>
-      <w:r>
-        <w:t>IDENTITY(</w:t>
-      </w:r>
-      <w:proofErr w:type="gramEnd"/>
-      <w:r>
-        <w:t>1,1) PRIMARY KEY,</w:t>
-      </w:r>
-    </w:p>
-    <w:p>
-      <w:pPr>
-        <w:spacing w:after="160" w:line="259" w:lineRule="auto"/>
-      </w:pPr>
-      <w:r>
-        <w:t xml:space="preserve">    </w:t>
-      </w:r>
-      <w:proofErr w:type="spellStart"/>
-      <w:r>
-        <w:t>StayID</w:t>
-      </w:r>
-      <w:proofErr w:type="spellEnd"/>
-      <w:r>
-        <w:t xml:space="preserve"> INT NOT NULL,</w:t>
-      </w:r>
-    </w:p>
-    <w:p>
-      <w:pPr>
-        <w:spacing w:after="160" w:line="259" w:lineRule="auto"/>
-      </w:pPr>
-      <w:r>
-        <w:t xml:space="preserve">    Reason </w:t>
-      </w:r>
-      <w:proofErr w:type="gramStart"/>
-      <w:r>
-        <w:t>NVARCHAR(</w:t>
-      </w:r>
-      <w:proofErr w:type="gramEnd"/>
-      <w:r>
-        <w:t>255) NOT NULL,</w:t>
-      </w:r>
-    </w:p>
-    <w:p>
-      <w:pPr>
-        <w:spacing w:after="160" w:line="259" w:lineRule="auto"/>
-      </w:pPr>
-      <w:r>
-        <w:t xml:space="preserve">    Amount </w:t>
-      </w:r>
-      <w:proofErr w:type="gramStart"/>
-      <w:r>
-        <w:t>DECIMAL(</w:t>
-      </w:r>
-      <w:proofErr w:type="gramEnd"/>
-      <w:r>
-        <w:t>14,2) NOT NULL,</w:t>
-      </w:r>
-    </w:p>
-    <w:p>
-      <w:pPr>
-        <w:spacing w:after="160" w:line="259" w:lineRule="auto"/>
-      </w:pPr>
-      <w:r>
-        <w:t xml:space="preserve">    </w:t>
-      </w:r>
-      <w:proofErr w:type="spellStart"/>
-      <w:r>
         <w:t>CreatedAt</w:t>
       </w:r>
       <w:proofErr w:type="spellEnd"/>
       <w:r>
-        <w:t xml:space="preserve"> DATETIME DEFAULT </w:t>
-      </w:r>
-      <w:proofErr w:type="gramStart"/>
-      <w:r>
-        <w:t>GETDATE(</w:t>
-      </w:r>
-      <w:proofErr w:type="gramEnd"/>
-      <w:r>
-        <w:t>),</w:t>
+        <w:t xml:space="preserve"> DATETIME DEFAULT GETDATE(),</w:t>
       </w:r>
     </w:p>
     <w:p>
@@ -21975,14 +21776,9 @@
       </w:r>
       <w:proofErr w:type="spellEnd"/>
       <w:r>
-        <w:t xml:space="preserve">) REFERENCES </w:t>
-      </w:r>
-      <w:proofErr w:type="gramStart"/>
-      <w:r>
-        <w:t>Stays(</w:t>
-      </w:r>
-      <w:proofErr w:type="spellStart"/>
-      <w:proofErr w:type="gramEnd"/>
+        <w:t>) REFERENCES Stays(</w:t>
+      </w:r>
+      <w:proofErr w:type="spellStart"/>
       <w:r>
         <w:t>StayID</w:t>
       </w:r>
@@ -22025,15 +21821,7 @@
       </w:r>
       <w:proofErr w:type="spellEnd"/>
       <w:r>
-        <w:t xml:space="preserve"> INT </w:t>
-      </w:r>
-      <w:proofErr w:type="gramStart"/>
-      <w:r>
-        <w:t>IDENTITY(</w:t>
-      </w:r>
-      <w:proofErr w:type="gramEnd"/>
-      <w:r>
-        <w:t>1,1) PRIMARY KEY,</w:t>
+        <w:t xml:space="preserve"> INT IDENTITY(1,1) PRIMARY KEY,</w:t>
       </w:r>
     </w:p>
     <w:p>
@@ -22057,15 +21845,7 @@
         <w:spacing w:after="160" w:line="259" w:lineRule="auto"/>
       </w:pPr>
       <w:r>
-        <w:t xml:space="preserve">    Date DATETIME DEFAULT </w:t>
-      </w:r>
-      <w:proofErr w:type="gramStart"/>
-      <w:r>
-        <w:t>GETDATE(</w:t>
-      </w:r>
-      <w:proofErr w:type="gramEnd"/>
-      <w:r>
-        <w:t>),</w:t>
+        <w:t xml:space="preserve">    Date DATETIME DEFAULT GETDATE(),</w:t>
       </w:r>
     </w:p>
     <w:p>
@@ -22081,47 +21861,23 @@
       </w:r>
       <w:proofErr w:type="spellEnd"/>
       <w:r>
-        <w:t xml:space="preserve"> </w:t>
-      </w:r>
-      <w:proofErr w:type="gramStart"/>
-      <w:r>
-        <w:t>DECIMAL(</w:t>
-      </w:r>
-      <w:proofErr w:type="gramEnd"/>
-      <w:r>
-        <w:t>14,2),</w:t>
-      </w:r>
-    </w:p>
-    <w:p>
-      <w:pPr>
-        <w:spacing w:after="160" w:line="259" w:lineRule="auto"/>
-      </w:pPr>
-      <w:r>
-        <w:t xml:space="preserve">    VAT </w:t>
-      </w:r>
-      <w:proofErr w:type="gramStart"/>
-      <w:r>
-        <w:t>DECIMAL(</w:t>
-      </w:r>
-      <w:proofErr w:type="gramEnd"/>
-      <w:r>
-        <w:t>14,2),</w:t>
-      </w:r>
-    </w:p>
-    <w:p>
-      <w:pPr>
-        <w:spacing w:after="160" w:line="259" w:lineRule="auto"/>
-      </w:pPr>
-      <w:r>
-        <w:t xml:space="preserve">    Status </w:t>
-      </w:r>
-      <w:proofErr w:type="gramStart"/>
-      <w:r>
-        <w:t>NVARCHAR(</w:t>
-      </w:r>
-      <w:proofErr w:type="gramEnd"/>
-      <w:r>
-        <w:t>20) CHECK (Status IN ('OPEN','PAID','CANCELLED')),</w:t>
+        <w:t xml:space="preserve"> DECIMAL(14,2),</w:t>
+      </w:r>
+    </w:p>
+    <w:p>
+      <w:pPr>
+        <w:spacing w:after="160" w:line="259" w:lineRule="auto"/>
+      </w:pPr>
+      <w:r>
+        <w:t xml:space="preserve">    VAT DECIMAL(14,2),</w:t>
+      </w:r>
+    </w:p>
+    <w:p>
+      <w:pPr>
+        <w:spacing w:after="160" w:line="259" w:lineRule="auto"/>
+      </w:pPr>
+      <w:r>
+        <w:t xml:space="preserve">    Status NVARCHAR(20) CHECK (Status IN ('OPEN','PAID','CANCELLED')),</w:t>
       </w:r>
     </w:p>
     <w:p>
@@ -22137,14 +21893,9 @@
       </w:r>
       <w:proofErr w:type="spellEnd"/>
       <w:r>
-        <w:t xml:space="preserve">) REFERENCES </w:t>
-      </w:r>
-      <w:proofErr w:type="gramStart"/>
-      <w:r>
-        <w:t>Stays(</w:t>
-      </w:r>
-      <w:proofErr w:type="spellStart"/>
-      <w:proofErr w:type="gramEnd"/>
+        <w:t>) REFERENCES Stays(</w:t>
+      </w:r>
+      <w:proofErr w:type="spellStart"/>
       <w:r>
         <w:t>StayID</w:t>
       </w:r>
@@ -22195,15 +21946,7 @@
       </w:r>
       <w:proofErr w:type="spellEnd"/>
       <w:r>
-        <w:t xml:space="preserve"> INT </w:t>
-      </w:r>
-      <w:proofErr w:type="gramStart"/>
-      <w:r>
-        <w:t>IDENTITY(</w:t>
-      </w:r>
-      <w:proofErr w:type="gramEnd"/>
-      <w:r>
-        <w:t>1,1) PRIMARY KEY,</w:t>
+        <w:t xml:space="preserve"> INT IDENTITY(1,1) PRIMARY KEY,</w:t>
       </w:r>
     </w:p>
     <w:p>
@@ -22227,15 +21970,7 @@
         <w:spacing w:after="160" w:line="259" w:lineRule="auto"/>
       </w:pPr>
       <w:r>
-        <w:t xml:space="preserve">    ItemType </w:t>
-      </w:r>
-      <w:proofErr w:type="gramStart"/>
-      <w:r>
-        <w:t>NVARCHAR(</w:t>
-      </w:r>
-      <w:proofErr w:type="gramEnd"/>
-      <w:r>
-        <w:t>20)</w:t>
+        <w:t xml:space="preserve">    ItemType NVARCHAR(20)</w:t>
       </w:r>
     </w:p>
     <w:p>
@@ -22259,15 +21994,7 @@
       </w:r>
       <w:proofErr w:type="spellEnd"/>
       <w:r>
-        <w:t xml:space="preserve"> </w:t>
-      </w:r>
-      <w:proofErr w:type="gramStart"/>
-      <w:r>
-        <w:t>NVARCHAR(</w:t>
-      </w:r>
-      <w:proofErr w:type="gramEnd"/>
-      <w:r>
-        <w:t>255),</w:t>
+        <w:t xml:space="preserve"> NVARCHAR(255),</w:t>
       </w:r>
     </w:p>
     <w:p>
@@ -22291,31 +22018,15 @@
       </w:r>
       <w:proofErr w:type="spellEnd"/>
       <w:r>
-        <w:t xml:space="preserve"> </w:t>
-      </w:r>
-      <w:proofErr w:type="gramStart"/>
-      <w:r>
-        <w:t>DECIMAL(</w:t>
-      </w:r>
-      <w:proofErr w:type="gramEnd"/>
-      <w:r>
-        <w:t>12,2),</w:t>
-      </w:r>
-    </w:p>
-    <w:p>
-      <w:pPr>
-        <w:spacing w:after="160" w:line="259" w:lineRule="auto"/>
-      </w:pPr>
-      <w:r>
-        <w:t xml:space="preserve">    Amount </w:t>
-      </w:r>
-      <w:proofErr w:type="gramStart"/>
-      <w:r>
-        <w:t>DECIMAL(</w:t>
-      </w:r>
-      <w:proofErr w:type="gramEnd"/>
-      <w:r>
-        <w:t>14,2),</w:t>
+        <w:t xml:space="preserve"> DECIMAL(12,2),</w:t>
+      </w:r>
+    </w:p>
+    <w:p>
+      <w:pPr>
+        <w:spacing w:after="160" w:line="259" w:lineRule="auto"/>
+      </w:pPr>
+      <w:r>
+        <w:t xml:space="preserve">    Amount DECIMAL(14,2),</w:t>
       </w:r>
     </w:p>
     <w:p>
@@ -22331,14 +22042,9 @@
       </w:r>
       <w:proofErr w:type="spellEnd"/>
       <w:r>
-        <w:t xml:space="preserve">) REFERENCES </w:t>
-      </w:r>
-      <w:proofErr w:type="gramStart"/>
-      <w:r>
-        <w:t>Invoices(</w:t>
-      </w:r>
-      <w:proofErr w:type="spellStart"/>
-      <w:proofErr w:type="gramEnd"/>
+        <w:t>) REFERENCES Invoices(</w:t>
+      </w:r>
+      <w:proofErr w:type="spellStart"/>
       <w:r>
         <w:t>InvoiceID</w:t>
       </w:r>
@@ -22381,15 +22087,7 @@
       </w:r>
       <w:proofErr w:type="spellEnd"/>
       <w:r>
-        <w:t xml:space="preserve"> INT </w:t>
-      </w:r>
-      <w:proofErr w:type="gramStart"/>
-      <w:r>
-        <w:t>IDENTITY(</w:t>
-      </w:r>
-      <w:proofErr w:type="gramEnd"/>
-      <w:r>
-        <w:t>1,1) PRIMARY KEY,</w:t>
+        <w:t xml:space="preserve"> INT IDENTITY(1,1) PRIMARY KEY,</w:t>
       </w:r>
     </w:p>
     <w:p>
@@ -22421,15 +22119,7 @@
       </w:r>
       <w:proofErr w:type="spellEnd"/>
       <w:r>
-        <w:t xml:space="preserve"> </w:t>
-      </w:r>
-      <w:proofErr w:type="gramStart"/>
-      <w:r>
-        <w:t>NVARCHAR(</w:t>
-      </w:r>
-      <w:proofErr w:type="gramEnd"/>
-      <w:r>
-        <w:t>20)</w:t>
+        <w:t xml:space="preserve"> NVARCHAR(20)</w:t>
       </w:r>
     </w:p>
     <w:p>
@@ -22454,15 +22144,7 @@
       </w:pPr>
       <w:r>
         <w:lastRenderedPageBreak/>
-        <w:t xml:space="preserve">    Amount </w:t>
-      </w:r>
-      <w:proofErr w:type="gramStart"/>
-      <w:r>
-        <w:t>DECIMAL(</w:t>
-      </w:r>
-      <w:proofErr w:type="gramEnd"/>
-      <w:r>
-        <w:t>14,2),</w:t>
+        <w:t xml:space="preserve">    Amount DECIMAL(14,2),</w:t>
       </w:r>
     </w:p>
     <w:p>
@@ -22478,15 +22160,7 @@
       </w:r>
       <w:proofErr w:type="spellEnd"/>
       <w:r>
-        <w:t xml:space="preserve"> DATETIME DEFAULT </w:t>
-      </w:r>
-      <w:proofErr w:type="gramStart"/>
-      <w:r>
-        <w:t>GETDATE(</w:t>
-      </w:r>
-      <w:proofErr w:type="gramEnd"/>
-      <w:r>
-        <w:t>),</w:t>
+        <w:t xml:space="preserve"> DATETIME DEFAULT GETDATE(),</w:t>
       </w:r>
     </w:p>
     <w:p>
@@ -22502,14 +22176,9 @@
       </w:r>
       <w:proofErr w:type="spellEnd"/>
       <w:r>
-        <w:t xml:space="preserve">) REFERENCES </w:t>
-      </w:r>
-      <w:proofErr w:type="gramStart"/>
-      <w:r>
-        <w:t>Invoices(</w:t>
-      </w:r>
-      <w:proofErr w:type="spellStart"/>
-      <w:proofErr w:type="gramEnd"/>
+        <w:t>) REFERENCES Invoices(</w:t>
+      </w:r>
+      <w:proofErr w:type="spellStart"/>
       <w:r>
         <w:t>InvoiceID</w:t>
       </w:r>
@@ -22592,17 +22261,12 @@
         <w:t xml:space="preserve"> </w:t>
       </w:r>
       <w:proofErr w:type="spellStart"/>
-      <w:proofErr w:type="gramStart"/>
       <w:r>
         <w:t>tân</w:t>
       </w:r>
       <w:proofErr w:type="spellEnd"/>
       <w:r>
-        <w:t xml:space="preserve"> ,</w:t>
-      </w:r>
-      <w:proofErr w:type="gramEnd"/>
-      <w:r>
-        <w:t xml:space="preserve"> </w:t>
+        <w:t xml:space="preserve"> , </w:t>
       </w:r>
       <w:proofErr w:type="spellStart"/>
       <w:r>
@@ -22613,7 +22277,6 @@
         <w:t xml:space="preserve"> </w:t>
       </w:r>
       <w:proofErr w:type="spellStart"/>
-      <w:proofErr w:type="gramStart"/>
       <w:r>
         <w:t>hàng</w:t>
       </w:r>
@@ -22622,7 +22285,6 @@
         <w:t>(</w:t>
       </w:r>
       <w:proofErr w:type="spellStart"/>
-      <w:proofErr w:type="gramEnd"/>
       <w:r>
         <w:t>đặt</w:t>
       </w:r>
@@ -23033,23 +22695,15 @@
         <w:rPr>
           <w:highlight w:val="cyan"/>
         </w:rPr>
-        <w:t xml:space="preserve"> </w:t>
-      </w:r>
-      <w:proofErr w:type="gramStart"/>
+        <w:t xml:space="preserve"> nay</w:t>
+      </w:r>
       <w:r>
         <w:rPr>
           <w:highlight w:val="cyan"/>
         </w:rPr>
-        <w:t>nay</w:t>
-      </w:r>
-      <w:r>
-        <w:rPr>
-          <w:highlight w:val="cyan"/>
-        </w:rPr>
         <w:t>(</w:t>
       </w:r>
       <w:proofErr w:type="spellStart"/>
-      <w:proofErr w:type="gramEnd"/>
       <w:r>
         <w:rPr>
           <w:highlight w:val="cyan"/>
@@ -23217,7 +22871,6 @@
         <w:t xml:space="preserve"> </w:t>
       </w:r>
       <w:proofErr w:type="spellStart"/>
-      <w:proofErr w:type="gramStart"/>
       <w:r>
         <w:rPr>
           <w:highlight w:val="yellow"/>
@@ -23232,7 +22885,6 @@
         <w:t>(</w:t>
       </w:r>
       <w:proofErr w:type="spellStart"/>
-      <w:proofErr w:type="gramEnd"/>
       <w:r>
         <w:rPr>
           <w:highlight w:val="yellow"/>
@@ -24148,7 +23800,6 @@
         <w:t xml:space="preserve"> </w:t>
       </w:r>
       <w:proofErr w:type="spellStart"/>
-      <w:proofErr w:type="gramStart"/>
       <w:r>
         <w:rPr>
           <w:highlight w:val="cyan"/>
@@ -24163,7 +23814,6 @@
         <w:t>(</w:t>
       </w:r>
       <w:proofErr w:type="spellStart"/>
-      <w:proofErr w:type="gramEnd"/>
       <w:r>
         <w:rPr>
           <w:highlight w:val="cyan"/>
@@ -24316,7 +23966,6 @@
         <w:t xml:space="preserve"> </w:t>
       </w:r>
       <w:proofErr w:type="spellStart"/>
-      <w:proofErr w:type="gramStart"/>
       <w:r>
         <w:rPr>
           <w:highlight w:val="cyan"/>
@@ -24331,7 +23980,6 @@
         <w:t>(</w:t>
       </w:r>
       <w:proofErr w:type="spellStart"/>
-      <w:proofErr w:type="gramEnd"/>
       <w:r>
         <w:rPr>
           <w:highlight w:val="cyan"/>
@@ -24374,7 +24022,6 @@
         <w:t xml:space="preserve"> </w:t>
       </w:r>
       <w:proofErr w:type="spellStart"/>
-      <w:proofErr w:type="gramStart"/>
       <w:r>
         <w:rPr>
           <w:highlight w:val="cyan"/>
@@ -24382,7 +24029,6 @@
         <w:t>thêm,xoá</w:t>
       </w:r>
       <w:proofErr w:type="spellEnd"/>
-      <w:proofErr w:type="gramEnd"/>
       <w:r>
         <w:rPr>
           <w:highlight w:val="cyan"/>
@@ -24501,7 +24147,6 @@
         <w:t xml:space="preserve"> </w:t>
       </w:r>
       <w:proofErr w:type="spellStart"/>
-      <w:proofErr w:type="gramStart"/>
       <w:r>
         <w:rPr>
           <w:highlight w:val="cyan"/>
@@ -24516,7 +24161,6 @@
         <w:t>(</w:t>
       </w:r>
       <w:proofErr w:type="spellStart"/>
-      <w:proofErr w:type="gramEnd"/>
       <w:r>
         <w:rPr>
           <w:highlight w:val="cyan"/>
@@ -28166,22 +27810,37 @@
       </w:pPr>
       <w:proofErr w:type="spellStart"/>
       <w:r>
+        <w:rPr>
+          <w:highlight w:val="yellow"/>
+        </w:rPr>
         <w:t>Nhận</w:t>
       </w:r>
       <w:proofErr w:type="spellEnd"/>
       <w:r>
-        <w:t xml:space="preserve"> </w:t>
-      </w:r>
-      <w:proofErr w:type="spellStart"/>
-      <w:r>
+        <w:rPr>
+          <w:highlight w:val="yellow"/>
+        </w:rPr>
+        <w:t xml:space="preserve"> </w:t>
+      </w:r>
+      <w:proofErr w:type="spellStart"/>
+      <w:r>
+        <w:rPr>
+          <w:highlight w:val="yellow"/>
+        </w:rPr>
         <w:t>trả</w:t>
       </w:r>
       <w:proofErr w:type="spellEnd"/>
       <w:r>
-        <w:t xml:space="preserve"> </w:t>
-      </w:r>
-      <w:proofErr w:type="spellStart"/>
-      <w:r>
+        <w:rPr>
+          <w:highlight w:val="yellow"/>
+        </w:rPr>
+        <w:t xml:space="preserve"> </w:t>
+      </w:r>
+      <w:proofErr w:type="spellStart"/>
+      <w:r>
+        <w:rPr>
+          <w:highlight w:val="yellow"/>
+        </w:rPr>
         <w:t>phòng</w:t>
       </w:r>
       <w:proofErr w:type="spellEnd"/>
@@ -28362,11 +28021,19 @@
       </w:r>
       <w:proofErr w:type="spellEnd"/>
       <w:r>
-        <w:t xml:space="preserve">, Minibar, </w:t>
-      </w:r>
-      <w:proofErr w:type="spellStart"/>
-      <w:proofErr w:type="gramStart"/>
-      <w:r>
+        <w:t xml:space="preserve">, </w:t>
+      </w:r>
+      <w:r>
+        <w:rPr>
+          <w:highlight w:val="yellow"/>
+        </w:rPr>
+        <w:t xml:space="preserve">Minibar, </w:t>
+      </w:r>
+      <w:proofErr w:type="spellStart"/>
+      <w:r>
+        <w:rPr>
+          <w:highlight w:val="yellow"/>
+        </w:rPr>
         <w:t>Phạt</w:t>
       </w:r>
       <w:proofErr w:type="spellEnd"/>
@@ -28375,10 +28042,12 @@
       </w:r>
       <w:proofErr w:type="spellStart"/>
       <w:r>
+        <w:rPr>
+          <w:highlight w:val="yellow"/>
+        </w:rPr>
         <w:t>CheckOut</w:t>
       </w:r>
       <w:proofErr w:type="spellEnd"/>
-      <w:proofErr w:type="gramEnd"/>
       <w:r>
         <w:t>)</w:t>
       </w:r>
@@ -28467,20 +28136,65 @@
           <w:numId w:val="33"/>
         </w:numPr>
         <w:spacing w:after="160" w:line="259" w:lineRule="auto"/>
-      </w:pPr>
-      <w:proofErr w:type="spellStart"/>
-      <w:r>
+        <w:rPr>
+          <w:highlight w:val="yellow"/>
+        </w:rPr>
+      </w:pPr>
+      <w:proofErr w:type="spellStart"/>
+      <w:r>
+        <w:rPr>
+          <w:highlight w:val="yellow"/>
+        </w:rPr>
         <w:t>Hoá</w:t>
       </w:r>
       <w:proofErr w:type="spellEnd"/>
       <w:r>
-        <w:t xml:space="preserve"> </w:t>
-      </w:r>
-      <w:proofErr w:type="spellStart"/>
-      <w:r>
+        <w:rPr>
+          <w:highlight w:val="yellow"/>
+        </w:rPr>
+        <w:t xml:space="preserve"> </w:t>
+      </w:r>
+      <w:proofErr w:type="spellStart"/>
+      <w:r>
+        <w:rPr>
+          <w:highlight w:val="yellow"/>
+        </w:rPr>
         <w:t>đơn</w:t>
       </w:r>
       <w:proofErr w:type="spellEnd"/>
+      <w:r>
+        <w:rPr>
+          <w:highlight w:val="yellow"/>
+        </w:rPr>
+        <w:t xml:space="preserve"> </w:t>
+      </w:r>
+      <w:r>
+        <w:t>(</w:t>
+      </w:r>
+      <w:proofErr w:type="spellStart"/>
+      <w:r>
+        <w:t>xuất</w:t>
+      </w:r>
+      <w:proofErr w:type="spellEnd"/>
+      <w:r>
+        <w:t xml:space="preserve"> </w:t>
+      </w:r>
+      <w:proofErr w:type="spellStart"/>
+      <w:r>
+        <w:t>hoá</w:t>
+      </w:r>
+      <w:proofErr w:type="spellEnd"/>
+      <w:r>
+        <w:t xml:space="preserve"> </w:t>
+      </w:r>
+      <w:proofErr w:type="spellStart"/>
+      <w:r>
+        <w:t>đơn</w:t>
+      </w:r>
+      <w:proofErr w:type="spellEnd"/>
+      <w:r>
+        <w:t xml:space="preserve"> PDF)</w:t>
+      </w:r>
     </w:p>
     <w:p>
       <w:pPr>

</xml_diff>

<commit_message>
Load API phần báo cáo, sửa lại Store lịch phòng, đặt phòng
</commit_message>
<xml_diff>
--- a/Documents/Quản lý khách sạn(Phân tích).docx
+++ b/Documents/Quản lý khách sạn(Phân tích).docx
@@ -27597,17 +27597,29 @@
           <w:numId w:val="33"/>
         </w:numPr>
         <w:spacing w:after="160" w:line="259" w:lineRule="auto"/>
-      </w:pPr>
-      <w:proofErr w:type="spellStart"/>
-      <w:r>
+        <w:rPr>
+          <w:highlight w:val="yellow"/>
+        </w:rPr>
+      </w:pPr>
+      <w:proofErr w:type="spellStart"/>
+      <w:r>
+        <w:rPr>
+          <w:highlight w:val="yellow"/>
+        </w:rPr>
         <w:t>Tổng</w:t>
       </w:r>
       <w:proofErr w:type="spellEnd"/>
       <w:r>
-        <w:t xml:space="preserve"> </w:t>
-      </w:r>
-      <w:proofErr w:type="spellStart"/>
-      <w:r>
+        <w:rPr>
+          <w:highlight w:val="yellow"/>
+        </w:rPr>
+        <w:t xml:space="preserve"> </w:t>
+      </w:r>
+      <w:proofErr w:type="spellStart"/>
+      <w:r>
+        <w:rPr>
+          <w:highlight w:val="yellow"/>
+        </w:rPr>
         <w:t>quan</w:t>
       </w:r>
       <w:proofErr w:type="spellEnd"/>
@@ -28030,6 +28042,7 @@
         <w:t xml:space="preserve">Minibar, </w:t>
       </w:r>
       <w:proofErr w:type="spellStart"/>
+      <w:proofErr w:type="gramStart"/>
       <w:r>
         <w:rPr>
           <w:highlight w:val="yellow"/>
@@ -28048,6 +28061,7 @@
         <w:t>CheckOut</w:t>
       </w:r>
       <w:proofErr w:type="spellEnd"/>
+      <w:proofErr w:type="gramEnd"/>
       <w:r>
         <w:t>)</w:t>
       </w:r>
@@ -28204,12 +28218,21 @@
           <w:numId w:val="33"/>
         </w:numPr>
         <w:spacing w:after="160" w:line="259" w:lineRule="auto"/>
-      </w:pPr>
-      <w:r>
+        <w:rPr>
+          <w:highlight w:val="yellow"/>
+        </w:rPr>
+      </w:pPr>
+      <w:r>
+        <w:rPr>
+          <w:highlight w:val="yellow"/>
+        </w:rPr>
         <w:t xml:space="preserve">Báo </w:t>
       </w:r>
       <w:proofErr w:type="spellStart"/>
       <w:r>
+        <w:rPr>
+          <w:highlight w:val="yellow"/>
+        </w:rPr>
         <w:t>cáo</w:t>
       </w:r>
       <w:proofErr w:type="spellEnd"/>

</xml_diff>